<commit_message>
Update business plan: removed blank page and merged environmental documents
</commit_message>
<xml_diff>
--- a/business_plan_perfect.docx
+++ b/business_plan_perfect.docx
@@ -2,88 +2,401 @@
 <file path=word/document.xml><?xml version="1.0" encoding="utf-8"?>
 <w:document xmlns:wpc="http://schemas.microsoft.com/office/word/2010/wordprocessingCanvas" xmlns:mo="http://schemas.microsoft.com/office/mac/office/2008/main" xmlns:mc="http://schemas.openxmlformats.org/markup-compatibility/2006" xmlns:mv="urn:schemas-microsoft-com:mac:vml" xmlns:o="urn:schemas-microsoft-com:office:office" xmlns:r="http://schemas.openxmlformats.org/officeDocument/2006/relationships" xmlns:m="http://schemas.openxmlformats.org/officeDocument/2006/math" xmlns:v="urn:schemas-microsoft-com:vml" xmlns:wp14="http://schemas.microsoft.com/office/word/2010/wordprocessingDrawing" xmlns:wp="http://schemas.openxmlformats.org/drawingml/2006/wordprocessingDrawing" xmlns:w10="urn:schemas-microsoft-com:office:word" xmlns:w="http://schemas.openxmlformats.org/wordprocessingml/2006/main" xmlns:w14="http://schemas.microsoft.com/office/word/2010/wordml" xmlns:wpg="http://schemas.microsoft.com/office/word/2010/wordprocessingGroup" xmlns:wpi="http://schemas.microsoft.com/office/word/2010/wordprocessingInk" xmlns:wne="http://schemas.microsoft.com/office/word/2006/wordml" xmlns:wps="http://schemas.microsoft.com/office/word/2010/wordprocessingShape" mc:Ignorable="w14 wp14">
   <w:body>
-    <w:p/>
-    <w:p/>
-    <w:p/>
     <w:p>
       <w:pPr>
-        <w:jc w:val="center"/>
+        <w:pStyle w:val="Normal"/>
+      </w:pPr>
+    </w:p>
+    <w:p>
+      <w:pPr>
+        <w:pStyle w:val="Normal"/>
+      </w:pPr>
+    </w:p>
+    <w:p>
+      <w:pPr>
+        <w:pStyle w:val="Normal"/>
+      </w:pPr>
+    </w:p>
+    <w:p>
+      <w:pPr>
+        <w:pStyle w:val="Normal"/>
       </w:pPr>
       <w:r>
-        <w:rPr>
-          <w:rFonts w:ascii="Arial" w:hAnsi="Arial"/>
-          <w:b/>
-          <w:sz w:val="52"/>
-        </w:rPr>
         <w:t>БИЗНЕС-ПЛАН</w:t>
       </w:r>
     </w:p>
     <w:p>
       <w:pPr>
-        <w:jc w:val="center"/>
+        <w:pStyle w:val="Normal"/>
       </w:pPr>
       <w:r>
-        <w:rPr>
-          <w:rFonts w:ascii="Arial" w:hAnsi="Arial"/>
-          <w:b/>
-          <w:sz w:val="40"/>
-        </w:rPr>
         <w:t>Создание туристическо-рекреационного центра</w:t>
         <w:br/>
         <w:t>«Кок-Жайык»</w:t>
       </w:r>
     </w:p>
-    <w:p/>
-    <w:p/>
-    <w:p/>
     <w:p>
       <w:pPr>
-        <w:jc w:val="center"/>
+        <w:pStyle w:val="Normal"/>
+      </w:pPr>
+    </w:p>
+    <w:p>
+      <w:pPr>
+        <w:pStyle w:val="Normal"/>
+      </w:pPr>
+    </w:p>
+    <w:p>
+      <w:pPr>
+        <w:pStyle w:val="Normal"/>
+      </w:pPr>
+    </w:p>
+    <w:p>
+      <w:pPr>
+        <w:pStyle w:val="Normal"/>
+      </w:pPr>
+    </w:p>
+    <w:p>
+      <w:pPr>
+        <w:pStyle w:val="Normal"/>
+      </w:pPr>
+    </w:p>
+    <w:p>
+      <w:pPr>
+        <w:pStyle w:val="Normal"/>
       </w:pPr>
       <w:r>
-        <w:rPr>
-          <w:rFonts w:ascii="Arial" w:hAnsi="Arial"/>
-          <w:sz w:val="28"/>
-        </w:rPr>
-        <w:t>Место реализации: Иссык-Кульская область, Тюпский район,</w:t>
-        <w:br/>
-        <w:t>52-й км трассы Тюп-Кеген</w:t>
-      </w:r>
-    </w:p>
-    <w:p/>
-    <w:p/>
-    <w:p/>
-    <w:p/>
-    <w:p/>
-    <w:p>
-      <w:pPr>
-        <w:jc w:val="right"/>
-      </w:pPr>
-      <w:r>
-        <w:rPr>
-          <w:rFonts w:ascii="Arial" w:hAnsi="Arial"/>
-          <w:b/>
-          <w:sz w:val="24"/>
-        </w:rPr>
         <w:t xml:space="preserve">Подготовил: Умеров Марс Казизович  </w:t>
       </w:r>
     </w:p>
-    <w:p/>
-    <w:p/>
-    <w:p/>
-    <w:p/>
-    <w:p/>
-    <w:p/>
     <w:p>
       <w:pPr>
-        <w:jc w:val="center"/>
+        <w:pStyle w:val="Normal"/>
+      </w:pPr>
+    </w:p>
+    <w:p>
+      <w:pPr>
+        <w:pStyle w:val="Normal"/>
+      </w:pPr>
+    </w:p>
+    <w:p>
+      <w:pPr>
+        <w:pStyle w:val="Normal"/>
+      </w:pPr>
+    </w:p>
+    <w:p>
+      <w:pPr>
+        <w:pStyle w:val="Normal"/>
+      </w:pPr>
+    </w:p>
+    <w:p>
+      <w:pPr>
+        <w:pStyle w:val="Normal"/>
+      </w:pPr>
+    </w:p>
+    <w:p>
+      <w:pPr>
+        <w:pStyle w:val="Normal"/>
+      </w:pPr>
+    </w:p>
+    <w:p>
+      <w:pPr>
+        <w:pStyle w:val="Normal"/>
       </w:pPr>
       <w:r>
-        <w:rPr>
-          <w:rFonts w:ascii="Arial" w:hAnsi="Arial"/>
-          <w:sz w:val="24"/>
-        </w:rPr>
         <w:t>Кыргызская Республика, 2026 г.</w:t>
+      </w:r>
+    </w:p>
+    <w:p>
+      <w:pPr>
+        <w:pStyle w:val="Normal"/>
+      </w:pPr>
+    </w:p>
+    <w:p>
+      <w:pPr>
+        <w:pStyle w:val="Normal"/>
+      </w:pPr>
+      <w:r>
+        <w:t>2 860 000 (два миллиона восемьсот шестьдесят тысяч) сомов.</w:t>
+      </w:r>
+    </w:p>
+    <w:p>
+      <w:pPr>
+        <w:pStyle w:val="Normal"/>
+      </w:pPr>
+      <w:r>
+        <w:t>Для старта проекта требуется 2 002 000 сомов, остальные 858 000 сомов (30%) будут обеспечены за счет собственных средств.</w:t>
+      </w:r>
+    </w:p>
+    <w:p>
+      <w:pPr>
+        <w:pStyle w:val="Normal"/>
+      </w:pPr>
+      <w:r>
+        <w:t>Цель проекта: оказывать качественные услуги в сфере туризма для зарубежных, а также, местных гостей.</w:t>
+      </w:r>
+    </w:p>
+    <w:p>
+      <w:pPr>
+        <w:pStyle w:val="Normal"/>
+      </w:pPr>
+      <w:r>
+        <w:t>1. Резюме проекта</w:t>
+      </w:r>
+    </w:p>
+    <w:p>
+      <w:pPr>
+        <w:pStyle w:val="Normal"/>
+      </w:pPr>
+      <w:r>
+        <w:t>Настоящий бизнес-план разработан для обоснования инвестиций в создание туристическо-рекреационного центра "Кок-Жайык" на трассе Тюп-Кеген в Иссык-Кульской области Кыргызской Республики. Проект нацелен на обслуживание растущего туристического и транзитного потока между Казахстаном (Алматы) и Иссык-Кулем (Каракол).</w:t>
+      </w:r>
+    </w:p>
+    <w:p>
+      <w:pPr>
+        <w:pStyle w:val="Normal"/>
+      </w:pPr>
+      <w:r>
+        <w:t>Ключевые показатели проекта:</w:t>
+      </w:r>
+    </w:p>
+    <w:p>
+      <w:pPr>
+        <w:pStyle w:val="Normal"/>
+      </w:pPr>
+      <w:r>
+        <w:t>2. Описание предприятия и услуг</w:t>
+      </w:r>
+    </w:p>
+    <w:p>
+      <w:pPr>
+        <w:pStyle w:val="Normal"/>
+      </w:pPr>
+      <w:r>
+        <w:t>Центр "Кок-Жайык" будет представлять собой многофункциональный комплекс, сочетающий придорожный сервис и комфортное размещение в эко-стиле.</w:t>
+      </w:r>
+    </w:p>
+    <w:p>
+      <w:pPr>
+        <w:pStyle w:val="Normal"/>
+      </w:pPr>
+      <w:r>
+        <w:t>2.1. Инфраструктура</w:t>
+      </w:r>
+    </w:p>
+    <w:p>
+      <w:pPr>
+        <w:pStyle w:val="Normal"/>
+      </w:pPr>
+      <w:r>
+        <w:t>Инфраструктура центра включает:</w:t>
+      </w:r>
+    </w:p>
+    <w:p>
+      <w:pPr>
+        <w:pStyle w:val="Normal"/>
+      </w:pPr>
+      <w:r>
+        <w:t>Магазин и Кафе: Придорожное кафе на 20-30 посадочных мест и небольшой магазин с товарами первой необходимости, сувенирами и местной продукцией.</w:t>
+      </w:r>
+    </w:p>
+    <w:p>
+      <w:pPr>
+        <w:pStyle w:val="Normal"/>
+      </w:pPr>
+      <w:r>
+        <w:t>Размещение одна Юрта: предназначенные для сезонного (летне-осеннего) размещения, что позволит привлечь туристов, ищущих аутентичный опыт.</w:t>
+      </w:r>
+    </w:p>
+    <w:p>
+      <w:pPr>
+        <w:pStyle w:val="Normal"/>
+      </w:pPr>
+      <w:r>
+        <w:t>Площадка для игр: Оборудованная детская и спортивная площадка для кратковременного отдыха транзитных пассажиров и гостей центра.</w:t>
+      </w:r>
+    </w:p>
+    <w:p>
+      <w:pPr>
+        <w:pStyle w:val="Normal"/>
+      </w:pPr>
+      <w:r>
+        <w:t>А-фрейм дом: Один дом на 4 человека, построенный за счет собственных средств.</w:t>
+      </w:r>
+    </w:p>
+    <w:p>
+      <w:pPr>
+        <w:pStyle w:val="Normal"/>
+      </w:pPr>
+      <w:r>
+        <w:t>2.2. Целевая аудитория</w:t>
+      </w:r>
+    </w:p>
+    <w:p>
+      <w:pPr>
+        <w:pStyle w:val="Normal"/>
+      </w:pPr>
+      <w:r>
+        <w:t>1.  Транзитные туристы: Автомобилисты, следующие из Казахстана (Алматы) в Каракол и на южный берег Иссык-Куля, использующие трассу Тюп-Кеген как кратчайший путь.</w:t>
+      </w:r>
+    </w:p>
+    <w:p>
+      <w:pPr>
+        <w:pStyle w:val="Normal"/>
+      </w:pPr>
+      <w:r>
+        <w:t>2.  Экотуристы и альпинисты: Путешественники, направляющиеся в ущелье Каркыра, к пику Хан-Тенгри и в другие горные районы.</w:t>
+      </w:r>
+    </w:p>
+    <w:p>
+      <w:pPr>
+        <w:pStyle w:val="Normal"/>
+      </w:pPr>
+      <w:r>
+        <w:t>3.  Местные жители: посетители из близлежащих сел и городов, использующие кафе.</w:t>
+      </w:r>
+    </w:p>
+    <w:p>
+      <w:pPr>
+        <w:pStyle w:val="Normal"/>
+      </w:pPr>
+      <w:r>
+        <w:t>3. Анализ рынка и конкуренции</w:t>
+      </w:r>
+    </w:p>
+    <w:p>
+      <w:pPr>
+        <w:pStyle w:val="Normal"/>
+      </w:pPr>
+      <w:r>
+        <w:t>3.1. Анализ местоположения</w:t>
+      </w:r>
+    </w:p>
+    <w:p>
+      <w:pPr>
+        <w:pStyle w:val="Normal"/>
+      </w:pPr>
+      <w:r>
+        <w:t>Местоположение 52й км Тюп-Кеген находится на ключевом участке трассы Тюп-Кеген, которая была недавно реконструирована, что значительно увеличило ее пропускную способность и привлекательность как альтернативного маршрута в Алматы. Близость к КПП “Каркыра-Автодорожный”, который планируется перевести на круглосуточный режим работы, гарантирует стабильный трафик. Так же уникальность проекта в том что дорога от "Трёх Вершин" (Ала-Тоо RESORT) примыкает к трассе Туп-Кеген (к точке локации проекта "Кок-Жайык").</w:t>
+      </w:r>
+    </w:p>
+    <w:p>
+      <w:pPr>
+        <w:pStyle w:val="Normal"/>
+      </w:pPr>
+      <w:r>
+        <w:t>3.2. Конкурентный анализ</w:t>
+      </w:r>
+    </w:p>
+    <w:p>
+      <w:pPr>
+        <w:pStyle w:val="Normal"/>
+      </w:pPr>
+      <w:r>
+        <w:t>Основными конкурентами являются существующие юрточные лагеря и глэмпинги в долине Каркыра, такие как "Юрточный Глэмпинг Каркара" и "Каркыра Глэмпинг".</w:t>
+      </w:r>
+    </w:p>
+    <w:p>
+      <w:pPr>
+        <w:pStyle w:val="Normal"/>
+      </w:pPr>
+      <w:r>
+        <w:t>4. Маркетинговый план</w:t>
+      </w:r>
+    </w:p>
+    <w:p>
+      <w:pPr>
+        <w:pStyle w:val="Normal"/>
+      </w:pPr>
+      <w:r>
+        <w:t>1.  Онлайн-продвижение: Активное ведение Instagram, Тик Ток и Google Maps.</w:t>
+      </w:r>
+    </w:p>
+    <w:p>
+      <w:pPr>
+        <w:pStyle w:val="Normal"/>
+      </w:pPr>
+      <w:r>
+        <w:t>2.  Партнёрство: Сотрудничество с туроператорами, организующими туры в Каракол, на Иссык-Куль и к Хан-Тенгри.</w:t>
+      </w:r>
+    </w:p>
+    <w:p>
+      <w:pPr>
+        <w:pStyle w:val="Normal"/>
+      </w:pPr>
+      <w:r>
+        <w:t>3.  Указатели: Установка заметных дорожных указателей на трассе Тюп-Кеген.</w:t>
+      </w:r>
+    </w:p>
+    <w:p>
+      <w:pPr>
+        <w:pStyle w:val="Normal"/>
+      </w:pPr>
+      <w:r>
+        <w:t>5. Финансовый план</w:t>
+      </w:r>
+    </w:p>
+    <w:p>
+      <w:pPr>
+        <w:pStyle w:val="Normal"/>
+      </w:pPr>
+      <w:r>
+        <w:t>5.1. Инвестиционные расходы за счет средств ФРР</w:t>
+      </w:r>
+    </w:p>
+    <w:p>
+      <w:pPr>
+        <w:pStyle w:val="Normal"/>
+      </w:pPr>
+      <w:r>
+        <w:t>Общий объем инвестиций составляет 2 860 000 сомов, из них 30% — вклад собственных средств в размере 858 000 сомов на строительство А-фрэйм дома (гостевой домик на 4-6 чел.) в количестве 1 единица.</w:t>
+      </w:r>
+    </w:p>
+    <w:p>
+      <w:pPr>
+        <w:pStyle w:val="Normal"/>
+      </w:pPr>
+      <w:r>
+        <w:t>5.2. Прогноз доходов</w:t>
+      </w:r>
+    </w:p>
+    <w:p>
+      <w:pPr>
+        <w:pStyle w:val="Normal"/>
+      </w:pPr>
+      <w:r>
+        <w:t>Прогноз основан на сезонности и средней заполняемости (май-сентябрь).</w:t>
+      </w:r>
+    </w:p>
+    <w:p>
+      <w:pPr>
+        <w:pStyle w:val="Normal"/>
+      </w:pPr>
+      <w:r>
+        <w:t>5.3. Операционные расходы</w:t>
+      </w:r>
+    </w:p>
+    <w:p>
+      <w:pPr>
+        <w:pStyle w:val="Normal"/>
+      </w:pPr>
+      <w:r>
+        <w:t>Годовые операционные расходы составляют 200 000 сомов.</w:t>
+      </w:r>
+    </w:p>
+    <w:p>
+      <w:pPr>
+        <w:pStyle w:val="Normal"/>
+      </w:pPr>
+      <w:r>
+        <w:t>Выводы:</w:t>
+      </w:r>
+    </w:p>
+    <w:p>
+      <w:pPr>
+        <w:pStyle w:val="Normal"/>
+      </w:pPr>
+      <w:r>
+        <w:t>Проект “Кок Жайык" демонстрирует высокую финансовую привлекательность со сроком окупаемости менее 3 лет. Стратегическое расположение на обновленной трассе. Это стабильный малый бизнес, который обеспечит рабочим местом местных жителей и при этом будет приносить налоговые сборы в регион. А так же будет примером для развития туризма как дополнительный доход местным жителям. Уникальность проекта в том, что локация находится пересечении стратегических развязок, которое соединяет Тюпский регион с Аксууйским с востока. Как примечание могу сказать, что от КПП “Каркыра” до локации проекта отсутствует достойное место отдыха с парковочным местом.</w:t>
       </w:r>
     </w:p>
     <w:p>
@@ -92,1196 +405,536 @@
       </w:r>
     </w:p>
     <w:p>
-      <w:pPr/>
+      <w:pPr>
+        <w:pStyle w:val="MdHeading1"/>
+      </w:pPr>
       <w:r>
-        <w:rPr/>
-        <w:t>2 860 000 (два миллиона восемьсот шестьдесят тысяч) сомов.</w:t>
+        <w:t>Раздел: Охрана окружающей среды</w:t>
       </w:r>
     </w:p>
     <w:p>
-      <w:pPr/>
+      <w:pPr>
+        <w:pStyle w:val="MdParagraph"/>
+      </w:pPr>
       <w:r>
-        <w:rPr/>
-        <w:t>Для старта проекта требуется 2 002 000 сомов, остальные 858 000 сомов (30%) будут обеспечены за счет собственных средств.</w:t>
+        <w:t>Реализация проекта туристическо-рекреационного центра «Кок-Жайык» осуществляется в экологически чувствительном регионе Иссык-Кульской области. В соответствии с Законом КР «Об охране окружающей среды» и Законом «Об устойчивом развитии эколого-экономической системы «Иссык-Куль», проект предусматривает комплекс мер по минимизации негативного воздействия на природу.</w:t>
       </w:r>
     </w:p>
     <w:p>
-      <w:pPr/>
+      <w:pPr>
+        <w:pStyle w:val="MdSpace"/>
+      </w:pPr>
+    </w:p>
+    <w:p>
+      <w:pPr>
+        <w:pStyle w:val="MdHeading2"/>
+      </w:pPr>
       <w:r>
-        <w:rPr/>
-        <w:t>Цель проекта: оказывать качественные услуги в сфере туризма для зарубежных, а также, местных гостей.</w:t>
+        <w:t>1. Источники загрязнения в период строительства</w:t>
       </w:r>
     </w:p>
     <w:p>
-      <w:pPr/>
+      <w:pPr>
+        <w:pStyle w:val="MdParagraph"/>
+      </w:pPr>
       <w:r>
-        <w:rPr>
-          <w:b/>
-        </w:rPr>
-        <w:t>1. Резюме проекта</w:t>
+        <w:t>Период строительства является наиболее интенсивным этапом воздействия на окружающую среду. Основными источниками загрязнения являются:</w:t>
       </w:r>
     </w:p>
     <w:p>
-      <w:pPr/>
+      <w:pPr>
+        <w:pStyle w:val="MdSpace"/>
+      </w:pPr>
+    </w:p>
+    <w:p>
+      <w:pPr>
+        <w:pStyle w:val="MdHeading2"/>
+      </w:pPr>
       <w:r>
-        <w:rPr/>
-        <w:t>Настоящий бизнес-план разработан для обоснования инвестиций в создание туристическо-рекреационного центра "Кок-Жайык" на трассе Тюп-Кеген в Иссык-Кульской области Кыргызской Республики. Проект нацелен на обслуживание растущего туристического и транзитного потока между Казахстаном (Алматы) и Иссык-Кулем (Каракол).</w:t>
+        <w:t>2. Меры по предотвращению загрязнения при строительстве</w:t>
       </w:r>
     </w:p>
     <w:p>
-      <w:pPr/>
+      <w:pPr>
+        <w:pStyle w:val="MdParagraph"/>
+      </w:pPr>
       <w:r>
-        <w:rPr>
-          <w:b/>
-        </w:rPr>
-        <w:t>Ключевые показатели проекта:</w:t>
-      </w:r>
-    </w:p>
-    <w:tbl>
-      <w:tblPr>
-        <w:tblStyle w:val="TableGrid"/>
-        <w:tblW w:type="auto" w:w="0"/>
-        <w:tblLook w:firstColumn="1" w:firstRow="1" w:lastColumn="0" w:lastRow="0" w:noHBand="0" w:noVBand="1" w:val="04A0"/>
-      </w:tblPr>
-      <w:tblGrid>
-        <w:gridCol w:w="4320"/>
-        <w:gridCol w:w="4320"/>
-      </w:tblGrid>
-      <w:tr>
-        <w:tc>
-          <w:tcPr>
-            <w:tcW w:type="dxa" w:w="4320"/>
-          </w:tcPr>
-          <w:p>
-            <w:r>
-              <w:t>Показатель</w:t>
-            </w:r>
-          </w:p>
-        </w:tc>
-        <w:tc>
-          <w:tcPr>
-            <w:tcW w:type="dxa" w:w="4320"/>
-          </w:tcPr>
-          <w:p>
-            <w:r>
-              <w:t>Значение</w:t>
-            </w:r>
-          </w:p>
-        </w:tc>
-      </w:tr>
-      <w:tr>
-        <w:tc>
-          <w:tcPr>
-            <w:tcW w:type="dxa" w:w="4320"/>
-          </w:tcPr>
-          <w:p>
-            <w:r>
-              <w:t>Общий объем инвестиций</w:t>
-            </w:r>
-          </w:p>
-        </w:tc>
-        <w:tc>
-          <w:tcPr>
-            <w:tcW w:type="dxa" w:w="4320"/>
-          </w:tcPr>
-          <w:p>
-            <w:r>
-              <w:t>2 860 000 сом</w:t>
-            </w:r>
-          </w:p>
-        </w:tc>
-      </w:tr>
-      <w:tr>
-        <w:tc>
-          <w:tcPr>
-            <w:tcW w:type="dxa" w:w="4320"/>
-          </w:tcPr>
-          <w:p>
-            <w:r>
-              <w:t>Прогнозируемая годовая выручка по сезону (при переходе на круглогодичность показатели будут выше на 250 000-350 000 сом)</w:t>
-            </w:r>
-          </w:p>
-        </w:tc>
-        <w:tc>
-          <w:tcPr>
-            <w:tcW w:type="dxa" w:w="4320"/>
-          </w:tcPr>
-          <w:p>
-            <w:r>
-              <w:t>900 000 сом</w:t>
-            </w:r>
-          </w:p>
-        </w:tc>
-      </w:tr>
-      <w:tr>
-        <w:tc>
-          <w:tcPr>
-            <w:tcW w:type="dxa" w:w="4320"/>
-          </w:tcPr>
-          <w:p>
-            <w:r>
-              <w:t>Прогнозируемая годовая чистая прибыль</w:t>
-            </w:r>
-          </w:p>
-        </w:tc>
-        <w:tc>
-          <w:tcPr>
-            <w:tcW w:type="dxa" w:w="4320"/>
-          </w:tcPr>
-          <w:p>
-            <w:r>
-              <w:t>700 000 сом</w:t>
-            </w:r>
-          </w:p>
-        </w:tc>
-      </w:tr>
-      <w:tr>
-        <w:tc>
-          <w:tcPr>
-            <w:tcW w:type="dxa" w:w="4320"/>
-          </w:tcPr>
-          <w:p>
-            <w:r>
-              <w:t>Срок окупаемости</w:t>
-            </w:r>
-          </w:p>
-        </w:tc>
-        <w:tc>
-          <w:tcPr>
-            <w:tcW w:type="dxa" w:w="4320"/>
-          </w:tcPr>
-          <w:p>
-            <w:r>
-              <w:t>3 года</w:t>
-            </w:r>
-          </w:p>
-        </w:tc>
-      </w:tr>
-      <w:tr>
-        <w:tc>
-          <w:tcPr>
-            <w:tcW w:type="dxa" w:w="4320"/>
-          </w:tcPr>
-          <w:p>
-            <w:r>
-              <w:t>Местоположение</w:t>
-            </w:r>
-          </w:p>
-        </w:tc>
-        <w:tc>
-          <w:tcPr>
-            <w:tcW w:type="dxa" w:w="4320"/>
-          </w:tcPr>
-          <w:p>
-            <w:r>
-              <w:t>52-км трассы Тюп-Кеген</w:t>
-            </w:r>
-          </w:p>
-        </w:tc>
-      </w:tr>
-    </w:tbl>
-    <w:p>
-      <w:pPr/>
-      <w:r>
-        <w:rPr>
-          <w:b/>
-        </w:rPr>
-        <w:t>2. Описание предприятия и услуг</w:t>
+        <w:t>Для минимизации вышеуказанных воздействий устанавливаются следующие регламенты:</w:t>
       </w:r>
     </w:p>
     <w:p>
-      <w:pPr/>
+      <w:pPr>
+        <w:pStyle w:val="MdSpace"/>
+      </w:pPr>
+    </w:p>
+    <w:p>
+      <w:pPr>
+        <w:pStyle w:val="MdListItem"/>
+      </w:pPr>
       <w:r>
-        <w:rPr/>
-        <w:t>Центр "Кок-Жайык" будет представлять собой многофункциональный комплекс, сочетающий придорожный сервис и комфортное размещение в эко-стиле.</w:t>
+        <w:t>Защита атмосферного воздуха: Использование исправной техники с действующими сертификатами экологического контроля. Подавление пыли путем орошения площадки в засушливые периоды.</w:t>
       </w:r>
     </w:p>
     <w:p>
-      <w:pPr/>
+      <w:pPr>
+        <w:pStyle w:val="MdListItem"/>
+      </w:pPr>
       <w:r>
-        <w:rPr>
-          <w:b/>
-        </w:rPr>
-        <w:t>2.1. Инфраструктура</w:t>
+        <w:t>Охрана почв и земель: Снятие и сохранение плодородного слоя почвы перед началом работ для последующей рекультивации. Строгое ограничение движения транспорта установленными дорогами.</w:t>
       </w:r>
     </w:p>
     <w:p>
-      <w:pPr/>
+      <w:pPr>
+        <w:pStyle w:val="MdListItem"/>
+      </w:pPr>
       <w:r>
-        <w:rPr/>
-        <w:t>Инфраструктура центра включает:</w:t>
+        <w:t>Управление отходами: Организация площадок для раздельного сбора строительного мусора и ТБО. Заключение договоров на вывоз отходов со специализированными службами Тюпского района.</w:t>
       </w:r>
     </w:p>
     <w:p>
-      <w:pPr/>
+      <w:pPr>
+        <w:pStyle w:val="MdListItem"/>
+      </w:pPr>
       <w:r>
-        <w:rPr/>
-        <w:t>Магазин и Кафе: Придорожное кафе на 20-30 посадочных мест и небольшой магазин с товарами первой необходимости, сувенирами и местной продукцией.</w:t>
+        <w:t>**Защита водных ресурсов:  ** Запрет на мойку техники на территории объекта. Использование туалета с возможность выкачивание содержимого без риска просачивание в почву.</w:t>
       </w:r>
     </w:p>
     <w:p>
-      <w:pPr/>
+      <w:pPr>
+        <w:pStyle w:val="MdSpace"/>
+      </w:pPr>
+    </w:p>
+    <w:p>
+      <w:pPr>
+        <w:pStyle w:val="MdHeading2"/>
+      </w:pPr>
       <w:r>
-        <w:rPr/>
-        <w:t>Размещение одна Юрта: предназначенные для сезонного (летне-осеннего) размещения, что позволит привлечь туристов, ищущих аутентичный опыт.</w:t>
+        <w:t>3. Экологические аспекты эксплуатации (Эко-стандарты проекта)</w:t>
       </w:r>
     </w:p>
     <w:p>
-      <w:pPr/>
+      <w:pPr>
+        <w:pStyle w:val="MdParagraph"/>
+      </w:pPr>
       <w:r>
-        <w:rPr/>
-        <w:t>Площадка для игр: Оборудованная детская и спортивная площадка для кратковременного отдыха транзитных пассажиров и гостей центра.</w:t>
+        <w:t>Проект «Кок-Жайык» позиционируется как эко-центр, что подразумевает внедрение «зеленых» технологий:</w:t>
       </w:r>
     </w:p>
     <w:p>
-      <w:pPr/>
+      <w:pPr>
+        <w:pStyle w:val="MdSpace"/>
+      </w:pPr>
+    </w:p>
+    <w:p>
+      <w:pPr>
+        <w:pStyle w:val="MdListItem"/>
+      </w:pPr>
       <w:r>
-        <w:rPr/>
-        <w:t>А-фрейм дом: Один дом на 4 человека, построенный за счет собственных средств.</w:t>
+        <w:t>Водоотведение: Установка современных локальных очистных сооружений (ЛОС) или герметичных септиков с системой глубокой биологической очистки, исключающих попадание стоков в грунтовые воды.</w:t>
       </w:r>
     </w:p>
     <w:p>
-      <w:pPr/>
+      <w:pPr>
+        <w:pStyle w:val="MdListItem"/>
+      </w:pPr>
       <w:r>
-        <w:rPr>
-          <w:b/>
-        </w:rPr>
-        <w:t>2.2. Целевая аудитория</w:t>
+        <w:t>Энергоэффективность: Использование энергосберегающего освещения и теплоизоляции домов A-frame для снижения углеродного следа.</w:t>
       </w:r>
     </w:p>
     <w:p>
-      <w:pPr/>
+      <w:pPr>
+        <w:pStyle w:val="MdListItem"/>
+      </w:pPr>
       <w:r>
-        <w:rPr/>
-        <w:t>1.  Транзитные туристы: Автомобилисты, следующие из Казахстана (Алматы) в Каракол и на южный берег Иссык-Куля, использующие трассу Тюп-Кеген как кратчайший путь.</w:t>
+        <w:t>Сохранение ландшафта: Максимальное сохранение естественного рельефа и растительности. Озеленение территории эндемичными видами растений.</w:t>
       </w:r>
     </w:p>
     <w:p>
-      <w:pPr/>
+      <w:pPr>
+        <w:pStyle w:val="MdListItem"/>
+      </w:pPr>
       <w:r>
-        <w:rPr>
-          <w:b/>
-        </w:rPr>
-        <w:t>2.  Экотуристы и альпинисты: Путешественники, направляющиеся в ущелье Каркыра, к пику Хан-Тенгри и в другие горные районы.</w:t>
+        <w:t>Эко-просвещение: Размещение информационных стендов для туристов о правилах поведения в горной местности и бережном отношении к природе Каркыры.</w:t>
       </w:r>
     </w:p>
     <w:p>
-      <w:pPr/>
+      <w:pPr>
+        <w:pStyle w:val="MdSpace"/>
+      </w:pPr>
+    </w:p>
+    <w:p>
+      <w:pPr>
+        <w:pStyle w:val="MdHeading2"/>
+      </w:pPr>
       <w:r>
-        <w:rPr>
-          <w:b/>
-        </w:rPr>
-        <w:t>3.  Местные жители: посетители из близлежащих сел и городов, использующие кафе.</w:t>
+        <w:t>4. Соответствие законодательству</w:t>
       </w:r>
     </w:p>
     <w:p>
-      <w:pPr/>
+      <w:pPr>
+        <w:pStyle w:val="MdParagraph"/>
+      </w:pPr>
       <w:r>
-        <w:rPr>
-          <w:b/>
-        </w:rPr>
-        <w:t>3. Анализ рынка и конкуренции</w:t>
+        <w:t>Проект обязуется соблюдать нормы:</w:t>
       </w:r>
     </w:p>
     <w:p>
-      <w:pPr/>
+      <w:pPr>
+        <w:pStyle w:val="MdSpace"/>
+      </w:pPr>
+    </w:p>
+    <w:p>
+      <w:pPr>
+        <w:pStyle w:val="MdListItem"/>
+      </w:pPr>
       <w:r>
-        <w:rPr>
-          <w:b/>
-        </w:rPr>
-        <w:t>3.1. Анализ местоположения</w:t>
+        <w:t>Закона КР «Об охране окружающей среды»;</w:t>
       </w:r>
     </w:p>
     <w:p>
-      <w:pPr/>
+      <w:pPr>
+        <w:pStyle w:val="MdListItem"/>
+      </w:pPr>
       <w:r>
-        <w:rPr/>
-        <w:t>Местоположение 52й км Тюп-Кеген находится на ключевом участке трассы Тюп-Кеген, которая была недавно реконструирована, что значительно увеличило ее пропускную способность и привлекательность как альтернативного маршрута в Алматы. Близость к КПП “Каркыра-Автодорожный”, который планируется перевести на круглосуточный режим работы, гарантирует стабильный трафик. Так же уникальность проекта в том что дорога от "Трёх Вершин" (Ала-Тоо RESORT) примыкает к трассе Туп-Кеген (к точке локации проекта "Кок-Жайык").</w:t>
+        <w:t>Закона КР «Об устойчивом развитии эколого-экономической системы «Иссык-Куль»;</w:t>
       </w:r>
     </w:p>
     <w:p>
-      <w:pPr/>
+      <w:pPr>
+        <w:pStyle w:val="MdListItem"/>
+      </w:pPr>
       <w:r>
-        <w:rPr>
-          <w:b/>
-        </w:rPr>
-        <w:t>3.2. Конкурентный анализ</w:t>
+        <w:t>Технического регламента «Обеспечение экологической безопасности в Кыргызской Республике».</w:t>
       </w:r>
     </w:p>
     <w:p>
-      <w:pPr/>
+      <w:pPr>
+        <w:pStyle w:val="MdSpace"/>
+      </w:pPr>
+    </w:p>
+    <w:p>
+      <w:pPr>
+        <w:pStyle w:val="MdBlockquote"/>
+      </w:pPr>
       <w:r>
-        <w:rPr/>
-        <w:t>Основными конкурентами являются существующие юрточные лагеря и глэмпинги в долине Каркыра, такие как "Юрточный Глэмпинг Каркара" и "Каркыра Глэмпинг".</w:t>
-      </w:r>
-    </w:p>
-    <w:tbl>
-      <w:tblPr>
-        <w:tblStyle w:val="TableGrid"/>
-        <w:tblW w:type="auto" w:w="0"/>
-        <w:tblLook w:firstColumn="1" w:firstRow="1" w:lastColumn="0" w:lastRow="0" w:noHBand="0" w:noVBand="1" w:val="04A0"/>
-      </w:tblPr>
-      <w:tblGrid>
-        <w:gridCol w:w="2160"/>
-        <w:gridCol w:w="2160"/>
-        <w:gridCol w:w="2160"/>
-        <w:gridCol w:w="2160"/>
-      </w:tblGrid>
-      <w:tr>
-        <w:tc>
-          <w:tcPr>
-            <w:tcW w:type="dxa" w:w="2160"/>
-          </w:tcPr>
-          <w:p>
-            <w:r>
-              <w:t>Конкурент</w:t>
-            </w:r>
-          </w:p>
-        </w:tc>
-        <w:tc>
-          <w:tcPr>
-            <w:tcW w:type="dxa" w:w="2160"/>
-          </w:tcPr>
-          <w:p>
-            <w:r>
-              <w:t>Преимущества</w:t>
-            </w:r>
-          </w:p>
-        </w:tc>
-        <w:tc>
-          <w:tcPr>
-            <w:tcW w:type="dxa" w:w="2160"/>
-          </w:tcPr>
-          <w:p>
-            <w:r>
-              <w:t>Недостатки</w:t>
-            </w:r>
-          </w:p>
-        </w:tc>
-        <w:tc>
-          <w:tcPr>
-            <w:tcW w:type="dxa" w:w="2160"/>
-          </w:tcPr>
-          <w:p>
-            <w:r>
-              <w:t>Позиционирование</w:t>
-            </w:r>
-          </w:p>
-        </w:tc>
-      </w:tr>
-      <w:tr>
-        <w:tc>
-          <w:tcPr>
-            <w:tcW w:type="dxa" w:w="2160"/>
-          </w:tcPr>
-          <w:p>
-            <w:r>
-              <w:t>Юрточные лагеря (Каркыра)</w:t>
-            </w:r>
-          </w:p>
-        </w:tc>
-        <w:tc>
-          <w:tcPr>
-            <w:tcW w:type="dxa" w:w="2160"/>
-          </w:tcPr>
-          <w:p>
-            <w:r>
-              <w:t>Аутентичность, близость к горам</w:t>
-            </w:r>
-          </w:p>
-        </w:tc>
-        <w:tc>
-          <w:tcPr>
-            <w:tcW w:type="dxa" w:w="2160"/>
-          </w:tcPr>
-          <w:p>
-            <w:r>
-              <w:t>Сезонность, низкий уровень комфорта</w:t>
-            </w:r>
-          </w:p>
-        </w:tc>
-        <w:tc>
-          <w:tcPr>
-            <w:tcW w:type="dxa" w:w="2160"/>
-          </w:tcPr>
-          <w:p>
-            <w:r>
-              <w:t>Гибридный подход: Сочетание всесезонных А-frame домов и аутентичных юрт.</w:t>
-            </w:r>
-          </w:p>
-        </w:tc>
-      </w:tr>
-      <w:tr>
-        <w:tc>
-          <w:tcPr>
-            <w:tcW w:type="dxa" w:w="2160"/>
-          </w:tcPr>
-          <w:p>
-            <w:r>
-              <w:t>Придорожные кафе (Тюп/Кеген)</w:t>
-            </w:r>
-          </w:p>
-        </w:tc>
-        <w:tc>
-          <w:tcPr>
-            <w:tcW w:type="dxa" w:w="2160"/>
-          </w:tcPr>
-          <w:p>
-            <w:r>
-              <w:t>Низкие цены, быстрое обслуживание</w:t>
-            </w:r>
-          </w:p>
-        </w:tc>
-        <w:tc>
-          <w:tcPr>
-            <w:tcW w:type="dxa" w:w="2160"/>
-          </w:tcPr>
-          <w:p>
-            <w:r>
-              <w:t>Низкое качество, отсутствие дополнительных услуг</w:t>
-            </w:r>
-          </w:p>
-        </w:tc>
-        <w:tc>
-          <w:tcPr>
-            <w:tcW w:type="dxa" w:w="2160"/>
-          </w:tcPr>
-          <w:p>
-            <w:r>
-              <w:t>Комплексный сервис: Качественное питание, комфортный ночлег и зона отдыха.</w:t>
-            </w:r>
-          </w:p>
-        </w:tc>
-      </w:tr>
-    </w:tbl>
-    <w:p>
-      <w:pPr/>
-      <w:r>
-        <w:rPr>
-          <w:b/>
-        </w:rPr>
-        <w:t>4. Маркетинговый план</w:t>
+        <w:t>Примечание: Все строительные работы будут проводиться строго в границах отведенного участка, исключая воздействие на прилегающие пастбища и заповедные зоны.</w:t>
       </w:r>
     </w:p>
     <w:p>
-      <w:pPr/>
+      <w:pPr>
+        <w:pStyle w:val="MdSpace"/>
+      </w:pPr>
+    </w:p>
+    <w:p>
       <w:r>
-        <w:rPr>
-          <w:b/>
-        </w:rPr>
-        <w:t>1.  Онлайн-продвижение: Активное ведение Instagram, Тик Ток и Google Maps.</w:t>
+        <w:br w:type="page"/>
       </w:r>
     </w:p>
     <w:p>
-      <w:pPr/>
+      <w:pPr>
+        <w:pStyle w:val="Heading1"/>
+      </w:pPr>
       <w:r>
-        <w:rPr>
-          <w:b/>
-        </w:rPr>
-        <w:t>2.  Партнёрство: Сотрудничество с туроператорами, организующими туры в Каракол, на Иссык-Куль и к Хан-Тенгри.</w:t>
+        <w:t>ПРОЕКТ: ЭКОЛОГИЧЕСКИЙ ПАСПОРТ ПРЕДПРИЯТИЯ</w:t>
       </w:r>
     </w:p>
     <w:p>
-      <w:pPr/>
+      <w:pPr>
+        <w:pStyle w:val="Heading2"/>
+      </w:pPr>
       <w:r>
-        <w:rPr/>
-        <w:t>3.  Указатели: Установка заметных дорожных указателей на трассе Тюп-Кеген.</w:t>
+        <w:t>Туристическо-рекреационный центр «Кок-Жайык»</w:t>
       </w:r>
     </w:p>
     <w:p>
-      <w:pPr/>
+      <w:pPr>
+        <w:pStyle w:val="MdParagraph"/>
+      </w:pPr>
       <w:r>
-        <w:rPr>
-          <w:b/>
-        </w:rPr>
-        <w:t>5. Финансовый план</w:t>
+        <w:t>Местонахождение: Иссык-Кульская область, Тюпский район, трасса Тюп-Кеген, 53-й км.</w:t>
+        <w:br/>
+        <w:t>Координаты: 42.736564, 78.935704</w:t>
       </w:r>
     </w:p>
     <w:p>
-      <w:pPr/>
+      <w:pPr>
+        <w:pStyle w:val="MdSpace"/>
+      </w:pPr>
+    </w:p>
+    <w:p>
+      <w:pPr>
+        <w:pStyle w:val="MdHr"/>
+      </w:pPr>
+    </w:p>
+    <w:p>
+      <w:pPr>
+        <w:pStyle w:val="MdSpace"/>
+      </w:pPr>
+    </w:p>
+    <w:p>
+      <w:pPr>
+        <w:pStyle w:val="Heading3"/>
+      </w:pPr>
       <w:r>
-        <w:rPr>
-          <w:b/>
-        </w:rPr>
-        <w:t>5.1. Инвестиционные расходы за счет средств ФРР</w:t>
+        <w:t>1. Общие сведения о предприятии</w:t>
       </w:r>
     </w:p>
     <w:p>
-      <w:pPr/>
+      <w:pPr>
+        <w:pStyle w:val="MdListItem"/>
+      </w:pPr>
       <w:r>
-        <w:rPr/>
-        <w:t>Общий объем инвестиций составляет 2 860 000 сомов, из них 30% — вклад собственных средств в размере 858 000 сомов на строительство А-фрэйм дома (гостевой домик на 4-6 чел.) в количестве 1 единица.</w:t>
-      </w:r>
-    </w:p>
-    <w:tbl>
-      <w:tblPr>
-        <w:tblStyle w:val="TableGrid"/>
-        <w:tblW w:type="auto" w:w="0"/>
-        <w:tblLook w:firstColumn="1" w:firstRow="1" w:lastColumn="0" w:lastRow="0" w:noHBand="0" w:noVBand="1" w:val="04A0"/>
-      </w:tblPr>
-      <w:tblGrid>
-        <w:gridCol w:w="2880"/>
-        <w:gridCol w:w="2880"/>
-        <w:gridCol w:w="2880"/>
-      </w:tblGrid>
-      <w:tr>
-        <w:tc>
-          <w:tcPr>
-            <w:tcW w:type="dxa" w:w="2880"/>
-          </w:tcPr>
-          <w:p>
-            <w:r>
-              <w:t>Статья расходов</w:t>
-            </w:r>
-          </w:p>
-        </w:tc>
-        <w:tc>
-          <w:tcPr>
-            <w:tcW w:type="dxa" w:w="2880"/>
-          </w:tcPr>
-          <w:p>
-            <w:r>
-              <w:t>Стоимость</w:t>
-            </w:r>
-          </w:p>
-        </w:tc>
-        <w:tc>
-          <w:tcPr>
-            <w:tcW w:type="dxa" w:w="2880"/>
-          </w:tcPr>
-          <w:p>
-            <w:r>
-              <w:t>Примечание</w:t>
-            </w:r>
-          </w:p>
-        </w:tc>
-      </w:tr>
-      <w:tr>
-        <w:tc>
-          <w:tcPr>
-            <w:tcW w:type="dxa" w:w="2880"/>
-          </w:tcPr>
-          <w:p>
-            <w:r>
-              <w:t>Строительство кафе-магазин</w:t>
-            </w:r>
-          </w:p>
-        </w:tc>
-        <w:tc>
-          <w:tcPr>
-            <w:tcW w:type="dxa" w:w="2880"/>
-          </w:tcPr>
-          <w:p>
-            <w:r>
-              <w:t>1 400 000</w:t>
-            </w:r>
-          </w:p>
-        </w:tc>
-        <w:tc>
-          <w:tcPr>
-            <w:tcW w:type="dxa" w:w="2880"/>
-          </w:tcPr>
-          <w:p>
-            <w:r>
-              <w:t>Вкл. Оборудование, мебель</w:t>
-            </w:r>
-          </w:p>
-        </w:tc>
-      </w:tr>
-      <w:tr>
-        <w:tc>
-          <w:tcPr>
-            <w:tcW w:type="dxa" w:w="2880"/>
-          </w:tcPr>
-          <w:p>
-            <w:r>
-              <w:t>Инфраструктура и коммуникация</w:t>
-            </w:r>
-          </w:p>
-        </w:tc>
-        <w:tc>
-          <w:tcPr>
-            <w:tcW w:type="dxa" w:w="2880"/>
-          </w:tcPr>
-          <w:p>
-            <w:r>
-              <w:t>300 000</w:t>
-            </w:r>
-          </w:p>
-        </w:tc>
-        <w:tc>
-          <w:tcPr>
-            <w:tcW w:type="dxa" w:w="2880"/>
-          </w:tcPr>
-          <w:p>
-            <w:r>
-              <w:t>Ограждение, подведение воды/электричества, ЛОС</w:t>
-            </w:r>
-          </w:p>
-        </w:tc>
-      </w:tr>
-      <w:tr>
-        <w:tc>
-          <w:tcPr>
-            <w:tcW w:type="dxa" w:w="2880"/>
-          </w:tcPr>
-          <w:p>
-            <w:r>
-              <w:t>Разрешения и маркетинг</w:t>
-            </w:r>
-          </w:p>
-        </w:tc>
-        <w:tc>
-          <w:tcPr>
-            <w:tcW w:type="dxa" w:w="2880"/>
-          </w:tcPr>
-          <w:p>
-            <w:r>
-              <w:t>152 000</w:t>
-            </w:r>
-          </w:p>
-        </w:tc>
-        <w:tc>
-          <w:tcPr>
-            <w:tcW w:type="dxa" w:w="2880"/>
-          </w:tcPr>
-          <w:p>
-            <w:r>
-              <w:t>Юридические расходы, первоначальная реклама</w:t>
-            </w:r>
-          </w:p>
-        </w:tc>
-      </w:tr>
-      <w:tr>
-        <w:tc>
-          <w:tcPr>
-            <w:tcW w:type="dxa" w:w="2880"/>
-          </w:tcPr>
-          <w:p>
-            <w:r>
-              <w:t>Приобретение кухонного оборудования</w:t>
-            </w:r>
-          </w:p>
-        </w:tc>
-        <w:tc>
-          <w:tcPr>
-            <w:tcW w:type="dxa" w:w="2880"/>
-          </w:tcPr>
-          <w:p>
-            <w:r>
-              <w:t>150 000</w:t>
-            </w:r>
-          </w:p>
-        </w:tc>
-        <w:tc>
-          <w:tcPr>
-            <w:tcW w:type="dxa" w:w="2880"/>
-          </w:tcPr>
-          <w:p>
-            <w:r>
-              <w:t>Мебель, посуда, полки</w:t>
-            </w:r>
-          </w:p>
-        </w:tc>
-      </w:tr>
-      <w:tr>
-        <w:tc>
-          <w:tcPr>
-            <w:tcW w:type="dxa" w:w="2880"/>
-          </w:tcPr>
-          <w:p>
-            <w:r>
-              <w:t>Строительство А-фрэйм дом</w:t>
-            </w:r>
-          </w:p>
-        </w:tc>
-        <w:tc>
-          <w:tcPr>
-            <w:tcW w:type="dxa" w:w="2880"/>
-          </w:tcPr>
-          <w:p>
-            <w:r>
-              <w:t>858 000</w:t>
-            </w:r>
-          </w:p>
-        </w:tc>
-        <w:tc>
-          <w:tcPr>
-            <w:tcW w:type="dxa" w:w="2880"/>
-          </w:tcPr>
-          <w:p>
-            <w:r>
-              <w:t>гостевой домик</w:t>
-            </w:r>
-          </w:p>
-        </w:tc>
-      </w:tr>
-      <w:tr>
-        <w:tc>
-          <w:tcPr>
-            <w:tcW w:type="dxa" w:w="2880"/>
-          </w:tcPr>
-          <w:p>
-            <w:r>
-              <w:t>ИТОГО</w:t>
-            </w:r>
-          </w:p>
-        </w:tc>
-        <w:tc>
-          <w:tcPr>
-            <w:tcW w:type="dxa" w:w="2880"/>
-          </w:tcPr>
-          <w:p>
-            <w:r>
-              <w:t>2 860 000</w:t>
-            </w:r>
-          </w:p>
-        </w:tc>
-        <w:tc>
-          <w:tcPr>
-            <w:tcW w:type="dxa" w:w="2880"/>
-          </w:tcPr>
-          <w:p>
-            <w:r/>
-          </w:p>
-        </w:tc>
-      </w:tr>
-    </w:tbl>
-    <w:p>
-      <w:pPr/>
-      <w:r>
-        <w:rPr>
-          <w:b/>
-        </w:rPr>
-        <w:t>5.2. Прогноз доходов</w:t>
+        <w:t>Наименование: ТРЦ «Кок-Жайык» (Проект «Каркыра-Транзит»).</w:t>
       </w:r>
     </w:p>
     <w:p>
-      <w:pPr/>
+      <w:pPr>
+        <w:pStyle w:val="MdListItem"/>
+      </w:pPr>
       <w:r>
-        <w:rPr/>
-        <w:t>Прогноз основан на сезонности и средней заполняемости (май-сентябрь).</w:t>
-      </w:r>
-    </w:p>
-    <w:tbl>
-      <w:tblPr>
-        <w:tblStyle w:val="TableGrid"/>
-        <w:tblW w:type="auto" w:w="0"/>
-        <w:tblLook w:firstColumn="1" w:firstRow="1" w:lastColumn="0" w:lastRow="0" w:noHBand="0" w:noVBand="1" w:val="04A0"/>
-      </w:tblPr>
-      <w:tblGrid>
-        <w:gridCol w:w="2160"/>
-        <w:gridCol w:w="2160"/>
-        <w:gridCol w:w="2160"/>
-        <w:gridCol w:w="2160"/>
-      </w:tblGrid>
-      <w:tr>
-        <w:tc>
-          <w:tcPr>
-            <w:tcW w:type="dxa" w:w="2160"/>
-          </w:tcPr>
-          <w:p>
-            <w:r>
-              <w:t>Статья дохода</w:t>
-            </w:r>
-          </w:p>
-        </w:tc>
-        <w:tc>
-          <w:tcPr>
-            <w:tcW w:type="dxa" w:w="2160"/>
-          </w:tcPr>
-          <w:p>
-            <w:r>
-              <w:t>Количество гостей</w:t>
-            </w:r>
-          </w:p>
-        </w:tc>
-        <w:tc>
-          <w:tcPr>
-            <w:tcW w:type="dxa" w:w="2160"/>
-          </w:tcPr>
-          <w:p>
-            <w:r>
-              <w:t>Месячный расчет</w:t>
-            </w:r>
-          </w:p>
-        </w:tc>
-        <w:tc>
-          <w:tcPr>
-            <w:tcW w:type="dxa" w:w="2160"/>
-          </w:tcPr>
-          <w:p>
-            <w:r>
-              <w:t>Годовой доход (сом)</w:t>
-            </w:r>
-          </w:p>
-        </w:tc>
-      </w:tr>
-      <w:tr>
-        <w:tc>
-          <w:tcPr>
-            <w:tcW w:type="dxa" w:w="2160"/>
-          </w:tcPr>
-          <w:p>
-            <w:r>
-              <w:t>Магазин (средний чек 100 сом)</w:t>
-            </w:r>
-          </w:p>
-        </w:tc>
-        <w:tc>
-          <w:tcPr>
-            <w:tcW w:type="dxa" w:w="2160"/>
-          </w:tcPr>
-          <w:p>
-            <w:r>
-              <w:t>16-17 посетителей в день</w:t>
-            </w:r>
-          </w:p>
-        </w:tc>
-        <w:tc>
-          <w:tcPr>
-            <w:tcW w:type="dxa" w:w="2160"/>
-          </w:tcPr>
-          <w:p>
-            <w:r>
-              <w:t>50 000 * 5 мес.</w:t>
-            </w:r>
-          </w:p>
-        </w:tc>
-        <w:tc>
-          <w:tcPr>
-            <w:tcW w:type="dxa" w:w="2160"/>
-          </w:tcPr>
-          <w:p>
-            <w:r>
-              <w:t>250 000</w:t>
-            </w:r>
-          </w:p>
-        </w:tc>
-      </w:tr>
-      <w:tr>
-        <w:tc>
-          <w:tcPr>
-            <w:tcW w:type="dxa" w:w="2160"/>
-          </w:tcPr>
-          <w:p>
-            <w:r>
-              <w:t>Кафе (средний чек 100 сом)</w:t>
-            </w:r>
-          </w:p>
-        </w:tc>
-        <w:tc>
-          <w:tcPr>
-            <w:tcW w:type="dxa" w:w="2160"/>
-          </w:tcPr>
-          <w:p>
-            <w:r>
-              <w:t>16-17 посетителей в день</w:t>
-            </w:r>
-          </w:p>
-        </w:tc>
-        <w:tc>
-          <w:tcPr>
-            <w:tcW w:type="dxa" w:w="2160"/>
-          </w:tcPr>
-          <w:p>
-            <w:r>
-              <w:t>50 000 * 5 мес.</w:t>
-            </w:r>
-          </w:p>
-        </w:tc>
-        <w:tc>
-          <w:tcPr>
-            <w:tcW w:type="dxa" w:w="2160"/>
-          </w:tcPr>
-          <w:p>
-            <w:r>
-              <w:t>250 000</w:t>
-            </w:r>
-          </w:p>
-        </w:tc>
-      </w:tr>
-      <w:tr>
-        <w:tc>
-          <w:tcPr>
-            <w:tcW w:type="dxa" w:w="2160"/>
-          </w:tcPr>
-          <w:p>
-            <w:r>
-              <w:t>А-фрэйм дом (гостевой домик)</w:t>
-            </w:r>
-          </w:p>
-        </w:tc>
-        <w:tc>
-          <w:tcPr>
-            <w:tcW w:type="dxa" w:w="2160"/>
-          </w:tcPr>
-          <w:p>
-            <w:r>
-              <w:t>4-6 чел.</w:t>
-            </w:r>
-          </w:p>
-        </w:tc>
-        <w:tc>
-          <w:tcPr>
-            <w:tcW w:type="dxa" w:w="2160"/>
-          </w:tcPr>
-          <w:p>
-            <w:r>
-              <w:t>80 000 * 5 мес.</w:t>
-            </w:r>
-          </w:p>
-        </w:tc>
-        <w:tc>
-          <w:tcPr>
-            <w:tcW w:type="dxa" w:w="2160"/>
-          </w:tcPr>
-          <w:p>
-            <w:r>
-              <w:t>400 000</w:t>
-            </w:r>
-          </w:p>
-        </w:tc>
-      </w:tr>
-      <w:tr>
-        <w:tc>
-          <w:tcPr>
-            <w:tcW w:type="dxa" w:w="2160"/>
-          </w:tcPr>
-          <w:p>
-            <w:r>
-              <w:t>ИТОГО ГОДОВОЙ ВЫРУЧКИ</w:t>
-            </w:r>
-          </w:p>
-        </w:tc>
-        <w:tc>
-          <w:tcPr>
-            <w:tcW w:type="dxa" w:w="2160"/>
-          </w:tcPr>
-          <w:p>
-            <w:r/>
-          </w:p>
-        </w:tc>
-        <w:tc>
-          <w:tcPr>
-            <w:tcW w:type="dxa" w:w="2160"/>
-          </w:tcPr>
-          <w:p>
-            <w:r/>
-          </w:p>
-        </w:tc>
-        <w:tc>
-          <w:tcPr>
-            <w:tcW w:type="dxa" w:w="2160"/>
-          </w:tcPr>
-          <w:p>
-            <w:r>
-              <w:t>900 000</w:t>
-            </w:r>
-          </w:p>
-        </w:tc>
-      </w:tr>
-    </w:tbl>
-    <w:p>
-      <w:pPr/>
-      <w:r>
-        <w:rPr>
-          <w:b/>
-        </w:rPr>
-        <w:t>5.3. Операционные расходы</w:t>
+        <w:t>Вид деятельности: Оказание туристических услуг, придорожный сервис (кафе, магазин), краткосрочное проживание.</w:t>
       </w:r>
     </w:p>
     <w:p>
-      <w:pPr/>
+      <w:pPr>
+        <w:pStyle w:val="MdListItem"/>
+      </w:pPr>
       <w:r>
-        <w:rPr/>
-        <w:t>Годовые операционные расходы составляют 200 000 сомов.</w:t>
-      </w:r>
-    </w:p>
-    <w:tbl>
-      <w:tblPr>
-        <w:tblStyle w:val="TableGrid"/>
-        <w:tblW w:type="auto" w:w="0"/>
-        <w:tblLook w:firstColumn="1" w:firstRow="1" w:lastColumn="0" w:lastRow="0" w:noHBand="0" w:noVBand="1" w:val="04A0"/>
-      </w:tblPr>
-      <w:tblGrid>
-        <w:gridCol w:w="2880"/>
-        <w:gridCol w:w="2880"/>
-        <w:gridCol w:w="2880"/>
-      </w:tblGrid>
-      <w:tr>
-        <w:tc>
-          <w:tcPr>
-            <w:tcW w:type="dxa" w:w="2880"/>
-          </w:tcPr>
-          <w:p>
-            <w:r>
-              <w:t>Статья расходов</w:t>
-            </w:r>
-          </w:p>
-        </w:tc>
-        <w:tc>
-          <w:tcPr>
-            <w:tcW w:type="dxa" w:w="2880"/>
-          </w:tcPr>
-          <w:p>
-            <w:r>
-              <w:t>Годовая сумма (сом)</w:t>
-            </w:r>
-          </w:p>
-        </w:tc>
-        <w:tc>
-          <w:tcPr>
-            <w:tcW w:type="dxa" w:w="2880"/>
-          </w:tcPr>
-          <w:p>
-            <w:r>
-              <w:t>Примечание</w:t>
-            </w:r>
-          </w:p>
-        </w:tc>
-      </w:tr>
-      <w:tr>
-        <w:tc>
-          <w:tcPr>
-            <w:tcW w:type="dxa" w:w="2880"/>
-          </w:tcPr>
-          <w:p>
-            <w:r>
-              <w:t>Постоянные расходы; налог/РЭС/тазалык и т.д.</w:t>
-            </w:r>
-          </w:p>
-        </w:tc>
-        <w:tc>
-          <w:tcPr>
-            <w:tcW w:type="dxa" w:w="2880"/>
-          </w:tcPr>
-          <w:p>
-            <w:r>
-              <w:t>12 500</w:t>
-            </w:r>
-          </w:p>
-        </w:tc>
-        <w:tc>
-          <w:tcPr>
-            <w:tcW w:type="dxa" w:w="2880"/>
-          </w:tcPr>
-          <w:p>
-            <w:r>
-              <w:t>3125 сом в мес.</w:t>
-            </w:r>
-          </w:p>
-        </w:tc>
-      </w:tr>
-      <w:tr>
-        <w:tc>
-          <w:tcPr>
-            <w:tcW w:type="dxa" w:w="2880"/>
-          </w:tcPr>
-          <w:p>
-            <w:r>
-              <w:t>Зарплата сотрудникам</w:t>
-            </w:r>
-          </w:p>
-        </w:tc>
-        <w:tc>
-          <w:tcPr>
-            <w:tcW w:type="dxa" w:w="2880"/>
-          </w:tcPr>
-          <w:p>
-            <w:r>
-              <w:t>175 000</w:t>
-            </w:r>
-          </w:p>
-        </w:tc>
-        <w:tc>
-          <w:tcPr>
-            <w:tcW w:type="dxa" w:w="2880"/>
-          </w:tcPr>
-          <w:p>
-            <w:r>
-              <w:t>7000 сом в мес.</w:t>
-            </w:r>
-          </w:p>
-        </w:tc>
-      </w:tr>
-      <w:tr>
-        <w:tc>
-          <w:tcPr>
-            <w:tcW w:type="dxa" w:w="2880"/>
-          </w:tcPr>
-          <w:p>
-            <w:r>
-              <w:t>Переменные расходы/логистика</w:t>
-            </w:r>
-          </w:p>
-        </w:tc>
-        <w:tc>
-          <w:tcPr>
-            <w:tcW w:type="dxa" w:w="2880"/>
-          </w:tcPr>
-          <w:p>
-            <w:r>
-              <w:t>12 500</w:t>
-            </w:r>
-          </w:p>
-        </w:tc>
-        <w:tc>
-          <w:tcPr>
-            <w:tcW w:type="dxa" w:w="2880"/>
-          </w:tcPr>
-          <w:p>
-            <w:r>
-              <w:t>3125 сом в мес.</w:t>
-            </w:r>
-          </w:p>
-        </w:tc>
-      </w:tr>
-      <w:tr>
-        <w:tc>
-          <w:tcPr>
-            <w:tcW w:type="dxa" w:w="2880"/>
-          </w:tcPr>
-          <w:p>
-            <w:r>
-              <w:t>ИТОГО</w:t>
-            </w:r>
-          </w:p>
-        </w:tc>
-        <w:tc>
-          <w:tcPr>
-            <w:tcW w:type="dxa" w:w="2880"/>
-          </w:tcPr>
-          <w:p>
-            <w:r>
-              <w:t>200 000</w:t>
-            </w:r>
-          </w:p>
-        </w:tc>
-        <w:tc>
-          <w:tcPr>
-            <w:tcW w:type="dxa" w:w="2880"/>
-          </w:tcPr>
-          <w:p>
-            <w:r/>
-          </w:p>
-        </w:tc>
-      </w:tr>
-    </w:tbl>
-    <w:p>
-      <w:pPr/>
-      <w:r>
-        <w:rPr>
-          <w:b/>
-        </w:rPr>
-        <w:t>Выводы:</w:t>
+        <w:t xml:space="preserve">Проектная мощность: </w:t>
       </w:r>
     </w:p>
     <w:p>
-      <w:pPr/>
+      <w:pPr>
+        <w:pStyle w:val="MdListItem"/>
+      </w:pPr>
       <w:r>
-        <w:rPr/>
-        <w:t>Проект “Кок Жайык" демонстрирует высокую финансовую привлекательность со сроком окупаемости менее 3 лет. Стратегическое расположение на обновленной трассе. Это стабильный малый бизнес, который обеспечит рабочим местом местных жителей и при этом будет приносить налоговые сборы в регион. А так же будет примером для развития туризма как дополнительный доход местным жителям. Уникальность проекта в том, что локация находится пересечении стратегических развязок, которое соединяет Тюпский регион с Аксууйским с востока. Как примечание могу сказать, что от КПП “Каркыра” до локации проекта отсутствует достойное место отдыха с парковочным местом.</w:t>
+        <w:t>Размещение: до 30 человек одновременно (дома A-frame + юрты).</w:t>
+      </w:r>
+    </w:p>
+    <w:p>
+      <w:pPr>
+        <w:pStyle w:val="MdListItem"/>
+      </w:pPr>
+      <w:r>
+        <w:t>Общепит: 20-30 посадочных мест.</w:t>
+      </w:r>
+    </w:p>
+    <w:p>
+      <w:pPr>
+        <w:pStyle w:val="MdListItem"/>
+      </w:pPr>
+      <w:r>
+        <w:t>Общая площадь участка: [Указать согласно акту на землю] га.</w:t>
+      </w:r>
+    </w:p>
+    <w:p>
+      <w:pPr>
+        <w:pStyle w:val="MdSpace"/>
+      </w:pPr>
+    </w:p>
+    <w:p>
+      <w:pPr>
+        <w:pStyle w:val="Heading3"/>
+      </w:pPr>
+      <w:r>
+        <w:t>2. Эколого-экономические показатели</w:t>
+      </w:r>
+    </w:p>
+    <w:p>
+      <w:pPr>
+        <w:pStyle w:val="Heading3"/>
+      </w:pPr>
+      <w:r>
+        <w:t>3. Охрана атмосферного воздуха</w:t>
+      </w:r>
+    </w:p>
+    <w:p>
+      <w:pPr>
+        <w:pStyle w:val="MdListItem"/>
+      </w:pPr>
+      <w:r>
+        <w:t xml:space="preserve">Источники выбросов: </w:t>
+      </w:r>
+    </w:p>
+    <w:p>
+      <w:pPr>
+        <w:pStyle w:val="MdListItem"/>
+      </w:pPr>
+      <w:r>
+        <w:t>Автотранспорт посетителей (передвижной источник).</w:t>
+      </w:r>
+    </w:p>
+    <w:p>
+      <w:pPr>
+        <w:pStyle w:val="MdListItem"/>
+      </w:pPr>
+      <w:r>
+        <w:t>Кухонное оборудование кафе (вытяжные системы с фильтрами).</w:t>
+      </w:r>
+    </w:p>
+    <w:p>
+      <w:pPr>
+        <w:pStyle w:val="MdListItem"/>
+      </w:pPr>
+      <w:r>
+        <w:t>Резервный дизель-генератор (кратковременная работа).</w:t>
+      </w:r>
+    </w:p>
+    <w:p>
+      <w:pPr>
+        <w:pStyle w:val="MdListItem"/>
+      </w:pPr>
+      <w:r>
+        <w:t>Меры защиты: Использование электроплит в кафе, регулярное обслуживание вентиляционных систем, запрет на сжигание мусора на территории.</w:t>
+      </w:r>
+    </w:p>
+    <w:p>
+      <w:pPr>
+        <w:pStyle w:val="MdSpace"/>
+      </w:pPr>
+    </w:p>
+    <w:p>
+      <w:pPr>
+        <w:pStyle w:val="Heading3"/>
+      </w:pPr>
+      <w:r>
+        <w:t>4. Водопотребление и водоотведение</w:t>
+      </w:r>
+    </w:p>
+    <w:p>
+      <w:pPr>
+        <w:pStyle w:val="MdListItem"/>
+      </w:pPr>
+      <w:r>
+        <w:t>Источник водоснабжения: [Скважина / Каптированный родник].</w:t>
+      </w:r>
+    </w:p>
+    <w:p>
+      <w:pPr>
+        <w:pStyle w:val="MdListItem"/>
+      </w:pPr>
+      <w:r>
+        <w:t>Система очистки стоков: Трехкамерное локальное очистное сооружение (ЛОС) объемом 24 м³.</w:t>
+      </w:r>
+    </w:p>
+    <w:p>
+      <w:pPr>
+        <w:pStyle w:val="MdListItem"/>
+      </w:pPr>
+      <w:r>
+        <w:t>Метод очистки: Механическое отстаивание + анаэробная биологическая очистка.</w:t>
+      </w:r>
+    </w:p>
+    <w:p>
+      <w:pPr>
+        <w:pStyle w:val="MdListItem"/>
+      </w:pPr>
+      <w:r>
+        <w:t>Использование очищенной воды: Оборотное водоснабжение для полива зеленых насаждений (Камера №3 ЛОС).</w:t>
+      </w:r>
+    </w:p>
+    <w:p>
+      <w:pPr>
+        <w:pStyle w:val="MdSpace"/>
+      </w:pPr>
+    </w:p>
+    <w:p>
+      <w:pPr>
+        <w:pStyle w:val="Heading3"/>
+      </w:pPr>
+      <w:r>
+        <w:t>5. Управление отходами</w:t>
+      </w:r>
+    </w:p>
+    <w:p>
+      <w:pPr>
+        <w:pStyle w:val="Heading3"/>
+      </w:pPr>
+      <w:r>
+        <w:t>6. Охрана земельных ресурсов и растительности</w:t>
+      </w:r>
+    </w:p>
+    <w:p>
+      <w:pPr>
+        <w:pStyle w:val="MdListItem"/>
+      </w:pPr>
+      <w:r>
+        <w:t>Состояние почв: Горно-луговые.</w:t>
+      </w:r>
+    </w:p>
+    <w:p>
+      <w:pPr>
+        <w:pStyle w:val="MdListItem"/>
+      </w:pPr>
+      <w:r>
+        <w:t>Меры сохранения: Запрет на движение транспорта вне дорог, использование экологичных моющих средств, рекультивация нарушенных земель после строительства.</w:t>
+      </w:r>
+    </w:p>
+    <w:p>
+      <w:pPr>
+        <w:pStyle w:val="MdSpace"/>
+      </w:pPr>
+    </w:p>
+    <w:p>
+      <w:pPr>
+        <w:pStyle w:val="Heading3"/>
+      </w:pPr>
+      <w:r>
+        <w:t>7. План природоохранных мероприятий (ежегодный)</w:t>
+      </w:r>
+    </w:p>
+    <w:p>
+      <w:pPr>
+        <w:pStyle w:val="MdListItem"/>
+      </w:pPr>
+      <w:r>
+        <w:t>Проверка герметичности ЛОС и эффективности очистки — 2 раза в год.</w:t>
+      </w:r>
+    </w:p>
+    <w:p>
+      <w:pPr>
+        <w:pStyle w:val="MdListItem"/>
+      </w:pPr>
+      <w:r>
+        <w:t>Вывоз ТБО согласно договору с муниципальной службой — еженедельно (в сезон).</w:t>
+      </w:r>
+    </w:p>
+    <w:p>
+      <w:pPr>
+        <w:pStyle w:val="MdListItem"/>
+      </w:pPr>
+      <w:r>
+        <w:t>Озеленение территории саженцами местных пород — апрель-май.</w:t>
+      </w:r>
+    </w:p>
+    <w:p>
+      <w:pPr>
+        <w:pStyle w:val="MdListItem"/>
+      </w:pPr>
+      <w:r>
+        <w:t>Инструктаж персонала по экологической безопасности — ежеквартально.</w:t>
+      </w:r>
+    </w:p>
+    <w:p>
+      <w:pPr>
+        <w:pStyle w:val="MdSpace"/>
+      </w:pPr>
+    </w:p>
+    <w:p>
+      <w:pPr>
+        <w:pStyle w:val="MdHr"/>
+      </w:pPr>
+    </w:p>
+    <w:p>
+      <w:pPr>
+        <w:pStyle w:val="MdParagraph"/>
+      </w:pPr>
+      <w:r>
+        <w:t>Разработчик: [ФИО / Название организации]</w:t>
+        <w:br/>
+        <w:t>Дата составления: 20 января 2026 г.</w:t>
+        <w:br/>
+        <w:t>Срок действия: 5 лет.</w:t>
       </w:r>
     </w:p>
     <w:sectPr>

</xml_diff>

<commit_message>
Improve formatting and title page
</commit_message>
<xml_diff>
--- a/business_plan_perfect.docx
+++ b/business_plan_perfect.docx
@@ -5,31 +5,48 @@
     <w:p>
       <w:pPr>
         <w:pStyle w:val="Normal"/>
+        <w:jc w:val="center"/>
       </w:pPr>
     </w:p>
     <w:p>
       <w:pPr>
         <w:pStyle w:val="Normal"/>
+        <w:jc w:val="center"/>
       </w:pPr>
     </w:p>
     <w:p>
       <w:pPr>
         <w:pStyle w:val="Normal"/>
+        <w:jc w:val="center"/>
       </w:pPr>
     </w:p>
     <w:p>
       <w:pPr>
         <w:pStyle w:val="Normal"/>
+        <w:spacing w:before="2000"/>
+        <w:jc w:val="center"/>
       </w:pPr>
       <w:r>
+        <w:rPr>
+          <w:rFonts w:ascii="Times New Roman" w:hAnsi="Times New Roman" w:eastAsia="Times New Roman"/>
+          <w:b/>
+          <w:sz w:val="48"/>
+        </w:rPr>
         <w:t>БИЗНЕС-ПЛАН</w:t>
       </w:r>
     </w:p>
     <w:p>
       <w:pPr>
         <w:pStyle w:val="Normal"/>
+        <w:spacing w:after="1000"/>
+        <w:jc w:val="center"/>
       </w:pPr>
       <w:r>
+        <w:rPr>
+          <w:rFonts w:ascii="Times New Roman" w:hAnsi="Times New Roman" w:eastAsia="Times New Roman"/>
+          <w:b/>
+          <w:sz w:val="36"/>
+        </w:rPr>
         <w:t>Создание туристическо-рекреационного центра</w:t>
         <w:br/>
         <w:t>«Кок-Жайык»</w:t>
@@ -38,595 +55,1032 @@
     <w:p>
       <w:pPr>
         <w:pStyle w:val="Normal"/>
+        <w:jc w:val="center"/>
       </w:pPr>
     </w:p>
     <w:p>
       <w:pPr>
         <w:pStyle w:val="Normal"/>
+        <w:jc w:val="center"/>
       </w:pPr>
     </w:p>
     <w:p>
       <w:pPr>
         <w:pStyle w:val="Normal"/>
+        <w:jc w:val="center"/>
       </w:pPr>
     </w:p>
     <w:p>
       <w:pPr>
         <w:pStyle w:val="Normal"/>
+        <w:jc w:val="center"/>
       </w:pPr>
     </w:p>
     <w:p>
       <w:pPr>
         <w:pStyle w:val="Normal"/>
+        <w:jc w:val="center"/>
       </w:pPr>
     </w:p>
     <w:p>
       <w:pPr>
         <w:pStyle w:val="Normal"/>
+        <w:spacing w:before="2000"/>
+        <w:jc w:val="right"/>
       </w:pPr>
       <w:r>
+        <w:rPr>
+          <w:rFonts w:ascii="Times New Roman" w:hAnsi="Times New Roman" w:eastAsia="Times New Roman"/>
+          <w:b w:val="0"/>
+          <w:sz w:val="24"/>
+        </w:rPr>
         <w:t xml:space="preserve">Подготовил: Умеров Марс Казизович  </w:t>
       </w:r>
     </w:p>
     <w:p>
       <w:pPr>
         <w:pStyle w:val="Normal"/>
+        <w:jc w:val="center"/>
       </w:pPr>
     </w:p>
     <w:p>
       <w:pPr>
         <w:pStyle w:val="Normal"/>
+        <w:jc w:val="center"/>
       </w:pPr>
     </w:p>
     <w:p>
       <w:pPr>
         <w:pStyle w:val="Normal"/>
+        <w:jc w:val="center"/>
       </w:pPr>
     </w:p>
     <w:p>
       <w:pPr>
         <w:pStyle w:val="Normal"/>
+        <w:jc w:val="center"/>
       </w:pPr>
     </w:p>
     <w:p>
       <w:pPr>
         <w:pStyle w:val="Normal"/>
+        <w:jc w:val="center"/>
       </w:pPr>
     </w:p>
     <w:p>
       <w:pPr>
         <w:pStyle w:val="Normal"/>
+        <w:jc w:val="center"/>
       </w:pPr>
     </w:p>
     <w:p>
       <w:pPr>
         <w:pStyle w:val="Normal"/>
+        <w:jc w:val="center"/>
       </w:pPr>
       <w:r>
+        <w:rPr>
+          <w:rFonts w:ascii="Times New Roman" w:hAnsi="Times New Roman" w:eastAsia="Times New Roman"/>
+          <w:b w:val="0"/>
+          <w:sz w:val="24"/>
+        </w:rPr>
         <w:t>Кыргызская Республика, 2026 г.</w:t>
       </w:r>
     </w:p>
     <w:p>
       <w:pPr>
         <w:pStyle w:val="Normal"/>
+        <w:jc w:val="center"/>
       </w:pPr>
     </w:p>
     <w:p>
       <w:pPr>
         <w:pStyle w:val="Normal"/>
+        <w:jc w:val="center"/>
       </w:pPr>
       <w:r>
+        <w:rPr>
+          <w:rFonts w:ascii="Times New Roman" w:hAnsi="Times New Roman" w:eastAsia="Times New Roman"/>
+          <w:b w:val="0"/>
+          <w:sz w:val="24"/>
+        </w:rPr>
         <w:t>2 860 000 (два миллиона восемьсот шестьдесят тысяч) сомов.</w:t>
       </w:r>
     </w:p>
     <w:p>
       <w:pPr>
         <w:pStyle w:val="Normal"/>
+        <w:jc w:val="center"/>
       </w:pPr>
       <w:r>
+        <w:rPr>
+          <w:rFonts w:ascii="Times New Roman" w:hAnsi="Times New Roman" w:eastAsia="Times New Roman"/>
+          <w:b w:val="0"/>
+          <w:sz w:val="24"/>
+        </w:rPr>
         <w:t>Для старта проекта требуется 2 002 000 сомов, остальные 858 000 сомов (30%) будут обеспечены за счет собственных средств.</w:t>
       </w:r>
     </w:p>
     <w:p>
       <w:pPr>
         <w:pStyle w:val="Normal"/>
+        <w:jc w:val="center"/>
       </w:pPr>
       <w:r>
+        <w:rPr>
+          <w:rFonts w:ascii="Times New Roman" w:hAnsi="Times New Roman" w:eastAsia="Times New Roman"/>
+          <w:b w:val="0"/>
+          <w:sz w:val="24"/>
+        </w:rPr>
         <w:t>Цель проекта: оказывать качественные услуги в сфере туризма для зарубежных, а также, местных гостей.</w:t>
       </w:r>
     </w:p>
     <w:p>
       <w:pPr>
         <w:pStyle w:val="Normal"/>
+        <w:jc w:val="center"/>
       </w:pPr>
       <w:r>
+        <w:rPr>
+          <w:rFonts w:ascii="Times New Roman" w:hAnsi="Times New Roman" w:eastAsia="Times New Roman"/>
+          <w:b w:val="0"/>
+          <w:sz w:val="24"/>
+        </w:rPr>
         <w:t>1. Резюме проекта</w:t>
       </w:r>
     </w:p>
     <w:p>
       <w:pPr>
         <w:pStyle w:val="Normal"/>
+        <w:spacing w:after="1000"/>
+        <w:jc w:val="center"/>
       </w:pPr>
       <w:r>
+        <w:rPr>
+          <w:rFonts w:ascii="Times New Roman" w:hAnsi="Times New Roman" w:eastAsia="Times New Roman"/>
+          <w:b/>
+          <w:sz w:val="36"/>
+        </w:rPr>
         <w:t>Настоящий бизнес-план разработан для обоснования инвестиций в создание туристическо-рекреационного центра "Кок-Жайык" на трассе Тюп-Кеген в Иссык-Кульской области Кыргызской Республики. Проект нацелен на обслуживание растущего туристического и транзитного потока между Казахстаном (Алматы) и Иссык-Кулем (Каракол).</w:t>
       </w:r>
     </w:p>
     <w:p>
       <w:pPr>
         <w:pStyle w:val="Normal"/>
+        <w:jc w:val="center"/>
       </w:pPr>
       <w:r>
+        <w:rPr>
+          <w:rFonts w:ascii="Times New Roman" w:hAnsi="Times New Roman" w:eastAsia="Times New Roman"/>
+          <w:b w:val="0"/>
+          <w:sz w:val="24"/>
+        </w:rPr>
         <w:t>Ключевые показатели проекта:</w:t>
       </w:r>
     </w:p>
     <w:p>
       <w:pPr>
         <w:pStyle w:val="Normal"/>
+        <w:jc w:val="center"/>
       </w:pPr>
       <w:r>
+        <w:rPr>
+          <w:rFonts w:ascii="Times New Roman" w:hAnsi="Times New Roman" w:eastAsia="Times New Roman"/>
+          <w:b w:val="0"/>
+          <w:sz w:val="24"/>
+        </w:rPr>
         <w:t>2. Описание предприятия и услуг</w:t>
       </w:r>
     </w:p>
     <w:p>
       <w:pPr>
         <w:pStyle w:val="Normal"/>
+        <w:spacing w:after="1000"/>
+        <w:jc w:val="center"/>
       </w:pPr>
       <w:r>
+        <w:rPr>
+          <w:rFonts w:ascii="Times New Roman" w:hAnsi="Times New Roman" w:eastAsia="Times New Roman"/>
+          <w:b/>
+          <w:sz w:val="36"/>
+        </w:rPr>
         <w:t>Центр "Кок-Жайык" будет представлять собой многофункциональный комплекс, сочетающий придорожный сервис и комфортное размещение в эко-стиле.</w:t>
       </w:r>
     </w:p>
     <w:p>
       <w:pPr>
         <w:pStyle w:val="Normal"/>
+        <w:jc w:val="center"/>
       </w:pPr>
       <w:r>
+        <w:rPr>
+          <w:rFonts w:ascii="Times New Roman" w:hAnsi="Times New Roman" w:eastAsia="Times New Roman"/>
+          <w:b w:val="0"/>
+          <w:sz w:val="24"/>
+        </w:rPr>
         <w:t>2.1. Инфраструктура</w:t>
       </w:r>
     </w:p>
     <w:p>
       <w:pPr>
         <w:pStyle w:val="Normal"/>
+        <w:jc w:val="center"/>
       </w:pPr>
       <w:r>
+        <w:rPr>
+          <w:rFonts w:ascii="Times New Roman" w:hAnsi="Times New Roman" w:eastAsia="Times New Roman"/>
+          <w:b w:val="0"/>
+          <w:sz w:val="24"/>
+        </w:rPr>
         <w:t>Инфраструктура центра включает:</w:t>
       </w:r>
     </w:p>
     <w:p>
       <w:pPr>
         <w:pStyle w:val="Normal"/>
+        <w:jc w:val="center"/>
       </w:pPr>
       <w:r>
+        <w:rPr>
+          <w:rFonts w:ascii="Times New Roman" w:hAnsi="Times New Roman" w:eastAsia="Times New Roman"/>
+          <w:b w:val="0"/>
+          <w:sz w:val="24"/>
+        </w:rPr>
         <w:t>Магазин и Кафе: Придорожное кафе на 20-30 посадочных мест и небольшой магазин с товарами первой необходимости, сувенирами и местной продукцией.</w:t>
       </w:r>
     </w:p>
     <w:p>
       <w:pPr>
         <w:pStyle w:val="Normal"/>
+        <w:jc w:val="center"/>
       </w:pPr>
       <w:r>
+        <w:rPr>
+          <w:rFonts w:ascii="Times New Roman" w:hAnsi="Times New Roman" w:eastAsia="Times New Roman"/>
+          <w:b w:val="0"/>
+          <w:sz w:val="24"/>
+        </w:rPr>
         <w:t>Размещение одна Юрта: предназначенные для сезонного (летне-осеннего) размещения, что позволит привлечь туристов, ищущих аутентичный опыт.</w:t>
       </w:r>
     </w:p>
     <w:p>
       <w:pPr>
         <w:pStyle w:val="Normal"/>
+        <w:jc w:val="center"/>
       </w:pPr>
       <w:r>
+        <w:rPr>
+          <w:rFonts w:ascii="Times New Roman" w:hAnsi="Times New Roman" w:eastAsia="Times New Roman"/>
+          <w:b w:val="0"/>
+          <w:sz w:val="24"/>
+        </w:rPr>
         <w:t>Площадка для игр: Оборудованная детская и спортивная площадка для кратковременного отдыха транзитных пассажиров и гостей центра.</w:t>
       </w:r>
     </w:p>
     <w:p>
       <w:pPr>
         <w:pStyle w:val="Normal"/>
+        <w:jc w:val="center"/>
       </w:pPr>
       <w:r>
+        <w:rPr>
+          <w:rFonts w:ascii="Times New Roman" w:hAnsi="Times New Roman" w:eastAsia="Times New Roman"/>
+          <w:b w:val="0"/>
+          <w:sz w:val="24"/>
+        </w:rPr>
         <w:t>А-фрейм дом: Один дом на 4 человека, построенный за счет собственных средств.</w:t>
       </w:r>
     </w:p>
     <w:p>
       <w:pPr>
         <w:pStyle w:val="Normal"/>
+        <w:jc w:val="center"/>
       </w:pPr>
       <w:r>
+        <w:rPr>
+          <w:rFonts w:ascii="Times New Roman" w:hAnsi="Times New Roman" w:eastAsia="Times New Roman"/>
+          <w:b w:val="0"/>
+          <w:sz w:val="24"/>
+        </w:rPr>
         <w:t>2.2. Целевая аудитория</w:t>
       </w:r>
     </w:p>
     <w:p>
       <w:pPr>
         <w:pStyle w:val="Normal"/>
+        <w:jc w:val="center"/>
       </w:pPr>
       <w:r>
+        <w:rPr>
+          <w:rFonts w:ascii="Times New Roman" w:hAnsi="Times New Roman" w:eastAsia="Times New Roman"/>
+          <w:b w:val="0"/>
+          <w:sz w:val="24"/>
+        </w:rPr>
         <w:t>1.  Транзитные туристы: Автомобилисты, следующие из Казахстана (Алматы) в Каракол и на южный берег Иссык-Куля, использующие трассу Тюп-Кеген как кратчайший путь.</w:t>
       </w:r>
     </w:p>
     <w:p>
       <w:pPr>
         <w:pStyle w:val="Normal"/>
+        <w:jc w:val="center"/>
       </w:pPr>
       <w:r>
+        <w:rPr>
+          <w:rFonts w:ascii="Times New Roman" w:hAnsi="Times New Roman" w:eastAsia="Times New Roman"/>
+          <w:b w:val="0"/>
+          <w:sz w:val="24"/>
+        </w:rPr>
         <w:t>2.  Экотуристы и альпинисты: Путешественники, направляющиеся в ущелье Каркыра, к пику Хан-Тенгри и в другие горные районы.</w:t>
       </w:r>
     </w:p>
     <w:p>
       <w:pPr>
         <w:pStyle w:val="Normal"/>
+        <w:jc w:val="center"/>
       </w:pPr>
       <w:r>
+        <w:rPr>
+          <w:rFonts w:ascii="Times New Roman" w:hAnsi="Times New Roman" w:eastAsia="Times New Roman"/>
+          <w:b w:val="0"/>
+          <w:sz w:val="24"/>
+        </w:rPr>
         <w:t>3.  Местные жители: посетители из близлежащих сел и городов, использующие кафе.</w:t>
       </w:r>
     </w:p>
     <w:p>
       <w:pPr>
         <w:pStyle w:val="Normal"/>
+        <w:jc w:val="center"/>
       </w:pPr>
       <w:r>
+        <w:rPr>
+          <w:rFonts w:ascii="Times New Roman" w:hAnsi="Times New Roman" w:eastAsia="Times New Roman"/>
+          <w:b w:val="0"/>
+          <w:sz w:val="24"/>
+        </w:rPr>
         <w:t>3. Анализ рынка и конкуренции</w:t>
       </w:r>
     </w:p>
     <w:p>
       <w:pPr>
         <w:pStyle w:val="Normal"/>
+        <w:jc w:val="center"/>
       </w:pPr>
       <w:r>
+        <w:rPr>
+          <w:rFonts w:ascii="Times New Roman" w:hAnsi="Times New Roman" w:eastAsia="Times New Roman"/>
+          <w:b w:val="0"/>
+          <w:sz w:val="24"/>
+        </w:rPr>
         <w:t>3.1. Анализ местоположения</w:t>
       </w:r>
     </w:p>
     <w:p>
       <w:pPr>
         <w:pStyle w:val="Normal"/>
+        <w:spacing w:after="1000"/>
+        <w:jc w:val="center"/>
       </w:pPr>
       <w:r>
+        <w:rPr>
+          <w:rFonts w:ascii="Times New Roman" w:hAnsi="Times New Roman" w:eastAsia="Times New Roman"/>
+          <w:b/>
+          <w:sz w:val="36"/>
+        </w:rPr>
         <w:t>Местоположение 52й км Тюп-Кеген находится на ключевом участке трассы Тюп-Кеген, которая была недавно реконструирована, что значительно увеличило ее пропускную способность и привлекательность как альтернативного маршрута в Алматы. Близость к КПП “Каркыра-Автодорожный”, который планируется перевести на круглосуточный режим работы, гарантирует стабильный трафик. Так же уникальность проекта в том что дорога от "Трёх Вершин" (Ала-Тоо RESORT) примыкает к трассе Туп-Кеген (к точке локации проекта "Кок-Жайык").</w:t>
       </w:r>
     </w:p>
     <w:p>
       <w:pPr>
         <w:pStyle w:val="Normal"/>
+        <w:jc w:val="center"/>
       </w:pPr>
       <w:r>
+        <w:rPr>
+          <w:rFonts w:ascii="Times New Roman" w:hAnsi="Times New Roman" w:eastAsia="Times New Roman"/>
+          <w:b w:val="0"/>
+          <w:sz w:val="24"/>
+        </w:rPr>
         <w:t>3.2. Конкурентный анализ</w:t>
       </w:r>
     </w:p>
     <w:p>
       <w:pPr>
         <w:pStyle w:val="Normal"/>
+        <w:jc w:val="center"/>
       </w:pPr>
       <w:r>
+        <w:rPr>
+          <w:rFonts w:ascii="Times New Roman" w:hAnsi="Times New Roman" w:eastAsia="Times New Roman"/>
+          <w:b w:val="0"/>
+          <w:sz w:val="24"/>
+        </w:rPr>
         <w:t>Основными конкурентами являются существующие юрточные лагеря и глэмпинги в долине Каркыра, такие как "Юрточный Глэмпинг Каркара" и "Каркыра Глэмпинг".</w:t>
       </w:r>
     </w:p>
     <w:p>
       <w:pPr>
         <w:pStyle w:val="Normal"/>
+        <w:jc w:val="center"/>
       </w:pPr>
       <w:r>
+        <w:rPr>
+          <w:rFonts w:ascii="Times New Roman" w:hAnsi="Times New Roman" w:eastAsia="Times New Roman"/>
+          <w:b w:val="0"/>
+          <w:sz w:val="24"/>
+        </w:rPr>
         <w:t>4. Маркетинговый план</w:t>
       </w:r>
     </w:p>
     <w:p>
       <w:pPr>
         <w:pStyle w:val="Normal"/>
+        <w:jc w:val="center"/>
       </w:pPr>
       <w:r>
+        <w:rPr>
+          <w:rFonts w:ascii="Times New Roman" w:hAnsi="Times New Roman" w:eastAsia="Times New Roman"/>
+          <w:b w:val="0"/>
+          <w:sz w:val="24"/>
+        </w:rPr>
         <w:t>1.  Онлайн-продвижение: Активное ведение Instagram, Тик Ток и Google Maps.</w:t>
       </w:r>
     </w:p>
     <w:p>
       <w:pPr>
         <w:pStyle w:val="Normal"/>
+        <w:jc w:val="center"/>
       </w:pPr>
       <w:r>
+        <w:rPr>
+          <w:rFonts w:ascii="Times New Roman" w:hAnsi="Times New Roman" w:eastAsia="Times New Roman"/>
+          <w:b w:val="0"/>
+          <w:sz w:val="24"/>
+        </w:rPr>
         <w:t>2.  Партнёрство: Сотрудничество с туроператорами, организующими туры в Каракол, на Иссык-Куль и к Хан-Тенгри.</w:t>
       </w:r>
     </w:p>
     <w:p>
       <w:pPr>
         <w:pStyle w:val="Normal"/>
+        <w:jc w:val="center"/>
       </w:pPr>
       <w:r>
+        <w:rPr>
+          <w:rFonts w:ascii="Times New Roman" w:hAnsi="Times New Roman" w:eastAsia="Times New Roman"/>
+          <w:b w:val="0"/>
+          <w:sz w:val="24"/>
+        </w:rPr>
         <w:t>3.  Указатели: Установка заметных дорожных указателей на трассе Тюп-Кеген.</w:t>
       </w:r>
     </w:p>
     <w:p>
       <w:pPr>
         <w:pStyle w:val="Normal"/>
+        <w:jc w:val="center"/>
       </w:pPr>
       <w:r>
+        <w:rPr>
+          <w:rFonts w:ascii="Times New Roman" w:hAnsi="Times New Roman" w:eastAsia="Times New Roman"/>
+          <w:b w:val="0"/>
+          <w:sz w:val="24"/>
+        </w:rPr>
         <w:t>5. Финансовый план</w:t>
       </w:r>
     </w:p>
     <w:p>
       <w:pPr>
         <w:pStyle w:val="Normal"/>
+        <w:jc w:val="center"/>
       </w:pPr>
       <w:r>
+        <w:rPr>
+          <w:rFonts w:ascii="Times New Roman" w:hAnsi="Times New Roman" w:eastAsia="Times New Roman"/>
+          <w:b w:val="0"/>
+          <w:sz w:val="24"/>
+        </w:rPr>
         <w:t>5.1. Инвестиционные расходы за счет средств ФРР</w:t>
       </w:r>
     </w:p>
     <w:p>
       <w:pPr>
         <w:pStyle w:val="Normal"/>
+        <w:jc w:val="center"/>
       </w:pPr>
       <w:r>
+        <w:rPr>
+          <w:rFonts w:ascii="Times New Roman" w:hAnsi="Times New Roman" w:eastAsia="Times New Roman"/>
+          <w:b w:val="0"/>
+          <w:sz w:val="24"/>
+        </w:rPr>
         <w:t>Общий объем инвестиций составляет 2 860 000 сомов, из них 30% — вклад собственных средств в размере 858 000 сомов на строительство А-фрэйм дома (гостевой домик на 4-6 чел.) в количестве 1 единица.</w:t>
       </w:r>
     </w:p>
     <w:p>
       <w:pPr>
         <w:pStyle w:val="Normal"/>
+        <w:jc w:val="center"/>
       </w:pPr>
       <w:r>
+        <w:rPr>
+          <w:rFonts w:ascii="Times New Roman" w:hAnsi="Times New Roman" w:eastAsia="Times New Roman"/>
+          <w:b w:val="0"/>
+          <w:sz w:val="24"/>
+        </w:rPr>
         <w:t>5.2. Прогноз доходов</w:t>
       </w:r>
     </w:p>
     <w:p>
       <w:pPr>
         <w:pStyle w:val="Normal"/>
+        <w:jc w:val="center"/>
       </w:pPr>
       <w:r>
+        <w:rPr>
+          <w:rFonts w:ascii="Times New Roman" w:hAnsi="Times New Roman" w:eastAsia="Times New Roman"/>
+          <w:b w:val="0"/>
+          <w:sz w:val="24"/>
+        </w:rPr>
         <w:t>Прогноз основан на сезонности и средней заполняемости (май-сентябрь).</w:t>
       </w:r>
     </w:p>
     <w:p>
       <w:pPr>
         <w:pStyle w:val="Normal"/>
+        <w:jc w:val="center"/>
       </w:pPr>
       <w:r>
+        <w:rPr>
+          <w:rFonts w:ascii="Times New Roman" w:hAnsi="Times New Roman" w:eastAsia="Times New Roman"/>
+          <w:b w:val="0"/>
+          <w:sz w:val="24"/>
+        </w:rPr>
         <w:t>5.3. Операционные расходы</w:t>
       </w:r>
     </w:p>
     <w:p>
       <w:pPr>
         <w:pStyle w:val="Normal"/>
+        <w:jc w:val="center"/>
       </w:pPr>
       <w:r>
+        <w:rPr>
+          <w:rFonts w:ascii="Times New Roman" w:hAnsi="Times New Roman" w:eastAsia="Times New Roman"/>
+          <w:b w:val="0"/>
+          <w:sz w:val="24"/>
+        </w:rPr>
         <w:t>Годовые операционные расходы составляют 200 000 сомов.</w:t>
       </w:r>
     </w:p>
     <w:p>
       <w:pPr>
         <w:pStyle w:val="Normal"/>
+        <w:jc w:val="center"/>
       </w:pPr>
       <w:r>
+        <w:rPr>
+          <w:rFonts w:ascii="Times New Roman" w:hAnsi="Times New Roman" w:eastAsia="Times New Roman"/>
+          <w:b w:val="0"/>
+          <w:sz w:val="24"/>
+        </w:rPr>
         <w:t>Выводы:</w:t>
       </w:r>
     </w:p>
     <w:p>
       <w:pPr>
         <w:pStyle w:val="Normal"/>
+        <w:jc w:val="center"/>
       </w:pPr>
       <w:r>
+        <w:rPr>
+          <w:rFonts w:ascii="Times New Roman" w:hAnsi="Times New Roman" w:eastAsia="Times New Roman"/>
+          <w:b w:val="0"/>
+          <w:sz w:val="24"/>
+        </w:rPr>
         <w:t>Проект “Кок Жайык" демонстрирует высокую финансовую привлекательность со сроком окупаемости менее 3 лет. Стратегическое расположение на обновленной трассе. Это стабильный малый бизнес, который обеспечит рабочим местом местных жителей и при этом будет приносить налоговые сборы в регион. А так же будет примером для развития туризма как дополнительный доход местным жителям. Уникальность проекта в том, что локация находится пересечении стратегических развязок, которое соединяет Тюпский регион с Аксууйским с востока. Как примечание могу сказать, что от КПП “Каркыра” до локации проекта отсутствует достойное место отдыха с парковочным местом.</w:t>
       </w:r>
     </w:p>
     <w:p>
+      <w:pPr>
+        <w:jc w:val="center"/>
+      </w:pPr>
       <w:r>
+        <w:rPr>
+          <w:rFonts w:ascii="Times New Roman" w:hAnsi="Times New Roman" w:eastAsia="Times New Roman"/>
+          <w:b w:val="0"/>
+          <w:sz w:val="24"/>
+        </w:rPr>
         <w:br w:type="page"/>
       </w:r>
     </w:p>
     <w:p>
       <w:pPr>
         <w:pStyle w:val="MdHeading1"/>
+        <w:spacing w:line="276" w:lineRule="auto" w:after="120"/>
+        <w:jc w:val="both"/>
       </w:pPr>
       <w:r>
+        <w:rPr>
+          <w:rFonts w:ascii="Times New Roman" w:hAnsi="Times New Roman" w:eastAsia="Times New Roman"/>
+          <w:b w:val="0"/>
+          <w:sz w:val="24"/>
+        </w:rPr>
         <w:t>Раздел: Охрана окружающей среды</w:t>
       </w:r>
     </w:p>
     <w:p>
       <w:pPr>
         <w:pStyle w:val="MdParagraph"/>
+        <w:spacing w:line="276" w:lineRule="auto" w:after="120"/>
+        <w:jc w:val="both"/>
       </w:pPr>
       <w:r>
+        <w:rPr>
+          <w:rFonts w:ascii="Times New Roman" w:hAnsi="Times New Roman" w:eastAsia="Times New Roman"/>
+          <w:b w:val="0"/>
+          <w:sz w:val="24"/>
+        </w:rPr>
         <w:t>Реализация проекта туристическо-рекреационного центра «Кок-Жайык» осуществляется в экологически чувствительном регионе Иссык-Кульской области. В соответствии с Законом КР «Об охране окружающей среды» и Законом «Об устойчивом развитии эколого-экономической системы «Иссык-Куль», проект предусматривает комплекс мер по минимизации негативного воздействия на природу.</w:t>
       </w:r>
     </w:p>
     <w:p>
       <w:pPr>
         <w:pStyle w:val="MdSpace"/>
+        <w:spacing w:line="276" w:lineRule="auto" w:after="120"/>
+        <w:jc w:val="both"/>
       </w:pPr>
     </w:p>
     <w:p>
       <w:pPr>
         <w:pStyle w:val="MdHeading2"/>
+        <w:spacing w:line="276" w:lineRule="auto" w:after="120" w:before="240"/>
+        <w:jc w:val="left"/>
       </w:pPr>
       <w:r>
+        <w:rPr>
+          <w:rFonts w:ascii="Times New Roman" w:hAnsi="Times New Roman" w:eastAsia="Times New Roman"/>
+          <w:b/>
+          <w:color w:val="003366"/>
+          <w:sz w:val="28"/>
+        </w:rPr>
         <w:t>1. Источники загрязнения в период строительства</w:t>
       </w:r>
     </w:p>
     <w:p>
       <w:pPr>
         <w:pStyle w:val="MdParagraph"/>
+        <w:spacing w:line="276" w:lineRule="auto" w:after="120"/>
+        <w:jc w:val="both"/>
       </w:pPr>
       <w:r>
+        <w:rPr>
+          <w:rFonts w:ascii="Times New Roman" w:hAnsi="Times New Roman" w:eastAsia="Times New Roman"/>
+          <w:b w:val="0"/>
+          <w:sz w:val="24"/>
+        </w:rPr>
         <w:t>Период строительства является наиболее интенсивным этапом воздействия на окружающую среду. Основными источниками загрязнения являются:</w:t>
       </w:r>
     </w:p>
     <w:p>
       <w:pPr>
         <w:pStyle w:val="MdSpace"/>
+        <w:spacing w:line="276" w:lineRule="auto" w:after="120"/>
+        <w:jc w:val="both"/>
       </w:pPr>
     </w:p>
     <w:p>
       <w:pPr>
         <w:pStyle w:val="MdHeading2"/>
+        <w:spacing w:line="276" w:lineRule="auto" w:after="120" w:before="240"/>
+        <w:jc w:val="left"/>
       </w:pPr>
       <w:r>
+        <w:rPr>
+          <w:rFonts w:ascii="Times New Roman" w:hAnsi="Times New Roman" w:eastAsia="Times New Roman"/>
+          <w:b/>
+          <w:color w:val="003366"/>
+          <w:sz w:val="28"/>
+        </w:rPr>
         <w:t>2. Меры по предотвращению загрязнения при строительстве</w:t>
       </w:r>
     </w:p>
     <w:p>
       <w:pPr>
         <w:pStyle w:val="MdParagraph"/>
+        <w:spacing w:line="276" w:lineRule="auto" w:after="120"/>
+        <w:jc w:val="both"/>
       </w:pPr>
       <w:r>
+        <w:rPr>
+          <w:rFonts w:ascii="Times New Roman" w:hAnsi="Times New Roman" w:eastAsia="Times New Roman"/>
+          <w:b w:val="0"/>
+          <w:sz w:val="24"/>
+        </w:rPr>
         <w:t>Для минимизации вышеуказанных воздействий устанавливаются следующие регламенты:</w:t>
       </w:r>
     </w:p>
     <w:p>
       <w:pPr>
         <w:pStyle w:val="MdSpace"/>
+        <w:spacing w:line="276" w:lineRule="auto" w:after="120"/>
+        <w:jc w:val="both"/>
       </w:pPr>
     </w:p>
     <w:p>
       <w:pPr>
         <w:pStyle w:val="MdListItem"/>
+        <w:spacing w:line="276" w:lineRule="auto" w:after="120"/>
+        <w:jc w:val="both"/>
       </w:pPr>
       <w:r>
+        <w:rPr>
+          <w:rFonts w:ascii="Times New Roman" w:hAnsi="Times New Roman" w:eastAsia="Times New Roman"/>
+          <w:b w:val="0"/>
+          <w:sz w:val="24"/>
+        </w:rPr>
         <w:t>Защита атмосферного воздуха: Использование исправной техники с действующими сертификатами экологического контроля. Подавление пыли путем орошения площадки в засушливые периоды.</w:t>
       </w:r>
     </w:p>
     <w:p>
       <w:pPr>
         <w:pStyle w:val="MdListItem"/>
+        <w:spacing w:line="276" w:lineRule="auto" w:after="120"/>
+        <w:jc w:val="both"/>
       </w:pPr>
       <w:r>
+        <w:rPr>
+          <w:rFonts w:ascii="Times New Roman" w:hAnsi="Times New Roman" w:eastAsia="Times New Roman"/>
+          <w:b w:val="0"/>
+          <w:sz w:val="24"/>
+        </w:rPr>
         <w:t>Охрана почв и земель: Снятие и сохранение плодородного слоя почвы перед началом работ для последующей рекультивации. Строгое ограничение движения транспорта установленными дорогами.</w:t>
       </w:r>
     </w:p>
     <w:p>
       <w:pPr>
         <w:pStyle w:val="MdListItem"/>
+        <w:spacing w:line="276" w:lineRule="auto" w:after="120"/>
+        <w:jc w:val="both"/>
       </w:pPr>
       <w:r>
+        <w:rPr>
+          <w:rFonts w:ascii="Times New Roman" w:hAnsi="Times New Roman" w:eastAsia="Times New Roman"/>
+          <w:b w:val="0"/>
+          <w:sz w:val="24"/>
+        </w:rPr>
         <w:t>Управление отходами: Организация площадок для раздельного сбора строительного мусора и ТБО. Заключение договоров на вывоз отходов со специализированными службами Тюпского района.</w:t>
       </w:r>
     </w:p>
     <w:p>
       <w:pPr>
         <w:pStyle w:val="MdListItem"/>
+        <w:spacing w:line="276" w:lineRule="auto" w:after="120"/>
+        <w:jc w:val="both"/>
       </w:pPr>
       <w:r>
+        <w:rPr>
+          <w:rFonts w:ascii="Times New Roman" w:hAnsi="Times New Roman" w:eastAsia="Times New Roman"/>
+          <w:b w:val="0"/>
+          <w:sz w:val="24"/>
+        </w:rPr>
         <w:t>**Защита водных ресурсов:  ** Запрет на мойку техники на территории объекта. Использование туалета с возможность выкачивание содержимого без риска просачивание в почву.</w:t>
       </w:r>
     </w:p>
     <w:p>
       <w:pPr>
         <w:pStyle w:val="MdSpace"/>
+        <w:spacing w:line="276" w:lineRule="auto" w:after="120"/>
+        <w:jc w:val="both"/>
       </w:pPr>
     </w:p>
     <w:p>
       <w:pPr>
         <w:pStyle w:val="MdHeading2"/>
+        <w:spacing w:line="276" w:lineRule="auto" w:after="120" w:before="240"/>
+        <w:jc w:val="left"/>
       </w:pPr>
       <w:r>
+        <w:rPr>
+          <w:rFonts w:ascii="Times New Roman" w:hAnsi="Times New Roman" w:eastAsia="Times New Roman"/>
+          <w:b/>
+          <w:color w:val="003366"/>
+          <w:sz w:val="28"/>
+        </w:rPr>
         <w:t>3. Экологические аспекты эксплуатации (Эко-стандарты проекта)</w:t>
       </w:r>
     </w:p>
     <w:p>
       <w:pPr>
         <w:pStyle w:val="MdParagraph"/>
+        <w:spacing w:line="276" w:lineRule="auto" w:after="120"/>
+        <w:jc w:val="both"/>
       </w:pPr>
       <w:r>
+        <w:rPr>
+          <w:rFonts w:ascii="Times New Roman" w:hAnsi="Times New Roman" w:eastAsia="Times New Roman"/>
+          <w:b w:val="0"/>
+          <w:sz w:val="24"/>
+        </w:rPr>
         <w:t>Проект «Кок-Жайык» позиционируется как эко-центр, что подразумевает внедрение «зеленых» технологий:</w:t>
       </w:r>
     </w:p>
     <w:p>
       <w:pPr>
         <w:pStyle w:val="MdSpace"/>
+        <w:spacing w:line="276" w:lineRule="auto" w:after="120"/>
+        <w:jc w:val="both"/>
       </w:pPr>
     </w:p>
     <w:p>
       <w:pPr>
         <w:pStyle w:val="MdListItem"/>
+        <w:spacing w:line="276" w:lineRule="auto" w:after="120"/>
+        <w:jc w:val="both"/>
       </w:pPr>
       <w:r>
+        <w:rPr>
+          <w:rFonts w:ascii="Times New Roman" w:hAnsi="Times New Roman" w:eastAsia="Times New Roman"/>
+          <w:b w:val="0"/>
+          <w:sz w:val="24"/>
+        </w:rPr>
         <w:t>Водоотведение: Установка современных локальных очистных сооружений (ЛОС) или герметичных септиков с системой глубокой биологической очистки, исключающих попадание стоков в грунтовые воды.</w:t>
       </w:r>
     </w:p>
     <w:p>
       <w:pPr>
         <w:pStyle w:val="MdListItem"/>
+        <w:spacing w:line="276" w:lineRule="auto" w:after="120"/>
+        <w:jc w:val="both"/>
       </w:pPr>
       <w:r>
+        <w:rPr>
+          <w:rFonts w:ascii="Times New Roman" w:hAnsi="Times New Roman" w:eastAsia="Times New Roman"/>
+          <w:b w:val="0"/>
+          <w:sz w:val="24"/>
+        </w:rPr>
         <w:t>Энергоэффективность: Использование энергосберегающего освещения и теплоизоляции домов A-frame для снижения углеродного следа.</w:t>
       </w:r>
     </w:p>
     <w:p>
       <w:pPr>
         <w:pStyle w:val="MdListItem"/>
+        <w:spacing w:line="276" w:lineRule="auto" w:after="120"/>
+        <w:jc w:val="both"/>
       </w:pPr>
       <w:r>
+        <w:rPr>
+          <w:rFonts w:ascii="Times New Roman" w:hAnsi="Times New Roman" w:eastAsia="Times New Roman"/>
+          <w:b w:val="0"/>
+          <w:sz w:val="24"/>
+        </w:rPr>
         <w:t>Сохранение ландшафта: Максимальное сохранение естественного рельефа и растительности. Озеленение территории эндемичными видами растений.</w:t>
       </w:r>
     </w:p>
     <w:p>
       <w:pPr>
         <w:pStyle w:val="MdListItem"/>
+        <w:spacing w:line="276" w:lineRule="auto" w:after="120"/>
+        <w:jc w:val="both"/>
       </w:pPr>
       <w:r>
+        <w:rPr>
+          <w:rFonts w:ascii="Times New Roman" w:hAnsi="Times New Roman" w:eastAsia="Times New Roman"/>
+          <w:b w:val="0"/>
+          <w:sz w:val="24"/>
+        </w:rPr>
         <w:t>Эко-просвещение: Размещение информационных стендов для туристов о правилах поведения в горной местности и бережном отношении к природе Каркыры.</w:t>
       </w:r>
     </w:p>
     <w:p>
       <w:pPr>
         <w:pStyle w:val="MdSpace"/>
+        <w:spacing w:line="276" w:lineRule="auto" w:after="120"/>
+        <w:jc w:val="both"/>
       </w:pPr>
     </w:p>
     <w:p>
       <w:pPr>
         <w:pStyle w:val="MdHeading2"/>
+        <w:spacing w:line="276" w:lineRule="auto" w:after="120" w:before="240"/>
+        <w:jc w:val="left"/>
       </w:pPr>
       <w:r>
+        <w:rPr>
+          <w:rFonts w:ascii="Times New Roman" w:hAnsi="Times New Roman" w:eastAsia="Times New Roman"/>
+          <w:b/>
+          <w:color w:val="003366"/>
+          <w:sz w:val="28"/>
+        </w:rPr>
         <w:t>4. Соответствие законодательству</w:t>
       </w:r>
     </w:p>
     <w:p>
       <w:pPr>
         <w:pStyle w:val="MdParagraph"/>
+        <w:spacing w:line="276" w:lineRule="auto" w:after="120"/>
+        <w:jc w:val="both"/>
       </w:pPr>
       <w:r>
+        <w:rPr>
+          <w:rFonts w:ascii="Times New Roman" w:hAnsi="Times New Roman" w:eastAsia="Times New Roman"/>
+          <w:b w:val="0"/>
+          <w:sz w:val="24"/>
+        </w:rPr>
         <w:t>Проект обязуется соблюдать нормы:</w:t>
       </w:r>
     </w:p>
     <w:p>
       <w:pPr>
         <w:pStyle w:val="MdSpace"/>
+        <w:spacing w:line="276" w:lineRule="auto" w:after="120"/>
+        <w:jc w:val="both"/>
       </w:pPr>
     </w:p>
     <w:p>
       <w:pPr>
         <w:pStyle w:val="MdListItem"/>
+        <w:spacing w:line="276" w:lineRule="auto" w:after="120"/>
+        <w:jc w:val="both"/>
       </w:pPr>
       <w:r>
+        <w:rPr>
+          <w:rFonts w:ascii="Times New Roman" w:hAnsi="Times New Roman" w:eastAsia="Times New Roman"/>
+          <w:b w:val="0"/>
+          <w:sz w:val="24"/>
+        </w:rPr>
         <w:t>Закона КР «Об охране окружающей среды»;</w:t>
       </w:r>
     </w:p>
     <w:p>
       <w:pPr>
         <w:pStyle w:val="MdListItem"/>
+        <w:spacing w:line="276" w:lineRule="auto" w:after="120"/>
+        <w:jc w:val="both"/>
       </w:pPr>
       <w:r>
+        <w:rPr>
+          <w:rFonts w:ascii="Times New Roman" w:hAnsi="Times New Roman" w:eastAsia="Times New Roman"/>
+          <w:b w:val="0"/>
+          <w:sz w:val="24"/>
+        </w:rPr>
         <w:t>Закона КР «Об устойчивом развитии эколого-экономической системы «Иссык-Куль»;</w:t>
       </w:r>
     </w:p>
     <w:p>
       <w:pPr>
         <w:pStyle w:val="MdListItem"/>
+        <w:spacing w:line="276" w:lineRule="auto" w:after="120"/>
+        <w:jc w:val="both"/>
       </w:pPr>
       <w:r>
+        <w:rPr>
+          <w:rFonts w:ascii="Times New Roman" w:hAnsi="Times New Roman" w:eastAsia="Times New Roman"/>
+          <w:b w:val="0"/>
+          <w:sz w:val="24"/>
+        </w:rPr>
         <w:t>Технического регламента «Обеспечение экологической безопасности в Кыргызской Республике».</w:t>
       </w:r>
     </w:p>
     <w:p>
       <w:pPr>
         <w:pStyle w:val="MdSpace"/>
+        <w:spacing w:line="276" w:lineRule="auto" w:after="120"/>
+        <w:jc w:val="both"/>
       </w:pPr>
     </w:p>
     <w:p>
       <w:pPr>
         <w:pStyle w:val="MdBlockquote"/>
+        <w:spacing w:line="276" w:lineRule="auto" w:after="120"/>
+        <w:jc w:val="both"/>
       </w:pPr>
       <w:r>
+        <w:rPr>
+          <w:rFonts w:ascii="Times New Roman" w:hAnsi="Times New Roman" w:eastAsia="Times New Roman"/>
+          <w:b w:val="0"/>
+          <w:sz w:val="24"/>
+        </w:rPr>
         <w:t>Примечание: Все строительные работы будут проводиться строго в границах отведенного участка, исключая воздействие на прилегающие пастбища и заповедные зоны.</w:t>
       </w:r>
     </w:p>
     <w:p>
       <w:pPr>
         <w:pStyle w:val="MdSpace"/>
+        <w:spacing w:line="276" w:lineRule="auto" w:after="120"/>
+        <w:jc w:val="both"/>
       </w:pPr>
     </w:p>
     <w:p>
+      <w:pPr>
+        <w:spacing w:line="276" w:lineRule="auto" w:after="120"/>
+        <w:jc w:val="both"/>
+      </w:pPr>
       <w:r>
+        <w:rPr>
+          <w:rFonts w:ascii="Times New Roman" w:hAnsi="Times New Roman" w:eastAsia="Times New Roman"/>
+          <w:b w:val="0"/>
+          <w:sz w:val="24"/>
+        </w:rPr>
         <w:br w:type="page"/>
       </w:r>
     </w:p>
@@ -649,8 +1103,15 @@
     <w:p>
       <w:pPr>
         <w:pStyle w:val="MdParagraph"/>
+        <w:spacing w:line="276" w:lineRule="auto" w:after="120"/>
+        <w:jc w:val="both"/>
       </w:pPr>
       <w:r>
+        <w:rPr>
+          <w:rFonts w:ascii="Times New Roman" w:hAnsi="Times New Roman" w:eastAsia="Times New Roman"/>
+          <w:b w:val="0"/>
+          <w:sz w:val="24"/>
+        </w:rPr>
         <w:t>Местонахождение: Иссык-Кульская область, Тюпский район, трасса Тюп-Кеген, 53-й км.</w:t>
         <w:br/>
         <w:t>Координаты: 42.736564, 78.935704</w:t>
@@ -659,277 +1120,505 @@
     <w:p>
       <w:pPr>
         <w:pStyle w:val="MdSpace"/>
+        <w:spacing w:line="276" w:lineRule="auto" w:after="120"/>
+        <w:jc w:val="both"/>
       </w:pPr>
     </w:p>
     <w:p>
       <w:pPr>
         <w:pStyle w:val="MdHr"/>
+        <w:spacing w:line="276" w:lineRule="auto" w:after="120"/>
+        <w:jc w:val="both"/>
       </w:pPr>
     </w:p>
     <w:p>
       <w:pPr>
         <w:pStyle w:val="MdSpace"/>
+        <w:spacing w:line="276" w:lineRule="auto" w:after="120"/>
+        <w:jc w:val="both"/>
       </w:pPr>
     </w:p>
     <w:p>
       <w:pPr>
         <w:pStyle w:val="Heading3"/>
+        <w:spacing w:before="240" w:after="120"/>
+        <w:jc w:val="left"/>
       </w:pPr>
       <w:r>
+        <w:rPr>
+          <w:rFonts w:ascii="Times New Roman" w:hAnsi="Times New Roman" w:eastAsia="Times New Roman"/>
+          <w:b/>
+          <w:color w:val="003366"/>
+          <w:sz w:val="28"/>
+        </w:rPr>
         <w:t>1. Общие сведения о предприятии</w:t>
       </w:r>
     </w:p>
     <w:p>
       <w:pPr>
         <w:pStyle w:val="MdListItem"/>
+        <w:spacing w:line="276" w:lineRule="auto" w:after="120"/>
+        <w:jc w:val="both"/>
       </w:pPr>
       <w:r>
+        <w:rPr>
+          <w:rFonts w:ascii="Times New Roman" w:hAnsi="Times New Roman" w:eastAsia="Times New Roman"/>
+          <w:b w:val="0"/>
+          <w:sz w:val="24"/>
+        </w:rPr>
         <w:t>Наименование: ТРЦ «Кок-Жайык» (Проект «Каркыра-Транзит»).</w:t>
       </w:r>
     </w:p>
     <w:p>
       <w:pPr>
         <w:pStyle w:val="MdListItem"/>
+        <w:spacing w:line="276" w:lineRule="auto" w:after="120"/>
+        <w:jc w:val="both"/>
       </w:pPr>
       <w:r>
+        <w:rPr>
+          <w:rFonts w:ascii="Times New Roman" w:hAnsi="Times New Roman" w:eastAsia="Times New Roman"/>
+          <w:b w:val="0"/>
+          <w:sz w:val="24"/>
+        </w:rPr>
         <w:t>Вид деятельности: Оказание туристических услуг, придорожный сервис (кафе, магазин), краткосрочное проживание.</w:t>
       </w:r>
     </w:p>
     <w:p>
       <w:pPr>
         <w:pStyle w:val="MdListItem"/>
+        <w:spacing w:line="276" w:lineRule="auto" w:after="120"/>
+        <w:jc w:val="both"/>
       </w:pPr>
       <w:r>
+        <w:rPr>
+          <w:rFonts w:ascii="Times New Roman" w:hAnsi="Times New Roman" w:eastAsia="Times New Roman"/>
+          <w:b w:val="0"/>
+          <w:sz w:val="24"/>
+        </w:rPr>
         <w:t xml:space="preserve">Проектная мощность: </w:t>
       </w:r>
     </w:p>
     <w:p>
       <w:pPr>
         <w:pStyle w:val="MdListItem"/>
+        <w:spacing w:line="276" w:lineRule="auto" w:after="120"/>
+        <w:jc w:val="both"/>
       </w:pPr>
       <w:r>
+        <w:rPr>
+          <w:rFonts w:ascii="Times New Roman" w:hAnsi="Times New Roman" w:eastAsia="Times New Roman"/>
+          <w:b w:val="0"/>
+          <w:sz w:val="24"/>
+        </w:rPr>
         <w:t>Размещение: до 30 человек одновременно (дома A-frame + юрты).</w:t>
       </w:r>
     </w:p>
     <w:p>
       <w:pPr>
         <w:pStyle w:val="MdListItem"/>
+        <w:spacing w:line="276" w:lineRule="auto" w:after="120"/>
+        <w:jc w:val="both"/>
       </w:pPr>
       <w:r>
+        <w:rPr>
+          <w:rFonts w:ascii="Times New Roman" w:hAnsi="Times New Roman" w:eastAsia="Times New Roman"/>
+          <w:b w:val="0"/>
+          <w:sz w:val="24"/>
+        </w:rPr>
         <w:t>Общепит: 20-30 посадочных мест.</w:t>
       </w:r>
     </w:p>
     <w:p>
       <w:pPr>
         <w:pStyle w:val="MdListItem"/>
+        <w:spacing w:line="276" w:lineRule="auto" w:after="120"/>
+        <w:jc w:val="both"/>
       </w:pPr>
       <w:r>
+        <w:rPr>
+          <w:rFonts w:ascii="Times New Roman" w:hAnsi="Times New Roman" w:eastAsia="Times New Roman"/>
+          <w:b w:val="0"/>
+          <w:sz w:val="24"/>
+        </w:rPr>
         <w:t>Общая площадь участка: [Указать согласно акту на землю] га.</w:t>
       </w:r>
     </w:p>
     <w:p>
       <w:pPr>
         <w:pStyle w:val="MdSpace"/>
+        <w:spacing w:line="276" w:lineRule="auto" w:after="120"/>
+        <w:jc w:val="both"/>
       </w:pPr>
     </w:p>
     <w:p>
       <w:pPr>
         <w:pStyle w:val="Heading3"/>
+        <w:spacing w:before="240" w:after="120"/>
+        <w:jc w:val="left"/>
       </w:pPr>
       <w:r>
+        <w:rPr>
+          <w:rFonts w:ascii="Times New Roman" w:hAnsi="Times New Roman" w:eastAsia="Times New Roman"/>
+          <w:b/>
+          <w:color w:val="003366"/>
+          <w:sz w:val="28"/>
+        </w:rPr>
         <w:t>2. Эколого-экономические показатели</w:t>
       </w:r>
     </w:p>
     <w:p>
       <w:pPr>
         <w:pStyle w:val="Heading3"/>
+        <w:spacing w:before="240" w:after="120"/>
+        <w:jc w:val="left"/>
       </w:pPr>
       <w:r>
+        <w:rPr>
+          <w:rFonts w:ascii="Times New Roman" w:hAnsi="Times New Roman" w:eastAsia="Times New Roman"/>
+          <w:b/>
+          <w:color w:val="003366"/>
+          <w:sz w:val="28"/>
+        </w:rPr>
         <w:t>3. Охрана атмосферного воздуха</w:t>
       </w:r>
     </w:p>
     <w:p>
       <w:pPr>
         <w:pStyle w:val="MdListItem"/>
+        <w:spacing w:line="276" w:lineRule="auto" w:after="120"/>
+        <w:jc w:val="both"/>
       </w:pPr>
       <w:r>
+        <w:rPr>
+          <w:rFonts w:ascii="Times New Roman" w:hAnsi="Times New Roman" w:eastAsia="Times New Roman"/>
+          <w:b w:val="0"/>
+          <w:sz w:val="24"/>
+        </w:rPr>
         <w:t xml:space="preserve">Источники выбросов: </w:t>
       </w:r>
     </w:p>
     <w:p>
       <w:pPr>
         <w:pStyle w:val="MdListItem"/>
+        <w:spacing w:line="276" w:lineRule="auto" w:after="120"/>
+        <w:jc w:val="both"/>
       </w:pPr>
       <w:r>
+        <w:rPr>
+          <w:rFonts w:ascii="Times New Roman" w:hAnsi="Times New Roman" w:eastAsia="Times New Roman"/>
+          <w:b w:val="0"/>
+          <w:sz w:val="24"/>
+        </w:rPr>
         <w:t>Автотранспорт посетителей (передвижной источник).</w:t>
       </w:r>
     </w:p>
     <w:p>
       <w:pPr>
         <w:pStyle w:val="MdListItem"/>
+        <w:spacing w:line="276" w:lineRule="auto" w:after="120"/>
+        <w:jc w:val="both"/>
       </w:pPr>
       <w:r>
+        <w:rPr>
+          <w:rFonts w:ascii="Times New Roman" w:hAnsi="Times New Roman" w:eastAsia="Times New Roman"/>
+          <w:b w:val="0"/>
+          <w:sz w:val="24"/>
+        </w:rPr>
         <w:t>Кухонное оборудование кафе (вытяжные системы с фильтрами).</w:t>
       </w:r>
     </w:p>
     <w:p>
       <w:pPr>
         <w:pStyle w:val="MdListItem"/>
+        <w:spacing w:line="276" w:lineRule="auto" w:after="120"/>
+        <w:jc w:val="both"/>
       </w:pPr>
       <w:r>
+        <w:rPr>
+          <w:rFonts w:ascii="Times New Roman" w:hAnsi="Times New Roman" w:eastAsia="Times New Roman"/>
+          <w:b w:val="0"/>
+          <w:sz w:val="24"/>
+        </w:rPr>
         <w:t>Резервный дизель-генератор (кратковременная работа).</w:t>
       </w:r>
     </w:p>
     <w:p>
       <w:pPr>
         <w:pStyle w:val="MdListItem"/>
+        <w:spacing w:line="276" w:lineRule="auto" w:after="120"/>
+        <w:jc w:val="both"/>
       </w:pPr>
       <w:r>
+        <w:rPr>
+          <w:rFonts w:ascii="Times New Roman" w:hAnsi="Times New Roman" w:eastAsia="Times New Roman"/>
+          <w:b w:val="0"/>
+          <w:sz w:val="24"/>
+        </w:rPr>
         <w:t>Меры защиты: Использование электроплит в кафе, регулярное обслуживание вентиляционных систем, запрет на сжигание мусора на территории.</w:t>
       </w:r>
     </w:p>
     <w:p>
       <w:pPr>
         <w:pStyle w:val="MdSpace"/>
+        <w:spacing w:line="276" w:lineRule="auto" w:after="120"/>
+        <w:jc w:val="both"/>
       </w:pPr>
     </w:p>
     <w:p>
       <w:pPr>
         <w:pStyle w:val="Heading3"/>
+        <w:spacing w:before="240" w:after="120"/>
+        <w:jc w:val="left"/>
       </w:pPr>
       <w:r>
+        <w:rPr>
+          <w:rFonts w:ascii="Times New Roman" w:hAnsi="Times New Roman" w:eastAsia="Times New Roman"/>
+          <w:b/>
+          <w:color w:val="003366"/>
+          <w:sz w:val="28"/>
+        </w:rPr>
         <w:t>4. Водопотребление и водоотведение</w:t>
       </w:r>
     </w:p>
     <w:p>
       <w:pPr>
         <w:pStyle w:val="MdListItem"/>
+        <w:spacing w:line="276" w:lineRule="auto" w:after="120"/>
+        <w:jc w:val="both"/>
       </w:pPr>
       <w:r>
+        <w:rPr>
+          <w:rFonts w:ascii="Times New Roman" w:hAnsi="Times New Roman" w:eastAsia="Times New Roman"/>
+          <w:b w:val="0"/>
+          <w:sz w:val="24"/>
+        </w:rPr>
         <w:t>Источник водоснабжения: [Скважина / Каптированный родник].</w:t>
       </w:r>
     </w:p>
     <w:p>
       <w:pPr>
         <w:pStyle w:val="MdListItem"/>
+        <w:spacing w:line="276" w:lineRule="auto" w:after="120"/>
+        <w:jc w:val="both"/>
       </w:pPr>
       <w:r>
+        <w:rPr>
+          <w:rFonts w:ascii="Times New Roman" w:hAnsi="Times New Roman" w:eastAsia="Times New Roman"/>
+          <w:b w:val="0"/>
+          <w:sz w:val="24"/>
+        </w:rPr>
         <w:t>Система очистки стоков: Трехкамерное локальное очистное сооружение (ЛОС) объемом 24 м³.</w:t>
       </w:r>
     </w:p>
     <w:p>
       <w:pPr>
         <w:pStyle w:val="MdListItem"/>
+        <w:spacing w:line="276" w:lineRule="auto" w:after="120"/>
+        <w:jc w:val="both"/>
       </w:pPr>
       <w:r>
+        <w:rPr>
+          <w:rFonts w:ascii="Times New Roman" w:hAnsi="Times New Roman" w:eastAsia="Times New Roman"/>
+          <w:b w:val="0"/>
+          <w:sz w:val="24"/>
+        </w:rPr>
         <w:t>Метод очистки: Механическое отстаивание + анаэробная биологическая очистка.</w:t>
       </w:r>
     </w:p>
     <w:p>
       <w:pPr>
         <w:pStyle w:val="MdListItem"/>
+        <w:spacing w:line="276" w:lineRule="auto" w:after="120"/>
+        <w:jc w:val="both"/>
       </w:pPr>
       <w:r>
+        <w:rPr>
+          <w:rFonts w:ascii="Times New Roman" w:hAnsi="Times New Roman" w:eastAsia="Times New Roman"/>
+          <w:b w:val="0"/>
+          <w:sz w:val="24"/>
+        </w:rPr>
         <w:t>Использование очищенной воды: Оборотное водоснабжение для полива зеленых насаждений (Камера №3 ЛОС).</w:t>
       </w:r>
     </w:p>
     <w:p>
       <w:pPr>
         <w:pStyle w:val="MdSpace"/>
+        <w:spacing w:line="276" w:lineRule="auto" w:after="120"/>
+        <w:jc w:val="both"/>
       </w:pPr>
     </w:p>
     <w:p>
       <w:pPr>
         <w:pStyle w:val="Heading3"/>
+        <w:spacing w:before="240" w:after="120"/>
+        <w:jc w:val="left"/>
       </w:pPr>
       <w:r>
+        <w:rPr>
+          <w:rFonts w:ascii="Times New Roman" w:hAnsi="Times New Roman" w:eastAsia="Times New Roman"/>
+          <w:b/>
+          <w:color w:val="003366"/>
+          <w:sz w:val="28"/>
+        </w:rPr>
         <w:t>5. Управление отходами</w:t>
       </w:r>
     </w:p>
     <w:p>
       <w:pPr>
         <w:pStyle w:val="Heading3"/>
+        <w:spacing w:before="240" w:after="120"/>
+        <w:jc w:val="left"/>
       </w:pPr>
       <w:r>
+        <w:rPr>
+          <w:rFonts w:ascii="Times New Roman" w:hAnsi="Times New Roman" w:eastAsia="Times New Roman"/>
+          <w:b/>
+          <w:color w:val="003366"/>
+          <w:sz w:val="28"/>
+        </w:rPr>
         <w:t>6. Охрана земельных ресурсов и растительности</w:t>
       </w:r>
     </w:p>
     <w:p>
       <w:pPr>
         <w:pStyle w:val="MdListItem"/>
+        <w:spacing w:line="276" w:lineRule="auto" w:after="120"/>
+        <w:jc w:val="both"/>
       </w:pPr>
       <w:r>
+        <w:rPr>
+          <w:rFonts w:ascii="Times New Roman" w:hAnsi="Times New Roman" w:eastAsia="Times New Roman"/>
+          <w:b w:val="0"/>
+          <w:sz w:val="24"/>
+        </w:rPr>
         <w:t>Состояние почв: Горно-луговые.</w:t>
       </w:r>
     </w:p>
     <w:p>
       <w:pPr>
         <w:pStyle w:val="MdListItem"/>
+        <w:spacing w:line="276" w:lineRule="auto" w:after="120"/>
+        <w:jc w:val="both"/>
       </w:pPr>
       <w:r>
+        <w:rPr>
+          <w:rFonts w:ascii="Times New Roman" w:hAnsi="Times New Roman" w:eastAsia="Times New Roman"/>
+          <w:b w:val="0"/>
+          <w:sz w:val="24"/>
+        </w:rPr>
         <w:t>Меры сохранения: Запрет на движение транспорта вне дорог, использование экологичных моющих средств, рекультивация нарушенных земель после строительства.</w:t>
       </w:r>
     </w:p>
     <w:p>
       <w:pPr>
         <w:pStyle w:val="MdSpace"/>
+        <w:spacing w:line="276" w:lineRule="auto" w:after="120"/>
+        <w:jc w:val="both"/>
       </w:pPr>
     </w:p>
     <w:p>
       <w:pPr>
         <w:pStyle w:val="Heading3"/>
+        <w:spacing w:before="240" w:after="120"/>
+        <w:jc w:val="left"/>
       </w:pPr>
       <w:r>
+        <w:rPr>
+          <w:rFonts w:ascii="Times New Roman" w:hAnsi="Times New Roman" w:eastAsia="Times New Roman"/>
+          <w:b/>
+          <w:color w:val="003366"/>
+          <w:sz w:val="28"/>
+        </w:rPr>
         <w:t>7. План природоохранных мероприятий (ежегодный)</w:t>
       </w:r>
     </w:p>
     <w:p>
       <w:pPr>
         <w:pStyle w:val="MdListItem"/>
+        <w:spacing w:line="276" w:lineRule="auto" w:after="120"/>
+        <w:jc w:val="both"/>
       </w:pPr>
       <w:r>
+        <w:rPr>
+          <w:rFonts w:ascii="Times New Roman" w:hAnsi="Times New Roman" w:eastAsia="Times New Roman"/>
+          <w:b w:val="0"/>
+          <w:sz w:val="24"/>
+        </w:rPr>
         <w:t>Проверка герметичности ЛОС и эффективности очистки — 2 раза в год.</w:t>
       </w:r>
     </w:p>
     <w:p>
       <w:pPr>
         <w:pStyle w:val="MdListItem"/>
+        <w:spacing w:line="276" w:lineRule="auto" w:after="120"/>
+        <w:jc w:val="both"/>
       </w:pPr>
       <w:r>
+        <w:rPr>
+          <w:rFonts w:ascii="Times New Roman" w:hAnsi="Times New Roman" w:eastAsia="Times New Roman"/>
+          <w:b w:val="0"/>
+          <w:sz w:val="24"/>
+        </w:rPr>
         <w:t>Вывоз ТБО согласно договору с муниципальной службой — еженедельно (в сезон).</w:t>
       </w:r>
     </w:p>
     <w:p>
       <w:pPr>
         <w:pStyle w:val="MdListItem"/>
+        <w:spacing w:line="276" w:lineRule="auto" w:after="120"/>
+        <w:jc w:val="both"/>
       </w:pPr>
       <w:r>
+        <w:rPr>
+          <w:rFonts w:ascii="Times New Roman" w:hAnsi="Times New Roman" w:eastAsia="Times New Roman"/>
+          <w:b w:val="0"/>
+          <w:sz w:val="24"/>
+        </w:rPr>
         <w:t>Озеленение территории саженцами местных пород — апрель-май.</w:t>
       </w:r>
     </w:p>
     <w:p>
       <w:pPr>
         <w:pStyle w:val="MdListItem"/>
+        <w:spacing w:line="276" w:lineRule="auto" w:after="120"/>
+        <w:jc w:val="both"/>
       </w:pPr>
       <w:r>
+        <w:rPr>
+          <w:rFonts w:ascii="Times New Roman" w:hAnsi="Times New Roman" w:eastAsia="Times New Roman"/>
+          <w:b w:val="0"/>
+          <w:sz w:val="24"/>
+        </w:rPr>
         <w:t>Инструктаж персонала по экологической безопасности — ежеквартально.</w:t>
       </w:r>
     </w:p>
     <w:p>
       <w:pPr>
         <w:pStyle w:val="MdSpace"/>
+        <w:spacing w:line="276" w:lineRule="auto" w:after="120"/>
+        <w:jc w:val="both"/>
       </w:pPr>
     </w:p>
     <w:p>
       <w:pPr>
         <w:pStyle w:val="MdHr"/>
+        <w:spacing w:line="276" w:lineRule="auto" w:after="120"/>
+        <w:jc w:val="both"/>
       </w:pPr>
     </w:p>
     <w:p>
       <w:pPr>
         <w:pStyle w:val="MdParagraph"/>
+        <w:spacing w:line="276" w:lineRule="auto" w:after="120"/>
+        <w:jc w:val="both"/>
       </w:pPr>
       <w:r>
+        <w:rPr>
+          <w:rFonts w:ascii="Times New Roman" w:hAnsi="Times New Roman" w:eastAsia="Times New Roman"/>
+          <w:b w:val="0"/>
+          <w:sz w:val="24"/>
+        </w:rPr>
         <w:t>Разработчик: [ФИО / Название организации]</w:t>
         <w:br/>
         <w:t>Дата составления: 20 января 2026 г.</w:t>

</xml_diff>

<commit_message>
Force uniform font size and remove blank pages
</commit_message>
<xml_diff>
--- a/business_plan_perfect.docx
+++ b/business_plan_perfect.docx
@@ -4,48 +4,40 @@
   <w:body>
     <w:p>
       <w:pPr>
-        <w:pStyle w:val="Normal"/>
         <w:jc w:val="center"/>
       </w:pPr>
     </w:p>
     <w:p>
       <w:pPr>
-        <w:pStyle w:val="Normal"/>
         <w:jc w:val="center"/>
       </w:pPr>
     </w:p>
     <w:p>
       <w:pPr>
-        <w:pStyle w:val="Normal"/>
         <w:jc w:val="center"/>
       </w:pPr>
     </w:p>
     <w:p>
       <w:pPr>
-        <w:pStyle w:val="Normal"/>
-        <w:spacing w:before="2000"/>
         <w:jc w:val="center"/>
       </w:pPr>
       <w:r>
         <w:rPr>
           <w:rFonts w:ascii="Times New Roman" w:hAnsi="Times New Roman" w:eastAsia="Times New Roman"/>
           <w:b/>
-          <w:sz w:val="48"/>
+          <w:sz w:val="28"/>
         </w:rPr>
         <w:t>БИЗНЕС-ПЛАН</w:t>
       </w:r>
     </w:p>
     <w:p>
       <w:pPr>
-        <w:pStyle w:val="Normal"/>
-        <w:spacing w:after="1000"/>
         <w:jc w:val="center"/>
       </w:pPr>
       <w:r>
         <w:rPr>
           <w:rFonts w:ascii="Times New Roman" w:hAnsi="Times New Roman" w:eastAsia="Times New Roman"/>
-          <w:b/>
-          <w:sz w:val="36"/>
+          <w:sz w:val="24"/>
         </w:rPr>
         <w:t>Создание туристическо-рекреационного центра</w:t>
         <w:br/>
@@ -54,94 +46,78 @@
     </w:p>
     <w:p>
       <w:pPr>
-        <w:pStyle w:val="Normal"/>
         <w:jc w:val="center"/>
       </w:pPr>
     </w:p>
     <w:p>
       <w:pPr>
-        <w:pStyle w:val="Normal"/>
         <w:jc w:val="center"/>
       </w:pPr>
     </w:p>
     <w:p>
       <w:pPr>
-        <w:pStyle w:val="Normal"/>
         <w:jc w:val="center"/>
       </w:pPr>
     </w:p>
     <w:p>
       <w:pPr>
-        <w:pStyle w:val="Normal"/>
         <w:jc w:val="center"/>
       </w:pPr>
     </w:p>
     <w:p>
       <w:pPr>
-        <w:pStyle w:val="Normal"/>
         <w:jc w:val="center"/>
       </w:pPr>
     </w:p>
     <w:p>
       <w:pPr>
-        <w:pStyle w:val="Normal"/>
-        <w:spacing w:before="2000"/>
-        <w:jc w:val="right"/>
+        <w:jc w:val="center"/>
       </w:pPr>
       <w:r>
         <w:rPr>
           <w:rFonts w:ascii="Times New Roman" w:hAnsi="Times New Roman" w:eastAsia="Times New Roman"/>
-          <w:b w:val="0"/>
           <w:sz w:val="24"/>
         </w:rPr>
-        <w:t xml:space="preserve">Подготовил: Умеров Марс Казизович  </w:t>
+        <w:t>Подготовил: Умеров Марс Казизович</w:t>
       </w:r>
     </w:p>
     <w:p>
       <w:pPr>
-        <w:pStyle w:val="Normal"/>
         <w:jc w:val="center"/>
       </w:pPr>
     </w:p>
     <w:p>
       <w:pPr>
-        <w:pStyle w:val="Normal"/>
         <w:jc w:val="center"/>
       </w:pPr>
     </w:p>
     <w:p>
       <w:pPr>
-        <w:pStyle w:val="Normal"/>
         <w:jc w:val="center"/>
       </w:pPr>
     </w:p>
     <w:p>
       <w:pPr>
-        <w:pStyle w:val="Normal"/>
         <w:jc w:val="center"/>
       </w:pPr>
     </w:p>
     <w:p>
       <w:pPr>
-        <w:pStyle w:val="Normal"/>
         <w:jc w:val="center"/>
       </w:pPr>
     </w:p>
     <w:p>
       <w:pPr>
-        <w:pStyle w:val="Normal"/>
         <w:jc w:val="center"/>
       </w:pPr>
     </w:p>
     <w:p>
       <w:pPr>
-        <w:pStyle w:val="Normal"/>
         <w:jc w:val="center"/>
       </w:pPr>
       <w:r>
         <w:rPr>
           <w:rFonts w:ascii="Times New Roman" w:hAnsi="Times New Roman" w:eastAsia="Times New Roman"/>
-          <w:b w:val="0"/>
           <w:sz w:val="24"/>
         </w:rPr>
         <w:t>Кыргызская Республика, 2026 г.</w:t>
@@ -149,19 +125,16 @@
     </w:p>
     <w:p>
       <w:pPr>
-        <w:pStyle w:val="Normal"/>
         <w:jc w:val="center"/>
       </w:pPr>
     </w:p>
     <w:p>
       <w:pPr>
-        <w:pStyle w:val="Normal"/>
         <w:jc w:val="center"/>
       </w:pPr>
       <w:r>
         <w:rPr>
           <w:rFonts w:ascii="Times New Roman" w:hAnsi="Times New Roman" w:eastAsia="Times New Roman"/>
-          <w:b w:val="0"/>
           <w:sz w:val="24"/>
         </w:rPr>
         <w:t>2 860 000 (два миллиона восемьсот шестьдесят тысяч) сомов.</w:t>
@@ -169,13 +142,11 @@
     </w:p>
     <w:p>
       <w:pPr>
-        <w:pStyle w:val="Normal"/>
         <w:jc w:val="center"/>
       </w:pPr>
       <w:r>
         <w:rPr>
           <w:rFonts w:ascii="Times New Roman" w:hAnsi="Times New Roman" w:eastAsia="Times New Roman"/>
-          <w:b w:val="0"/>
           <w:sz w:val="24"/>
         </w:rPr>
         <w:t>Для старта проекта требуется 2 002 000 сомов, остальные 858 000 сомов (30%) будут обеспечены за счет собственных средств.</w:t>
@@ -183,13 +154,11 @@
     </w:p>
     <w:p>
       <w:pPr>
-        <w:pStyle w:val="Normal"/>
         <w:jc w:val="center"/>
       </w:pPr>
       <w:r>
         <w:rPr>
           <w:rFonts w:ascii="Times New Roman" w:hAnsi="Times New Roman" w:eastAsia="Times New Roman"/>
-          <w:b w:val="0"/>
           <w:sz w:val="24"/>
         </w:rPr>
         <w:t>Цель проекта: оказывать качественные услуги в сфере туризма для зарубежных, а также, местных гостей.</w:t>
@@ -197,13 +166,11 @@
     </w:p>
     <w:p>
       <w:pPr>
-        <w:pStyle w:val="Normal"/>
         <w:jc w:val="center"/>
       </w:pPr>
       <w:r>
         <w:rPr>
           <w:rFonts w:ascii="Times New Roman" w:hAnsi="Times New Roman" w:eastAsia="Times New Roman"/>
-          <w:b w:val="0"/>
           <w:sz w:val="24"/>
         </w:rPr>
         <w:t>1. Резюме проекта</w:t>
@@ -211,28 +178,23 @@
     </w:p>
     <w:p>
       <w:pPr>
-        <w:pStyle w:val="Normal"/>
-        <w:spacing w:after="1000"/>
         <w:jc w:val="center"/>
       </w:pPr>
       <w:r>
         <w:rPr>
           <w:rFonts w:ascii="Times New Roman" w:hAnsi="Times New Roman" w:eastAsia="Times New Roman"/>
-          <w:b/>
-          <w:sz w:val="36"/>
+          <w:sz w:val="24"/>
         </w:rPr>
         <w:t>Настоящий бизнес-план разработан для обоснования инвестиций в создание туристическо-рекреационного центра "Кок-Жайык" на трассе Тюп-Кеген в Иссык-Кульской области Кыргызской Республики. Проект нацелен на обслуживание растущего туристического и транзитного потока между Казахстаном (Алматы) и Иссык-Кулем (Каракол).</w:t>
       </w:r>
     </w:p>
     <w:p>
       <w:pPr>
-        <w:pStyle w:val="Normal"/>
         <w:jc w:val="center"/>
       </w:pPr>
       <w:r>
         <w:rPr>
           <w:rFonts w:ascii="Times New Roman" w:hAnsi="Times New Roman" w:eastAsia="Times New Roman"/>
-          <w:b w:val="0"/>
           <w:sz w:val="24"/>
         </w:rPr>
         <w:t>Ключевые показатели проекта:</w:t>
@@ -240,13 +202,11 @@
     </w:p>
     <w:p>
       <w:pPr>
-        <w:pStyle w:val="Normal"/>
         <w:jc w:val="center"/>
       </w:pPr>
       <w:r>
         <w:rPr>
           <w:rFonts w:ascii="Times New Roman" w:hAnsi="Times New Roman" w:eastAsia="Times New Roman"/>
-          <w:b w:val="0"/>
           <w:sz w:val="24"/>
         </w:rPr>
         <w:t>2. Описание предприятия и услуг</w:t>
@@ -254,28 +214,23 @@
     </w:p>
     <w:p>
       <w:pPr>
-        <w:pStyle w:val="Normal"/>
-        <w:spacing w:after="1000"/>
         <w:jc w:val="center"/>
       </w:pPr>
       <w:r>
         <w:rPr>
           <w:rFonts w:ascii="Times New Roman" w:hAnsi="Times New Roman" w:eastAsia="Times New Roman"/>
-          <w:b/>
-          <w:sz w:val="36"/>
+          <w:sz w:val="24"/>
         </w:rPr>
         <w:t>Центр "Кок-Жайык" будет представлять собой многофункциональный комплекс, сочетающий придорожный сервис и комфортное размещение в эко-стиле.</w:t>
       </w:r>
     </w:p>
     <w:p>
       <w:pPr>
-        <w:pStyle w:val="Normal"/>
         <w:jc w:val="center"/>
       </w:pPr>
       <w:r>
         <w:rPr>
           <w:rFonts w:ascii="Times New Roman" w:hAnsi="Times New Roman" w:eastAsia="Times New Roman"/>
-          <w:b w:val="0"/>
           <w:sz w:val="24"/>
         </w:rPr>
         <w:t>2.1. Инфраструктура</w:t>
@@ -283,13 +238,11 @@
     </w:p>
     <w:p>
       <w:pPr>
-        <w:pStyle w:val="Normal"/>
         <w:jc w:val="center"/>
       </w:pPr>
       <w:r>
         <w:rPr>
           <w:rFonts w:ascii="Times New Roman" w:hAnsi="Times New Roman" w:eastAsia="Times New Roman"/>
-          <w:b w:val="0"/>
           <w:sz w:val="24"/>
         </w:rPr>
         <w:t>Инфраструктура центра включает:</w:t>
@@ -297,13 +250,11 @@
     </w:p>
     <w:p>
       <w:pPr>
-        <w:pStyle w:val="Normal"/>
         <w:jc w:val="center"/>
       </w:pPr>
       <w:r>
         <w:rPr>
           <w:rFonts w:ascii="Times New Roman" w:hAnsi="Times New Roman" w:eastAsia="Times New Roman"/>
-          <w:b w:val="0"/>
           <w:sz w:val="24"/>
         </w:rPr>
         <w:t>Магазин и Кафе: Придорожное кафе на 20-30 посадочных мест и небольшой магазин с товарами первой необходимости, сувенирами и местной продукцией.</w:t>
@@ -311,13 +262,11 @@
     </w:p>
     <w:p>
       <w:pPr>
-        <w:pStyle w:val="Normal"/>
         <w:jc w:val="center"/>
       </w:pPr>
       <w:r>
         <w:rPr>
           <w:rFonts w:ascii="Times New Roman" w:hAnsi="Times New Roman" w:eastAsia="Times New Roman"/>
-          <w:b w:val="0"/>
           <w:sz w:val="24"/>
         </w:rPr>
         <w:t>Размещение одна Юрта: предназначенные для сезонного (летне-осеннего) размещения, что позволит привлечь туристов, ищущих аутентичный опыт.</w:t>
@@ -325,13 +274,11 @@
     </w:p>
     <w:p>
       <w:pPr>
-        <w:pStyle w:val="Normal"/>
         <w:jc w:val="center"/>
       </w:pPr>
       <w:r>
         <w:rPr>
           <w:rFonts w:ascii="Times New Roman" w:hAnsi="Times New Roman" w:eastAsia="Times New Roman"/>
-          <w:b w:val="0"/>
           <w:sz w:val="24"/>
         </w:rPr>
         <w:t>Площадка для игр: Оборудованная детская и спортивная площадка для кратковременного отдыха транзитных пассажиров и гостей центра.</w:t>
@@ -339,13 +286,11 @@
     </w:p>
     <w:p>
       <w:pPr>
-        <w:pStyle w:val="Normal"/>
         <w:jc w:val="center"/>
       </w:pPr>
       <w:r>
         <w:rPr>
           <w:rFonts w:ascii="Times New Roman" w:hAnsi="Times New Roman" w:eastAsia="Times New Roman"/>
-          <w:b w:val="0"/>
           <w:sz w:val="24"/>
         </w:rPr>
         <w:t>А-фрейм дом: Один дом на 4 человека, построенный за счет собственных средств.</w:t>
@@ -353,13 +298,11 @@
     </w:p>
     <w:p>
       <w:pPr>
-        <w:pStyle w:val="Normal"/>
         <w:jc w:val="center"/>
       </w:pPr>
       <w:r>
         <w:rPr>
           <w:rFonts w:ascii="Times New Roman" w:hAnsi="Times New Roman" w:eastAsia="Times New Roman"/>
-          <w:b w:val="0"/>
           <w:sz w:val="24"/>
         </w:rPr>
         <w:t>2.2. Целевая аудитория</w:t>
@@ -367,13 +310,11 @@
     </w:p>
     <w:p>
       <w:pPr>
-        <w:pStyle w:val="Normal"/>
         <w:jc w:val="center"/>
       </w:pPr>
       <w:r>
         <w:rPr>
           <w:rFonts w:ascii="Times New Roman" w:hAnsi="Times New Roman" w:eastAsia="Times New Roman"/>
-          <w:b w:val="0"/>
           <w:sz w:val="24"/>
         </w:rPr>
         <w:t>1.  Транзитные туристы: Автомобилисты, следующие из Казахстана (Алматы) в Каракол и на южный берег Иссык-Куля, использующие трассу Тюп-Кеген как кратчайший путь.</w:t>
@@ -381,13 +322,11 @@
     </w:p>
     <w:p>
       <w:pPr>
-        <w:pStyle w:val="Normal"/>
         <w:jc w:val="center"/>
       </w:pPr>
       <w:r>
         <w:rPr>
           <w:rFonts w:ascii="Times New Roman" w:hAnsi="Times New Roman" w:eastAsia="Times New Roman"/>
-          <w:b w:val="0"/>
           <w:sz w:val="24"/>
         </w:rPr>
         <w:t>2.  Экотуристы и альпинисты: Путешественники, направляющиеся в ущелье Каркыра, к пику Хан-Тенгри и в другие горные районы.</w:t>
@@ -395,13 +334,11 @@
     </w:p>
     <w:p>
       <w:pPr>
-        <w:pStyle w:val="Normal"/>
         <w:jc w:val="center"/>
       </w:pPr>
       <w:r>
         <w:rPr>
           <w:rFonts w:ascii="Times New Roman" w:hAnsi="Times New Roman" w:eastAsia="Times New Roman"/>
-          <w:b w:val="0"/>
           <w:sz w:val="24"/>
         </w:rPr>
         <w:t>3.  Местные жители: посетители из близлежащих сел и городов, использующие кафе.</w:t>
@@ -409,13 +346,11 @@
     </w:p>
     <w:p>
       <w:pPr>
-        <w:pStyle w:val="Normal"/>
         <w:jc w:val="center"/>
       </w:pPr>
       <w:r>
         <w:rPr>
           <w:rFonts w:ascii="Times New Roman" w:hAnsi="Times New Roman" w:eastAsia="Times New Roman"/>
-          <w:b w:val="0"/>
           <w:sz w:val="24"/>
         </w:rPr>
         <w:t>3. Анализ рынка и конкуренции</w:t>
@@ -423,13 +358,11 @@
     </w:p>
     <w:p>
       <w:pPr>
-        <w:pStyle w:val="Normal"/>
         <w:jc w:val="center"/>
       </w:pPr>
       <w:r>
         <w:rPr>
           <w:rFonts w:ascii="Times New Roman" w:hAnsi="Times New Roman" w:eastAsia="Times New Roman"/>
-          <w:b w:val="0"/>
           <w:sz w:val="24"/>
         </w:rPr>
         <w:t>3.1. Анализ местоположения</w:t>
@@ -437,28 +370,23 @@
     </w:p>
     <w:p>
       <w:pPr>
-        <w:pStyle w:val="Normal"/>
-        <w:spacing w:after="1000"/>
         <w:jc w:val="center"/>
       </w:pPr>
       <w:r>
         <w:rPr>
           <w:rFonts w:ascii="Times New Roman" w:hAnsi="Times New Roman" w:eastAsia="Times New Roman"/>
-          <w:b/>
-          <w:sz w:val="36"/>
+          <w:sz w:val="24"/>
         </w:rPr>
         <w:t>Местоположение 52й км Тюп-Кеген находится на ключевом участке трассы Тюп-Кеген, которая была недавно реконструирована, что значительно увеличило ее пропускную способность и привлекательность как альтернативного маршрута в Алматы. Близость к КПП “Каркыра-Автодорожный”, который планируется перевести на круглосуточный режим работы, гарантирует стабильный трафик. Так же уникальность проекта в том что дорога от "Трёх Вершин" (Ала-Тоо RESORT) примыкает к трассе Туп-Кеген (к точке локации проекта "Кок-Жайык").</w:t>
       </w:r>
     </w:p>
     <w:p>
       <w:pPr>
-        <w:pStyle w:val="Normal"/>
         <w:jc w:val="center"/>
       </w:pPr>
       <w:r>
         <w:rPr>
           <w:rFonts w:ascii="Times New Roman" w:hAnsi="Times New Roman" w:eastAsia="Times New Roman"/>
-          <w:b w:val="0"/>
           <w:sz w:val="24"/>
         </w:rPr>
         <w:t>3.2. Конкурентный анализ</w:t>
@@ -466,13 +394,11 @@
     </w:p>
     <w:p>
       <w:pPr>
-        <w:pStyle w:val="Normal"/>
         <w:jc w:val="center"/>
       </w:pPr>
       <w:r>
         <w:rPr>
           <w:rFonts w:ascii="Times New Roman" w:hAnsi="Times New Roman" w:eastAsia="Times New Roman"/>
-          <w:b w:val="0"/>
           <w:sz w:val="24"/>
         </w:rPr>
         <w:t>Основными конкурентами являются существующие юрточные лагеря и глэмпинги в долине Каркыра, такие как "Юрточный Глэмпинг Каркара" и "Каркыра Глэмпинг".</w:t>
@@ -480,13 +406,11 @@
     </w:p>
     <w:p>
       <w:pPr>
-        <w:pStyle w:val="Normal"/>
         <w:jc w:val="center"/>
       </w:pPr>
       <w:r>
         <w:rPr>
           <w:rFonts w:ascii="Times New Roman" w:hAnsi="Times New Roman" w:eastAsia="Times New Roman"/>
-          <w:b w:val="0"/>
           <w:sz w:val="24"/>
         </w:rPr>
         <w:t>4. Маркетинговый план</w:t>
@@ -494,13 +418,11 @@
     </w:p>
     <w:p>
       <w:pPr>
-        <w:pStyle w:val="Normal"/>
         <w:jc w:val="center"/>
       </w:pPr>
       <w:r>
         <w:rPr>
           <w:rFonts w:ascii="Times New Roman" w:hAnsi="Times New Roman" w:eastAsia="Times New Roman"/>
-          <w:b w:val="0"/>
           <w:sz w:val="24"/>
         </w:rPr>
         <w:t>1.  Онлайн-продвижение: Активное ведение Instagram, Тик Ток и Google Maps.</w:t>
@@ -508,13 +430,11 @@
     </w:p>
     <w:p>
       <w:pPr>
-        <w:pStyle w:val="Normal"/>
         <w:jc w:val="center"/>
       </w:pPr>
       <w:r>
         <w:rPr>
           <w:rFonts w:ascii="Times New Roman" w:hAnsi="Times New Roman" w:eastAsia="Times New Roman"/>
-          <w:b w:val="0"/>
           <w:sz w:val="24"/>
         </w:rPr>
         <w:t>2.  Партнёрство: Сотрудничество с туроператорами, организующими туры в Каракол, на Иссык-Куль и к Хан-Тенгри.</w:t>
@@ -522,13 +442,11 @@
     </w:p>
     <w:p>
       <w:pPr>
-        <w:pStyle w:val="Normal"/>
         <w:jc w:val="center"/>
       </w:pPr>
       <w:r>
         <w:rPr>
           <w:rFonts w:ascii="Times New Roman" w:hAnsi="Times New Roman" w:eastAsia="Times New Roman"/>
-          <w:b w:val="0"/>
           <w:sz w:val="24"/>
         </w:rPr>
         <w:t>3.  Указатели: Установка заметных дорожных указателей на трассе Тюп-Кеген.</w:t>
@@ -536,13 +454,11 @@
     </w:p>
     <w:p>
       <w:pPr>
-        <w:pStyle w:val="Normal"/>
         <w:jc w:val="center"/>
       </w:pPr>
       <w:r>
         <w:rPr>
           <w:rFonts w:ascii="Times New Roman" w:hAnsi="Times New Roman" w:eastAsia="Times New Roman"/>
-          <w:b w:val="0"/>
           <w:sz w:val="24"/>
         </w:rPr>
         <w:t>5. Финансовый план</w:t>
@@ -550,13 +466,11 @@
     </w:p>
     <w:p>
       <w:pPr>
-        <w:pStyle w:val="Normal"/>
         <w:jc w:val="center"/>
       </w:pPr>
       <w:r>
         <w:rPr>
           <w:rFonts w:ascii="Times New Roman" w:hAnsi="Times New Roman" w:eastAsia="Times New Roman"/>
-          <w:b w:val="0"/>
           <w:sz w:val="24"/>
         </w:rPr>
         <w:t>5.1. Инвестиционные расходы за счет средств ФРР</w:t>
@@ -564,13 +478,11 @@
     </w:p>
     <w:p>
       <w:pPr>
-        <w:pStyle w:val="Normal"/>
         <w:jc w:val="center"/>
       </w:pPr>
       <w:r>
         <w:rPr>
           <w:rFonts w:ascii="Times New Roman" w:hAnsi="Times New Roman" w:eastAsia="Times New Roman"/>
-          <w:b w:val="0"/>
           <w:sz w:val="24"/>
         </w:rPr>
         <w:t>Общий объем инвестиций составляет 2 860 000 сомов, из них 30% — вклад собственных средств в размере 858 000 сомов на строительство А-фрэйм дома (гостевой домик на 4-6 чел.) в количестве 1 единица.</w:t>
@@ -578,13 +490,11 @@
     </w:p>
     <w:p>
       <w:pPr>
-        <w:pStyle w:val="Normal"/>
         <w:jc w:val="center"/>
       </w:pPr>
       <w:r>
         <w:rPr>
           <w:rFonts w:ascii="Times New Roman" w:hAnsi="Times New Roman" w:eastAsia="Times New Roman"/>
-          <w:b w:val="0"/>
           <w:sz w:val="24"/>
         </w:rPr>
         <w:t>5.2. Прогноз доходов</w:t>
@@ -592,13 +502,11 @@
     </w:p>
     <w:p>
       <w:pPr>
-        <w:pStyle w:val="Normal"/>
         <w:jc w:val="center"/>
       </w:pPr>
       <w:r>
         <w:rPr>
           <w:rFonts w:ascii="Times New Roman" w:hAnsi="Times New Roman" w:eastAsia="Times New Roman"/>
-          <w:b w:val="0"/>
           <w:sz w:val="24"/>
         </w:rPr>
         <w:t>Прогноз основан на сезонности и средней заполняемости (май-сентябрь).</w:t>
@@ -606,13 +514,11 @@
     </w:p>
     <w:p>
       <w:pPr>
-        <w:pStyle w:val="Normal"/>
         <w:jc w:val="center"/>
       </w:pPr>
       <w:r>
         <w:rPr>
           <w:rFonts w:ascii="Times New Roman" w:hAnsi="Times New Roman" w:eastAsia="Times New Roman"/>
-          <w:b w:val="0"/>
           <w:sz w:val="24"/>
         </w:rPr>
         <w:t>5.3. Операционные расходы</w:t>
@@ -620,13 +526,11 @@
     </w:p>
     <w:p>
       <w:pPr>
-        <w:pStyle w:val="Normal"/>
         <w:jc w:val="center"/>
       </w:pPr>
       <w:r>
         <w:rPr>
           <w:rFonts w:ascii="Times New Roman" w:hAnsi="Times New Roman" w:eastAsia="Times New Roman"/>
-          <w:b w:val="0"/>
           <w:sz w:val="24"/>
         </w:rPr>
         <w:t>Годовые операционные расходы составляют 200 000 сомов.</w:t>
@@ -634,13 +538,11 @@
     </w:p>
     <w:p>
       <w:pPr>
-        <w:pStyle w:val="Normal"/>
         <w:jc w:val="center"/>
       </w:pPr>
       <w:r>
         <w:rPr>
           <w:rFonts w:ascii="Times New Roman" w:hAnsi="Times New Roman" w:eastAsia="Times New Roman"/>
-          <w:b w:val="0"/>
           <w:sz w:val="24"/>
         </w:rPr>
         <w:t>Выводы:</w:t>
@@ -648,13 +550,11 @@
     </w:p>
     <w:p>
       <w:pPr>
-        <w:pStyle w:val="Normal"/>
         <w:jc w:val="center"/>
       </w:pPr>
       <w:r>
         <w:rPr>
           <w:rFonts w:ascii="Times New Roman" w:hAnsi="Times New Roman" w:eastAsia="Times New Roman"/>
-          <w:b w:val="0"/>
           <w:sz w:val="24"/>
         </w:rPr>
         <w:t>Проект “Кок Жайык" демонстрирует высокую финансовую привлекательность со сроком окупаемости менее 3 лет. Стратегическое расположение на обновленной трассе. Это стабильный малый бизнес, который обеспечит рабочим местом местных жителей и при этом будет приносить налоговые сборы в регион. А так же будет примером для развития туризма как дополнительный доход местным жителям. Уникальность проекта в том, что локация находится пересечении стратегических развязок, которое соединяет Тюпский регион с Аксууйским с востока. Как примечание могу сказать, что от КПП “Каркыра” до локации проекта отсутствует достойное место отдыха с парковочным местом.</w:t>
@@ -664,25 +564,14 @@
       <w:pPr>
         <w:jc w:val="center"/>
       </w:pPr>
+    </w:p>
+    <w:p>
+      <w:pPr>
+        <w:jc w:val="both"/>
+      </w:pPr>
       <w:r>
         <w:rPr>
           <w:rFonts w:ascii="Times New Roman" w:hAnsi="Times New Roman" w:eastAsia="Times New Roman"/>
-          <w:b w:val="0"/>
-          <w:sz w:val="24"/>
-        </w:rPr>
-        <w:br w:type="page"/>
-      </w:r>
-    </w:p>
-    <w:p>
-      <w:pPr>
-        <w:pStyle w:val="MdHeading1"/>
-        <w:spacing w:line="276" w:lineRule="auto" w:after="120"/>
-        <w:jc w:val="both"/>
-      </w:pPr>
-      <w:r>
-        <w:rPr>
-          <w:rFonts w:ascii="Times New Roman" w:hAnsi="Times New Roman" w:eastAsia="Times New Roman"/>
-          <w:b w:val="0"/>
           <w:sz w:val="24"/>
         </w:rPr>
         <w:t>Раздел: Охрана окружающей среды</w:t>
@@ -690,14 +579,11 @@
     </w:p>
     <w:p>
       <w:pPr>
-        <w:pStyle w:val="MdParagraph"/>
-        <w:spacing w:line="276" w:lineRule="auto" w:after="120"/>
         <w:jc w:val="both"/>
       </w:pPr>
       <w:r>
         <w:rPr>
           <w:rFonts w:ascii="Times New Roman" w:hAnsi="Times New Roman" w:eastAsia="Times New Roman"/>
-          <w:b w:val="0"/>
           <w:sz w:val="24"/>
         </w:rPr>
         <w:t>Реализация проекта туристическо-рекреационного центра «Кок-Жайык» осуществляется в экологически чувствительном регионе Иссык-Кульской области. В соответствии с Законом КР «Об охране окружающей среды» и Законом «Об устойчивом развитии эколого-экономической системы «Иссык-Куль», проект предусматривает комплекс мер по минимизации негативного воздействия на природу.</w:t>
@@ -705,37 +591,23 @@
     </w:p>
     <w:p>
       <w:pPr>
-        <w:pStyle w:val="MdSpace"/>
-        <w:spacing w:line="276" w:lineRule="auto" w:after="120"/>
         <w:jc w:val="both"/>
-      </w:pPr>
-    </w:p>
-    <w:p>
-      <w:pPr>
-        <w:pStyle w:val="MdHeading2"/>
-        <w:spacing w:line="276" w:lineRule="auto" w:after="120" w:before="240"/>
-        <w:jc w:val="left"/>
       </w:pPr>
       <w:r>
         <w:rPr>
           <w:rFonts w:ascii="Times New Roman" w:hAnsi="Times New Roman" w:eastAsia="Times New Roman"/>
-          <w:b/>
-          <w:color w:val="003366"/>
-          <w:sz w:val="28"/>
+          <w:sz w:val="24"/>
         </w:rPr>
         <w:t>1. Источники загрязнения в период строительства</w:t>
       </w:r>
     </w:p>
     <w:p>
       <w:pPr>
-        <w:pStyle w:val="MdParagraph"/>
-        <w:spacing w:line="276" w:lineRule="auto" w:after="120"/>
         <w:jc w:val="both"/>
       </w:pPr>
       <w:r>
         <w:rPr>
           <w:rFonts w:ascii="Times New Roman" w:hAnsi="Times New Roman" w:eastAsia="Times New Roman"/>
-          <w:b w:val="0"/>
           <w:sz w:val="24"/>
         </w:rPr>
         <w:t>Период строительства является наиболее интенсивным этапом воздействия на окружающую среду. Основными источниками загрязнения являются:</w:t>
@@ -743,37 +615,23 @@
     </w:p>
     <w:p>
       <w:pPr>
-        <w:pStyle w:val="MdSpace"/>
-        <w:spacing w:line="276" w:lineRule="auto" w:after="120"/>
         <w:jc w:val="both"/>
-      </w:pPr>
-    </w:p>
-    <w:p>
-      <w:pPr>
-        <w:pStyle w:val="MdHeading2"/>
-        <w:spacing w:line="276" w:lineRule="auto" w:after="120" w:before="240"/>
-        <w:jc w:val="left"/>
       </w:pPr>
       <w:r>
         <w:rPr>
           <w:rFonts w:ascii="Times New Roman" w:hAnsi="Times New Roman" w:eastAsia="Times New Roman"/>
-          <w:b/>
-          <w:color w:val="003366"/>
-          <w:sz w:val="28"/>
+          <w:sz w:val="24"/>
         </w:rPr>
         <w:t>2. Меры по предотвращению загрязнения при строительстве</w:t>
       </w:r>
     </w:p>
     <w:p>
       <w:pPr>
-        <w:pStyle w:val="MdParagraph"/>
-        <w:spacing w:line="276" w:lineRule="auto" w:after="120"/>
         <w:jc w:val="both"/>
       </w:pPr>
       <w:r>
         <w:rPr>
           <w:rFonts w:ascii="Times New Roman" w:hAnsi="Times New Roman" w:eastAsia="Times New Roman"/>
-          <w:b w:val="0"/>
           <w:sz w:val="24"/>
         </w:rPr>
         <w:t>Для минимизации вышеуказанных воздействий устанавливаются следующие регламенты:</w:t>
@@ -781,21 +639,11 @@
     </w:p>
     <w:p>
       <w:pPr>
-        <w:pStyle w:val="MdSpace"/>
-        <w:spacing w:line="276" w:lineRule="auto" w:after="120"/>
-        <w:jc w:val="both"/>
-      </w:pPr>
-    </w:p>
-    <w:p>
-      <w:pPr>
-        <w:pStyle w:val="MdListItem"/>
-        <w:spacing w:line="276" w:lineRule="auto" w:after="120"/>
         <w:jc w:val="both"/>
       </w:pPr>
       <w:r>
         <w:rPr>
           <w:rFonts w:ascii="Times New Roman" w:hAnsi="Times New Roman" w:eastAsia="Times New Roman"/>
-          <w:b w:val="0"/>
           <w:sz w:val="24"/>
         </w:rPr>
         <w:t>Защита атмосферного воздуха: Использование исправной техники с действующими сертификатами экологического контроля. Подавление пыли путем орошения площадки в засушливые периоды.</w:t>
@@ -803,14 +651,11 @@
     </w:p>
     <w:p>
       <w:pPr>
-        <w:pStyle w:val="MdListItem"/>
-        <w:spacing w:line="276" w:lineRule="auto" w:after="120"/>
         <w:jc w:val="both"/>
       </w:pPr>
       <w:r>
         <w:rPr>
           <w:rFonts w:ascii="Times New Roman" w:hAnsi="Times New Roman" w:eastAsia="Times New Roman"/>
-          <w:b w:val="0"/>
           <w:sz w:val="24"/>
         </w:rPr>
         <w:t>Охрана почв и земель: Снятие и сохранение плодородного слоя почвы перед началом работ для последующей рекультивации. Строгое ограничение движения транспорта установленными дорогами.</w:t>
@@ -818,14 +663,11 @@
     </w:p>
     <w:p>
       <w:pPr>
-        <w:pStyle w:val="MdListItem"/>
-        <w:spacing w:line="276" w:lineRule="auto" w:after="120"/>
         <w:jc w:val="both"/>
       </w:pPr>
       <w:r>
         <w:rPr>
           <w:rFonts w:ascii="Times New Roman" w:hAnsi="Times New Roman" w:eastAsia="Times New Roman"/>
-          <w:b w:val="0"/>
           <w:sz w:val="24"/>
         </w:rPr>
         <w:t>Управление отходами: Организация площадок для раздельного сбора строительного мусора и ТБО. Заключение договоров на вывоз отходов со специализированными службами Тюпского района.</w:t>
@@ -833,14 +675,11 @@
     </w:p>
     <w:p>
       <w:pPr>
-        <w:pStyle w:val="MdListItem"/>
-        <w:spacing w:line="276" w:lineRule="auto" w:after="120"/>
         <w:jc w:val="both"/>
       </w:pPr>
       <w:r>
         <w:rPr>
           <w:rFonts w:ascii="Times New Roman" w:hAnsi="Times New Roman" w:eastAsia="Times New Roman"/>
-          <w:b w:val="0"/>
           <w:sz w:val="24"/>
         </w:rPr>
         <w:t>**Защита водных ресурсов:  ** Запрет на мойку техники на территории объекта. Использование туалета с возможность выкачивание содержимого без риска просачивание в почву.</w:t>
@@ -848,37 +687,23 @@
     </w:p>
     <w:p>
       <w:pPr>
-        <w:pStyle w:val="MdSpace"/>
-        <w:spacing w:line="276" w:lineRule="auto" w:after="120"/>
         <w:jc w:val="both"/>
-      </w:pPr>
-    </w:p>
-    <w:p>
-      <w:pPr>
-        <w:pStyle w:val="MdHeading2"/>
-        <w:spacing w:line="276" w:lineRule="auto" w:after="120" w:before="240"/>
-        <w:jc w:val="left"/>
       </w:pPr>
       <w:r>
         <w:rPr>
           <w:rFonts w:ascii="Times New Roman" w:hAnsi="Times New Roman" w:eastAsia="Times New Roman"/>
-          <w:b/>
-          <w:color w:val="003366"/>
-          <w:sz w:val="28"/>
+          <w:sz w:val="24"/>
         </w:rPr>
         <w:t>3. Экологические аспекты эксплуатации (Эко-стандарты проекта)</w:t>
       </w:r>
     </w:p>
     <w:p>
       <w:pPr>
-        <w:pStyle w:val="MdParagraph"/>
-        <w:spacing w:line="276" w:lineRule="auto" w:after="120"/>
         <w:jc w:val="both"/>
       </w:pPr>
       <w:r>
         <w:rPr>
           <w:rFonts w:ascii="Times New Roman" w:hAnsi="Times New Roman" w:eastAsia="Times New Roman"/>
-          <w:b w:val="0"/>
           <w:sz w:val="24"/>
         </w:rPr>
         <w:t>Проект «Кок-Жайык» позиционируется как эко-центр, что подразумевает внедрение «зеленых» технологий:</w:t>
@@ -886,21 +711,11 @@
     </w:p>
     <w:p>
       <w:pPr>
-        <w:pStyle w:val="MdSpace"/>
-        <w:spacing w:line="276" w:lineRule="auto" w:after="120"/>
-        <w:jc w:val="both"/>
-      </w:pPr>
-    </w:p>
-    <w:p>
-      <w:pPr>
-        <w:pStyle w:val="MdListItem"/>
-        <w:spacing w:line="276" w:lineRule="auto" w:after="120"/>
         <w:jc w:val="both"/>
       </w:pPr>
       <w:r>
         <w:rPr>
           <w:rFonts w:ascii="Times New Roman" w:hAnsi="Times New Roman" w:eastAsia="Times New Roman"/>
-          <w:b w:val="0"/>
           <w:sz w:val="24"/>
         </w:rPr>
         <w:t>Водоотведение: Установка современных локальных очистных сооружений (ЛОС) или герметичных септиков с системой глубокой биологической очистки, исключающих попадание стоков в грунтовые воды.</w:t>
@@ -908,14 +723,11 @@
     </w:p>
     <w:p>
       <w:pPr>
-        <w:pStyle w:val="MdListItem"/>
-        <w:spacing w:line="276" w:lineRule="auto" w:after="120"/>
         <w:jc w:val="both"/>
       </w:pPr>
       <w:r>
         <w:rPr>
           <w:rFonts w:ascii="Times New Roman" w:hAnsi="Times New Roman" w:eastAsia="Times New Roman"/>
-          <w:b w:val="0"/>
           <w:sz w:val="24"/>
         </w:rPr>
         <w:t>Энергоэффективность: Использование энергосберегающего освещения и теплоизоляции домов A-frame для снижения углеродного следа.</w:t>
@@ -923,14 +735,11 @@
     </w:p>
     <w:p>
       <w:pPr>
-        <w:pStyle w:val="MdListItem"/>
-        <w:spacing w:line="276" w:lineRule="auto" w:after="120"/>
         <w:jc w:val="both"/>
       </w:pPr>
       <w:r>
         <w:rPr>
           <w:rFonts w:ascii="Times New Roman" w:hAnsi="Times New Roman" w:eastAsia="Times New Roman"/>
-          <w:b w:val="0"/>
           <w:sz w:val="24"/>
         </w:rPr>
         <w:t>Сохранение ландшафта: Максимальное сохранение естественного рельефа и растительности. Озеленение территории эндемичными видами растений.</w:t>
@@ -938,14 +747,11 @@
     </w:p>
     <w:p>
       <w:pPr>
-        <w:pStyle w:val="MdListItem"/>
-        <w:spacing w:line="276" w:lineRule="auto" w:after="120"/>
         <w:jc w:val="both"/>
       </w:pPr>
       <w:r>
         <w:rPr>
           <w:rFonts w:ascii="Times New Roman" w:hAnsi="Times New Roman" w:eastAsia="Times New Roman"/>
-          <w:b w:val="0"/>
           <w:sz w:val="24"/>
         </w:rPr>
         <w:t>Эко-просвещение: Размещение информационных стендов для туристов о правилах поведения в горной местности и бережном отношении к природе Каркыры.</w:t>
@@ -953,37 +759,23 @@
     </w:p>
     <w:p>
       <w:pPr>
-        <w:pStyle w:val="MdSpace"/>
-        <w:spacing w:line="276" w:lineRule="auto" w:after="120"/>
         <w:jc w:val="both"/>
-      </w:pPr>
-    </w:p>
-    <w:p>
-      <w:pPr>
-        <w:pStyle w:val="MdHeading2"/>
-        <w:spacing w:line="276" w:lineRule="auto" w:after="120" w:before="240"/>
-        <w:jc w:val="left"/>
       </w:pPr>
       <w:r>
         <w:rPr>
           <w:rFonts w:ascii="Times New Roman" w:hAnsi="Times New Roman" w:eastAsia="Times New Roman"/>
-          <w:b/>
-          <w:color w:val="003366"/>
-          <w:sz w:val="28"/>
+          <w:sz w:val="24"/>
         </w:rPr>
         <w:t>4. Соответствие законодательству</w:t>
       </w:r>
     </w:p>
     <w:p>
       <w:pPr>
-        <w:pStyle w:val="MdParagraph"/>
-        <w:spacing w:line="276" w:lineRule="auto" w:after="120"/>
         <w:jc w:val="both"/>
       </w:pPr>
       <w:r>
         <w:rPr>
           <w:rFonts w:ascii="Times New Roman" w:hAnsi="Times New Roman" w:eastAsia="Times New Roman"/>
-          <w:b w:val="0"/>
           <w:sz w:val="24"/>
         </w:rPr>
         <w:t>Проект обязуется соблюдать нормы:</w:t>
@@ -991,21 +783,11 @@
     </w:p>
     <w:p>
       <w:pPr>
-        <w:pStyle w:val="MdSpace"/>
-        <w:spacing w:line="276" w:lineRule="auto" w:after="120"/>
-        <w:jc w:val="both"/>
-      </w:pPr>
-    </w:p>
-    <w:p>
-      <w:pPr>
-        <w:pStyle w:val="MdListItem"/>
-        <w:spacing w:line="276" w:lineRule="auto" w:after="120"/>
         <w:jc w:val="both"/>
       </w:pPr>
       <w:r>
         <w:rPr>
           <w:rFonts w:ascii="Times New Roman" w:hAnsi="Times New Roman" w:eastAsia="Times New Roman"/>
-          <w:b w:val="0"/>
           <w:sz w:val="24"/>
         </w:rPr>
         <w:t>Закона КР «Об охране окружающей среды»;</w:t>
@@ -1013,14 +795,11 @@
     </w:p>
     <w:p>
       <w:pPr>
-        <w:pStyle w:val="MdListItem"/>
-        <w:spacing w:line="276" w:lineRule="auto" w:after="120"/>
         <w:jc w:val="both"/>
       </w:pPr>
       <w:r>
         <w:rPr>
           <w:rFonts w:ascii="Times New Roman" w:hAnsi="Times New Roman" w:eastAsia="Times New Roman"/>
-          <w:b w:val="0"/>
           <w:sz w:val="24"/>
         </w:rPr>
         <w:t>Закона КР «Об устойчивом развитии эколого-экономической системы «Иссык-Куль»;</w:t>
@@ -1028,14 +807,11 @@
     </w:p>
     <w:p>
       <w:pPr>
-        <w:pStyle w:val="MdListItem"/>
-        <w:spacing w:line="276" w:lineRule="auto" w:after="120"/>
         <w:jc w:val="both"/>
       </w:pPr>
       <w:r>
         <w:rPr>
           <w:rFonts w:ascii="Times New Roman" w:hAnsi="Times New Roman" w:eastAsia="Times New Roman"/>
-          <w:b w:val="0"/>
           <w:sz w:val="24"/>
         </w:rPr>
         <w:t>Технического регламента «Обеспечение экологической безопасности в Кыргызской Республике».</w:t>
@@ -1043,21 +819,11 @@
     </w:p>
     <w:p>
       <w:pPr>
-        <w:pStyle w:val="MdSpace"/>
-        <w:spacing w:line="276" w:lineRule="auto" w:after="120"/>
-        <w:jc w:val="both"/>
-      </w:pPr>
-    </w:p>
-    <w:p>
-      <w:pPr>
-        <w:pStyle w:val="MdBlockquote"/>
-        <w:spacing w:line="276" w:lineRule="auto" w:after="120"/>
         <w:jc w:val="both"/>
       </w:pPr>
       <w:r>
         <w:rPr>
           <w:rFonts w:ascii="Times New Roman" w:hAnsi="Times New Roman" w:eastAsia="Times New Roman"/>
-          <w:b w:val="0"/>
           <w:sz w:val="24"/>
         </w:rPr>
         <w:t>Примечание: Все строительные работы будут проводиться строго в границах отведенного участка, исключая воздействие на прилегающие пастбища и заповедные зоны.</w:t>
@@ -1065,51 +831,35 @@
     </w:p>
     <w:p>
       <w:pPr>
-        <w:pStyle w:val="MdSpace"/>
-        <w:spacing w:line="276" w:lineRule="auto" w:after="120"/>
-        <w:jc w:val="both"/>
-      </w:pPr>
-    </w:p>
-    <w:p>
-      <w:pPr>
-        <w:spacing w:line="276" w:lineRule="auto" w:after="120"/>
         <w:jc w:val="both"/>
       </w:pPr>
       <w:r>
         <w:rPr>
           <w:rFonts w:ascii="Times New Roman" w:hAnsi="Times New Roman" w:eastAsia="Times New Roman"/>
-          <w:b w:val="0"/>
           <w:sz w:val="24"/>
         </w:rPr>
-        <w:br w:type="page"/>
-      </w:r>
-    </w:p>
-    <w:p>
-      <w:pPr>
-        <w:pStyle w:val="Heading1"/>
-      </w:pPr>
-      <w:r>
         <w:t>ПРОЕКТ: ЭКОЛОГИЧЕСКИЙ ПАСПОРТ ПРЕДПРИЯТИЯ</w:t>
       </w:r>
     </w:p>
     <w:p>
       <w:pPr>
-        <w:pStyle w:val="Heading2"/>
+        <w:jc w:val="both"/>
       </w:pPr>
       <w:r>
+        <w:rPr>
+          <w:rFonts w:ascii="Times New Roman" w:hAnsi="Times New Roman" w:eastAsia="Times New Roman"/>
+          <w:sz w:val="24"/>
+        </w:rPr>
         <w:t>Туристическо-рекреационный центр «Кок-Жайык»</w:t>
       </w:r>
     </w:p>
     <w:p>
       <w:pPr>
-        <w:pStyle w:val="MdParagraph"/>
-        <w:spacing w:line="276" w:lineRule="auto" w:after="120"/>
         <w:jc w:val="both"/>
       </w:pPr>
       <w:r>
         <w:rPr>
           <w:rFonts w:ascii="Times New Roman" w:hAnsi="Times New Roman" w:eastAsia="Times New Roman"/>
-          <w:b w:val="0"/>
           <w:sz w:val="24"/>
         </w:rPr>
         <w:t>Местонахождение: Иссык-Кульская область, Тюпский район, трасса Тюп-Кеген, 53-й км.</w:t>
@@ -1119,51 +869,23 @@
     </w:p>
     <w:p>
       <w:pPr>
-        <w:pStyle w:val="MdSpace"/>
-        <w:spacing w:line="276" w:lineRule="auto" w:after="120"/>
         <w:jc w:val="both"/>
-      </w:pPr>
-    </w:p>
-    <w:p>
-      <w:pPr>
-        <w:pStyle w:val="MdHr"/>
-        <w:spacing w:line="276" w:lineRule="auto" w:after="120"/>
-        <w:jc w:val="both"/>
-      </w:pPr>
-    </w:p>
-    <w:p>
-      <w:pPr>
-        <w:pStyle w:val="MdSpace"/>
-        <w:spacing w:line="276" w:lineRule="auto" w:after="120"/>
-        <w:jc w:val="both"/>
-      </w:pPr>
-    </w:p>
-    <w:p>
-      <w:pPr>
-        <w:pStyle w:val="Heading3"/>
-        <w:spacing w:before="240" w:after="120"/>
-        <w:jc w:val="left"/>
       </w:pPr>
       <w:r>
         <w:rPr>
           <w:rFonts w:ascii="Times New Roman" w:hAnsi="Times New Roman" w:eastAsia="Times New Roman"/>
-          <w:b/>
-          <w:color w:val="003366"/>
-          <w:sz w:val="28"/>
+          <w:sz w:val="24"/>
         </w:rPr>
         <w:t>1. Общие сведения о предприятии</w:t>
       </w:r>
     </w:p>
     <w:p>
       <w:pPr>
-        <w:pStyle w:val="MdListItem"/>
-        <w:spacing w:line="276" w:lineRule="auto" w:after="120"/>
         <w:jc w:val="both"/>
       </w:pPr>
       <w:r>
         <w:rPr>
           <w:rFonts w:ascii="Times New Roman" w:hAnsi="Times New Roman" w:eastAsia="Times New Roman"/>
-          <w:b w:val="0"/>
           <w:sz w:val="24"/>
         </w:rPr>
         <w:t>Наименование: ТРЦ «Кок-Жайык» (Проект «Каркыра-Транзит»).</w:t>
@@ -1171,14 +893,11 @@
     </w:p>
     <w:p>
       <w:pPr>
-        <w:pStyle w:val="MdListItem"/>
-        <w:spacing w:line="276" w:lineRule="auto" w:after="120"/>
         <w:jc w:val="both"/>
       </w:pPr>
       <w:r>
         <w:rPr>
           <w:rFonts w:ascii="Times New Roman" w:hAnsi="Times New Roman" w:eastAsia="Times New Roman"/>
-          <w:b w:val="0"/>
           <w:sz w:val="24"/>
         </w:rPr>
         <w:t>Вид деятельности: Оказание туристических услуг, придорожный сервис (кафе, магазин), краткосрочное проживание.</w:t>
@@ -1186,29 +905,23 @@
     </w:p>
     <w:p>
       <w:pPr>
-        <w:pStyle w:val="MdListItem"/>
-        <w:spacing w:line="276" w:lineRule="auto" w:after="120"/>
         <w:jc w:val="both"/>
       </w:pPr>
       <w:r>
         <w:rPr>
           <w:rFonts w:ascii="Times New Roman" w:hAnsi="Times New Roman" w:eastAsia="Times New Roman"/>
-          <w:b w:val="0"/>
           <w:sz w:val="24"/>
         </w:rPr>
-        <w:t xml:space="preserve">Проектная мощность: </w:t>
+        <w:t>Проектная мощность:</w:t>
       </w:r>
     </w:p>
     <w:p>
       <w:pPr>
-        <w:pStyle w:val="MdListItem"/>
-        <w:spacing w:line="276" w:lineRule="auto" w:after="120"/>
         <w:jc w:val="both"/>
       </w:pPr>
       <w:r>
         <w:rPr>
           <w:rFonts w:ascii="Times New Roman" w:hAnsi="Times New Roman" w:eastAsia="Times New Roman"/>
-          <w:b w:val="0"/>
           <w:sz w:val="24"/>
         </w:rPr>
         <w:t>Размещение: до 30 человек одновременно (дома A-frame + юрты).</w:t>
@@ -1216,14 +929,11 @@
     </w:p>
     <w:p>
       <w:pPr>
-        <w:pStyle w:val="MdListItem"/>
-        <w:spacing w:line="276" w:lineRule="auto" w:after="120"/>
         <w:jc w:val="both"/>
       </w:pPr>
       <w:r>
         <w:rPr>
           <w:rFonts w:ascii="Times New Roman" w:hAnsi="Times New Roman" w:eastAsia="Times New Roman"/>
-          <w:b w:val="0"/>
           <w:sz w:val="24"/>
         </w:rPr>
         <w:t>Общепит: 20-30 посадочных мест.</w:t>
@@ -1231,14 +941,11 @@
     </w:p>
     <w:p>
       <w:pPr>
-        <w:pStyle w:val="MdListItem"/>
-        <w:spacing w:line="276" w:lineRule="auto" w:after="120"/>
         <w:jc w:val="both"/>
       </w:pPr>
       <w:r>
         <w:rPr>
           <w:rFonts w:ascii="Times New Roman" w:hAnsi="Times New Roman" w:eastAsia="Times New Roman"/>
-          <w:b w:val="0"/>
           <w:sz w:val="24"/>
         </w:rPr>
         <w:t>Общая площадь участка: [Указать согласно акту на землю] га.</w:t>
@@ -1246,68 +953,47 @@
     </w:p>
     <w:p>
       <w:pPr>
-        <w:pStyle w:val="MdSpace"/>
-        <w:spacing w:line="276" w:lineRule="auto" w:after="120"/>
         <w:jc w:val="both"/>
-      </w:pPr>
-    </w:p>
-    <w:p>
-      <w:pPr>
-        <w:pStyle w:val="Heading3"/>
-        <w:spacing w:before="240" w:after="120"/>
-        <w:jc w:val="left"/>
       </w:pPr>
       <w:r>
         <w:rPr>
           <w:rFonts w:ascii="Times New Roman" w:hAnsi="Times New Roman" w:eastAsia="Times New Roman"/>
-          <w:b/>
-          <w:color w:val="003366"/>
-          <w:sz w:val="28"/>
+          <w:sz w:val="24"/>
         </w:rPr>
         <w:t>2. Эколого-экономические показатели</w:t>
       </w:r>
     </w:p>
     <w:p>
       <w:pPr>
-        <w:pStyle w:val="Heading3"/>
-        <w:spacing w:before="240" w:after="120"/>
-        <w:jc w:val="left"/>
+        <w:jc w:val="both"/>
       </w:pPr>
       <w:r>
         <w:rPr>
           <w:rFonts w:ascii="Times New Roman" w:hAnsi="Times New Roman" w:eastAsia="Times New Roman"/>
-          <w:b/>
-          <w:color w:val="003366"/>
-          <w:sz w:val="28"/>
+          <w:sz w:val="24"/>
         </w:rPr>
         <w:t>3. Охрана атмосферного воздуха</w:t>
       </w:r>
     </w:p>
     <w:p>
       <w:pPr>
-        <w:pStyle w:val="MdListItem"/>
-        <w:spacing w:line="276" w:lineRule="auto" w:after="120"/>
         <w:jc w:val="both"/>
       </w:pPr>
       <w:r>
         <w:rPr>
           <w:rFonts w:ascii="Times New Roman" w:hAnsi="Times New Roman" w:eastAsia="Times New Roman"/>
-          <w:b w:val="0"/>
           <w:sz w:val="24"/>
         </w:rPr>
-        <w:t xml:space="preserve">Источники выбросов: </w:t>
+        <w:t>Источники выбросов:</w:t>
       </w:r>
     </w:p>
     <w:p>
       <w:pPr>
-        <w:pStyle w:val="MdListItem"/>
-        <w:spacing w:line="276" w:lineRule="auto" w:after="120"/>
         <w:jc w:val="both"/>
       </w:pPr>
       <w:r>
         <w:rPr>
           <w:rFonts w:ascii="Times New Roman" w:hAnsi="Times New Roman" w:eastAsia="Times New Roman"/>
-          <w:b w:val="0"/>
           <w:sz w:val="24"/>
         </w:rPr>
         <w:t>Автотранспорт посетителей (передвижной источник).</w:t>
@@ -1315,14 +1001,11 @@
     </w:p>
     <w:p>
       <w:pPr>
-        <w:pStyle w:val="MdListItem"/>
-        <w:spacing w:line="276" w:lineRule="auto" w:after="120"/>
         <w:jc w:val="both"/>
       </w:pPr>
       <w:r>
         <w:rPr>
           <w:rFonts w:ascii="Times New Roman" w:hAnsi="Times New Roman" w:eastAsia="Times New Roman"/>
-          <w:b w:val="0"/>
           <w:sz w:val="24"/>
         </w:rPr>
         <w:t>Кухонное оборудование кафе (вытяжные системы с фильтрами).</w:t>
@@ -1330,14 +1013,11 @@
     </w:p>
     <w:p>
       <w:pPr>
-        <w:pStyle w:val="MdListItem"/>
-        <w:spacing w:line="276" w:lineRule="auto" w:after="120"/>
         <w:jc w:val="both"/>
       </w:pPr>
       <w:r>
         <w:rPr>
           <w:rFonts w:ascii="Times New Roman" w:hAnsi="Times New Roman" w:eastAsia="Times New Roman"/>
-          <w:b w:val="0"/>
           <w:sz w:val="24"/>
         </w:rPr>
         <w:t>Резервный дизель-генератор (кратковременная работа).</w:t>
@@ -1345,14 +1025,11 @@
     </w:p>
     <w:p>
       <w:pPr>
-        <w:pStyle w:val="MdListItem"/>
-        <w:spacing w:line="276" w:lineRule="auto" w:after="120"/>
         <w:jc w:val="both"/>
       </w:pPr>
       <w:r>
         <w:rPr>
           <w:rFonts w:ascii="Times New Roman" w:hAnsi="Times New Roman" w:eastAsia="Times New Roman"/>
-          <w:b w:val="0"/>
           <w:sz w:val="24"/>
         </w:rPr>
         <w:t>Меры защиты: Использование электроплит в кафе, регулярное обслуживание вентиляционных систем, запрет на сжигание мусора на территории.</w:t>
@@ -1360,37 +1037,23 @@
     </w:p>
     <w:p>
       <w:pPr>
-        <w:pStyle w:val="MdSpace"/>
-        <w:spacing w:line="276" w:lineRule="auto" w:after="120"/>
         <w:jc w:val="both"/>
-      </w:pPr>
-    </w:p>
-    <w:p>
-      <w:pPr>
-        <w:pStyle w:val="Heading3"/>
-        <w:spacing w:before="240" w:after="120"/>
-        <w:jc w:val="left"/>
       </w:pPr>
       <w:r>
         <w:rPr>
           <w:rFonts w:ascii="Times New Roman" w:hAnsi="Times New Roman" w:eastAsia="Times New Roman"/>
-          <w:b/>
-          <w:color w:val="003366"/>
-          <w:sz w:val="28"/>
+          <w:sz w:val="24"/>
         </w:rPr>
         <w:t>4. Водопотребление и водоотведение</w:t>
       </w:r>
     </w:p>
     <w:p>
       <w:pPr>
-        <w:pStyle w:val="MdListItem"/>
-        <w:spacing w:line="276" w:lineRule="auto" w:after="120"/>
         <w:jc w:val="both"/>
       </w:pPr>
       <w:r>
         <w:rPr>
           <w:rFonts w:ascii="Times New Roman" w:hAnsi="Times New Roman" w:eastAsia="Times New Roman"/>
-          <w:b w:val="0"/>
           <w:sz w:val="24"/>
         </w:rPr>
         <w:t>Источник водоснабжения: [Скважина / Каптированный родник].</w:t>
@@ -1398,14 +1061,11 @@
     </w:p>
     <w:p>
       <w:pPr>
-        <w:pStyle w:val="MdListItem"/>
-        <w:spacing w:line="276" w:lineRule="auto" w:after="120"/>
         <w:jc w:val="both"/>
       </w:pPr>
       <w:r>
         <w:rPr>
           <w:rFonts w:ascii="Times New Roman" w:hAnsi="Times New Roman" w:eastAsia="Times New Roman"/>
-          <w:b w:val="0"/>
           <w:sz w:val="24"/>
         </w:rPr>
         <w:t>Система очистки стоков: Трехкамерное локальное очистное сооружение (ЛОС) объемом 24 м³.</w:t>
@@ -1413,14 +1073,11 @@
     </w:p>
     <w:p>
       <w:pPr>
-        <w:pStyle w:val="MdListItem"/>
-        <w:spacing w:line="276" w:lineRule="auto" w:after="120"/>
         <w:jc w:val="both"/>
       </w:pPr>
       <w:r>
         <w:rPr>
           <w:rFonts w:ascii="Times New Roman" w:hAnsi="Times New Roman" w:eastAsia="Times New Roman"/>
-          <w:b w:val="0"/>
           <w:sz w:val="24"/>
         </w:rPr>
         <w:t>Метод очистки: Механическое отстаивание + анаэробная биологическая очистка.</w:t>
@@ -1428,14 +1085,11 @@
     </w:p>
     <w:p>
       <w:pPr>
-        <w:pStyle w:val="MdListItem"/>
-        <w:spacing w:line="276" w:lineRule="auto" w:after="120"/>
         <w:jc w:val="both"/>
       </w:pPr>
       <w:r>
         <w:rPr>
           <w:rFonts w:ascii="Times New Roman" w:hAnsi="Times New Roman" w:eastAsia="Times New Roman"/>
-          <w:b w:val="0"/>
           <w:sz w:val="24"/>
         </w:rPr>
         <w:t>Использование очищенной воды: Оборотное водоснабжение для полива зеленых насаждений (Камера №3 ЛОС).</w:t>
@@ -1443,53 +1097,35 @@
     </w:p>
     <w:p>
       <w:pPr>
-        <w:pStyle w:val="MdSpace"/>
-        <w:spacing w:line="276" w:lineRule="auto" w:after="120"/>
         <w:jc w:val="both"/>
-      </w:pPr>
-    </w:p>
-    <w:p>
-      <w:pPr>
-        <w:pStyle w:val="Heading3"/>
-        <w:spacing w:before="240" w:after="120"/>
-        <w:jc w:val="left"/>
       </w:pPr>
       <w:r>
         <w:rPr>
           <w:rFonts w:ascii="Times New Roman" w:hAnsi="Times New Roman" w:eastAsia="Times New Roman"/>
-          <w:b/>
-          <w:color w:val="003366"/>
-          <w:sz w:val="28"/>
+          <w:sz w:val="24"/>
         </w:rPr>
         <w:t>5. Управление отходами</w:t>
       </w:r>
     </w:p>
     <w:p>
       <w:pPr>
-        <w:pStyle w:val="Heading3"/>
-        <w:spacing w:before="240" w:after="120"/>
-        <w:jc w:val="left"/>
+        <w:jc w:val="both"/>
       </w:pPr>
       <w:r>
         <w:rPr>
           <w:rFonts w:ascii="Times New Roman" w:hAnsi="Times New Roman" w:eastAsia="Times New Roman"/>
-          <w:b/>
-          <w:color w:val="003366"/>
-          <w:sz w:val="28"/>
+          <w:sz w:val="24"/>
         </w:rPr>
         <w:t>6. Охрана земельных ресурсов и растительности</w:t>
       </w:r>
     </w:p>
     <w:p>
       <w:pPr>
-        <w:pStyle w:val="MdListItem"/>
-        <w:spacing w:line="276" w:lineRule="auto" w:after="120"/>
         <w:jc w:val="both"/>
       </w:pPr>
       <w:r>
         <w:rPr>
           <w:rFonts w:ascii="Times New Roman" w:hAnsi="Times New Roman" w:eastAsia="Times New Roman"/>
-          <w:b w:val="0"/>
           <w:sz w:val="24"/>
         </w:rPr>
         <w:t>Состояние почв: Горно-луговые.</w:t>
@@ -1497,14 +1133,11 @@
     </w:p>
     <w:p>
       <w:pPr>
-        <w:pStyle w:val="MdListItem"/>
-        <w:spacing w:line="276" w:lineRule="auto" w:after="120"/>
         <w:jc w:val="both"/>
       </w:pPr>
       <w:r>
         <w:rPr>
           <w:rFonts w:ascii="Times New Roman" w:hAnsi="Times New Roman" w:eastAsia="Times New Roman"/>
-          <w:b w:val="0"/>
           <w:sz w:val="24"/>
         </w:rPr>
         <w:t>Меры сохранения: Запрет на движение транспорта вне дорог, использование экологичных моющих средств, рекультивация нарушенных земель после строительства.</w:t>
@@ -1512,37 +1145,23 @@
     </w:p>
     <w:p>
       <w:pPr>
-        <w:pStyle w:val="MdSpace"/>
-        <w:spacing w:line="276" w:lineRule="auto" w:after="120"/>
         <w:jc w:val="both"/>
-      </w:pPr>
-    </w:p>
-    <w:p>
-      <w:pPr>
-        <w:pStyle w:val="Heading3"/>
-        <w:spacing w:before="240" w:after="120"/>
-        <w:jc w:val="left"/>
       </w:pPr>
       <w:r>
         <w:rPr>
           <w:rFonts w:ascii="Times New Roman" w:hAnsi="Times New Roman" w:eastAsia="Times New Roman"/>
-          <w:b/>
-          <w:color w:val="003366"/>
-          <w:sz w:val="28"/>
+          <w:sz w:val="24"/>
         </w:rPr>
         <w:t>7. План природоохранных мероприятий (ежегодный)</w:t>
       </w:r>
     </w:p>
     <w:p>
       <w:pPr>
-        <w:pStyle w:val="MdListItem"/>
-        <w:spacing w:line="276" w:lineRule="auto" w:after="120"/>
         <w:jc w:val="both"/>
       </w:pPr>
       <w:r>
         <w:rPr>
           <w:rFonts w:ascii="Times New Roman" w:hAnsi="Times New Roman" w:eastAsia="Times New Roman"/>
-          <w:b w:val="0"/>
           <w:sz w:val="24"/>
         </w:rPr>
         <w:t>Проверка герметичности ЛОС и эффективности очистки — 2 раза в год.</w:t>
@@ -1550,14 +1169,11 @@
     </w:p>
     <w:p>
       <w:pPr>
-        <w:pStyle w:val="MdListItem"/>
-        <w:spacing w:line="276" w:lineRule="auto" w:after="120"/>
         <w:jc w:val="both"/>
       </w:pPr>
       <w:r>
         <w:rPr>
           <w:rFonts w:ascii="Times New Roman" w:hAnsi="Times New Roman" w:eastAsia="Times New Roman"/>
-          <w:b w:val="0"/>
           <w:sz w:val="24"/>
         </w:rPr>
         <w:t>Вывоз ТБО согласно договору с муниципальной службой — еженедельно (в сезон).</w:t>
@@ -1565,14 +1181,11 @@
     </w:p>
     <w:p>
       <w:pPr>
-        <w:pStyle w:val="MdListItem"/>
-        <w:spacing w:line="276" w:lineRule="auto" w:after="120"/>
         <w:jc w:val="both"/>
       </w:pPr>
       <w:r>
         <w:rPr>
           <w:rFonts w:ascii="Times New Roman" w:hAnsi="Times New Roman" w:eastAsia="Times New Roman"/>
-          <w:b w:val="0"/>
           <w:sz w:val="24"/>
         </w:rPr>
         <w:t>Озеленение территории саженцами местных пород — апрель-май.</w:t>
@@ -1580,14 +1193,11 @@
     </w:p>
     <w:p>
       <w:pPr>
-        <w:pStyle w:val="MdListItem"/>
-        <w:spacing w:line="276" w:lineRule="auto" w:after="120"/>
         <w:jc w:val="both"/>
       </w:pPr>
       <w:r>
         <w:rPr>
           <w:rFonts w:ascii="Times New Roman" w:hAnsi="Times New Roman" w:eastAsia="Times New Roman"/>
-          <w:b w:val="0"/>
           <w:sz w:val="24"/>
         </w:rPr>
         <w:t>Инструктаж персонала по экологической безопасности — ежеквартально.</w:t>
@@ -1595,28 +1205,11 @@
     </w:p>
     <w:p>
       <w:pPr>
-        <w:pStyle w:val="MdSpace"/>
-        <w:spacing w:line="276" w:lineRule="auto" w:after="120"/>
-        <w:jc w:val="both"/>
-      </w:pPr>
-    </w:p>
-    <w:p>
-      <w:pPr>
-        <w:pStyle w:val="MdHr"/>
-        <w:spacing w:line="276" w:lineRule="auto" w:after="120"/>
-        <w:jc w:val="both"/>
-      </w:pPr>
-    </w:p>
-    <w:p>
-      <w:pPr>
-        <w:pStyle w:val="MdParagraph"/>
-        <w:spacing w:line="276" w:lineRule="auto" w:after="120"/>
         <w:jc w:val="both"/>
       </w:pPr>
       <w:r>
         <w:rPr>
           <w:rFonts w:ascii="Times New Roman" w:hAnsi="Times New Roman" w:eastAsia="Times New Roman"/>
-          <w:b w:val="0"/>
           <w:sz w:val="24"/>
         </w:rPr>
         <w:t>Разработчик: [ФИО / Название организации]</w:t>
@@ -1999,6 +1592,10 @@
     <w:name w:val="Normal"/>
     <w:qFormat/>
     <w:rsid w:val="00FC693F"/>
+    <w:rPr>
+      <w:rFonts w:ascii="Times New Roman" w:hAnsi="Times New Roman"/>
+      <w:sz w:val="24"/>
+    </w:rPr>
   </w:style>
   <w:style w:type="paragraph" w:styleId="Header">
     <w:name w:val="header"/>

</xml_diff>